<commit_message>
Week 6 assignment q14 to q27
</commit_message>
<xml_diff>
--- a/DAY 6/n/Assignment6/Assignment6.docx
+++ b/DAY 6/n/Assignment6/Assignment6.docx
@@ -1,6 +1,6 @@
 
 <file path=word/document.xml><?xml version="1.0" encoding="utf-8"?>
-<w:document xmlns:wpc="http://schemas.microsoft.com/office/word/2010/wordprocessingCanvas" xmlns:cx="http://schemas.microsoft.com/office/drawing/2014/chartex" xmlns:cx1="http://schemas.microsoft.com/office/drawing/2015/9/8/chartex" xmlns:cx2="http://schemas.microsoft.com/office/drawing/2015/10/21/chartex" xmlns:cx3="http://schemas.microsoft.com/office/drawing/2016/5/9/chartex" xmlns:cx4="http://schemas.microsoft.com/office/drawing/2016/5/10/chartex" xmlns:cx5="http://schemas.microsoft.com/office/drawing/2016/5/11/chartex" xmlns:cx6="http://schemas.microsoft.com/office/drawing/2016/5/12/chartex" xmlns:cx7="http://schemas.microsoft.com/office/drawing/2016/5/13/chartex" xmlns:cx8="http://schemas.microsoft.com/office/drawing/2016/5/14/chartex" xmlns:mc="http://schemas.openxmlformats.org/markup-compatibility/2006" xmlns:aink="http://schemas.microsoft.com/office/drawing/2016/ink" xmlns:am3d="http://schemas.microsoft.com/office/drawing/2017/model3d" xmlns:o="urn:schemas-microsoft-com:office:office" xmlns:oel="http://schemas.microsoft.com/office/2019/extlst" xmlns:r="http://schemas.openxmlformats.org/officeDocument/2006/relationships" xmlns:m="http://schemas.openxmlformats.org/officeDocument/2006/math" xmlns:v="urn:schemas-microsoft-com:vml" xmlns:wp14="http://schemas.microsoft.com/office/word/2010/wordprocessingDrawing" xmlns:wp="http://schemas.openxmlformats.org/drawingml/2006/wordprocessingDrawing" xmlns:w10="urn:schemas-microsoft-com:office:word" xmlns:w="http://schemas.openxmlformats.org/wordprocessingml/2006/main" xmlns:w14="http://schemas.microsoft.com/office/word/2010/wordml" xmlns:w15="http://schemas.microsoft.com/office/word/2012/wordml" xmlns:w16cei="http://schemas.microsoft.com/office/word/2026/wordml/cei" xmlns:w16cex="http://schemas.microsoft.com/office/word/2018/wordml/cex" xmlns:w16cid="http://schemas.microsoft.com/office/word/2016/wordml/cid" xmlns:w16="http://schemas.microsoft.com/office/word/2018/wordml" xmlns:w16du="http://schemas.microsoft.com/office/word/2023/wordml/word16du" xmlns:w16sdtdh="http://schemas.microsoft.com/office/word/2020/wordml/sdtdatahash" xmlns:w16sdtfl="http://schemas.microsoft.com/office/word/2024/wordml/sdtformatlock" xmlns:w16se="http://schemas.microsoft.com/office/word/2015/wordml/symex" xmlns:wpg="http://schemas.microsoft.com/office/word/2010/wordprocessingGroup" xmlns:wpi="http://schemas.microsoft.com/office/word/2010/wordprocessingInk" xmlns:wne="http://schemas.microsoft.com/office/word/2006/wordml" xmlns:wps="http://schemas.microsoft.com/office/word/2010/wordprocessingShape" mc:Ignorable="w14 w15 w16se w16cid w16 w16cex w16sdtdh w16sdtfl w16du wp14">
+<w:document xmlns:wpc="http://schemas.microsoft.com/office/word/2010/wordprocessingCanvas" xmlns:cx="http://schemas.microsoft.com/office/drawing/2014/chartex" xmlns:cx1="http://schemas.microsoft.com/office/drawing/2015/9/8/chartex" xmlns:cx2="http://schemas.microsoft.com/office/drawing/2015/10/21/chartex" xmlns:cx3="http://schemas.microsoft.com/office/drawing/2016/5/9/chartex" xmlns:cx4="http://schemas.microsoft.com/office/drawing/2016/5/10/chartex" xmlns:cx5="http://schemas.microsoft.com/office/drawing/2016/5/11/chartex" xmlns:cx6="http://schemas.microsoft.com/office/drawing/2016/5/12/chartex" xmlns:cx7="http://schemas.microsoft.com/office/drawing/2016/5/13/chartex" xmlns:cx8="http://schemas.microsoft.com/office/drawing/2016/5/14/chartex" xmlns:mc="http://schemas.openxmlformats.org/markup-compatibility/2006" xmlns:aink="http://schemas.microsoft.com/office/drawing/2016/ink" xmlns:am3d="http://schemas.microsoft.com/office/drawing/2017/model3d" xmlns:o="urn:schemas-microsoft-com:office:office" xmlns:oel="http://schemas.microsoft.com/office/2019/extlst" xmlns:r="http://schemas.openxmlformats.org/officeDocument/2006/relationships" xmlns:m="http://schemas.openxmlformats.org/officeDocument/2006/math" xmlns:v="urn:schemas-microsoft-com:vml" xmlns:wp14="http://schemas.microsoft.com/office/word/2010/wordprocessingDrawing" xmlns:wp="http://schemas.openxmlformats.org/drawingml/2006/wordprocessingDrawing" xmlns:w10="urn:schemas-microsoft-com:office:word" xmlns:w="http://schemas.openxmlformats.org/wordprocessingml/2006/main" xmlns:w14="http://schemas.microsoft.com/office/word/2010/wordml" xmlns:w15="http://schemas.microsoft.com/office/word/2012/wordml" xmlns:w16cex="http://schemas.microsoft.com/office/word/2018/wordml/cex" xmlns:w16cid="http://schemas.microsoft.com/office/word/2016/wordml/cid" xmlns:w16="http://schemas.microsoft.com/office/word/2018/wordml" xmlns:w16du="http://schemas.microsoft.com/office/word/2023/wordml/word16du" xmlns:w16sdtdh="http://schemas.microsoft.com/office/word/2020/wordml/sdtdatahash" xmlns:w16sdtfl="http://schemas.microsoft.com/office/word/2024/wordml/sdtformatlock" xmlns:w16se="http://schemas.microsoft.com/office/word/2015/wordml/symex" xmlns:wpg="http://schemas.microsoft.com/office/word/2010/wordprocessingGroup" xmlns:wpi="http://schemas.microsoft.com/office/word/2010/wordprocessingInk" xmlns:wne="http://schemas.microsoft.com/office/word/2006/wordml" xmlns:wps="http://schemas.microsoft.com/office/word/2010/wordprocessingShape" mc:Ignorable="w14 w15 w16se w16cid w16 w16cex w16sdtdh w16sdtfl w16du wp14">
   <w:body>
     <w:p>
       <w:r>
@@ -217,6 +217,9 @@
     </w:p>
     <w:p>
       <w:r>
+        <w:rPr>
+          <w:noProof/>
+        </w:rPr>
         <w:drawing>
           <wp:inline distT="0" distB="0" distL="0" distR="0" wp14:anchorId="6154E58E" wp14:editId="10F768AF">
             <wp:extent cx="4305901" cy="2781688"/>
@@ -262,6 +265,9 @@
     </w:p>
     <w:p>
       <w:r>
+        <w:rPr>
+          <w:noProof/>
+        </w:rPr>
         <w:drawing>
           <wp:inline distT="0" distB="0" distL="0" distR="0" wp14:anchorId="6DAE69EF" wp14:editId="18326C06">
             <wp:extent cx="5943600" cy="3160395"/>
@@ -310,6 +316,9 @@
     </w:p>
     <w:p>
       <w:r>
+        <w:rPr>
+          <w:noProof/>
+        </w:rPr>
         <w:drawing>
           <wp:inline distT="0" distB="0" distL="0" distR="0" wp14:anchorId="51B98227" wp14:editId="54C2E7CF">
             <wp:extent cx="4658375" cy="2762636"/>
@@ -354,6 +363,9 @@
     </w:p>
     <w:p>
       <w:r>
+        <w:rPr>
+          <w:noProof/>
+        </w:rPr>
         <w:drawing>
           <wp:inline distT="0" distB="0" distL="0" distR="0" wp14:anchorId="75E038D8" wp14:editId="35F19F98">
             <wp:extent cx="3610479" cy="2152950"/>
@@ -407,6 +419,9 @@
     </w:p>
     <w:p>
       <w:r>
+        <w:rPr>
+          <w:noProof/>
+        </w:rPr>
         <w:drawing>
           <wp:inline distT="0" distB="0" distL="0" distR="0" wp14:anchorId="600D2A57" wp14:editId="741E23A5">
             <wp:extent cx="5239481" cy="3543795"/>
@@ -451,6 +466,9 @@
     </w:p>
     <w:p>
       <w:r>
+        <w:rPr>
+          <w:noProof/>
+        </w:rPr>
         <w:drawing>
           <wp:inline distT="0" distB="0" distL="0" distR="0" wp14:anchorId="774AE81E" wp14:editId="0FB7CF0C">
             <wp:extent cx="3791479" cy="1905266"/>
@@ -502,6 +520,9 @@
     </w:p>
     <w:p>
       <w:r>
+        <w:rPr>
+          <w:noProof/>
+        </w:rPr>
         <w:drawing>
           <wp:inline distT="0" distB="0" distL="0" distR="0" wp14:anchorId="392FFFEA" wp14:editId="0179810A">
             <wp:extent cx="5382376" cy="4115374"/>
@@ -546,6 +567,9 @@
     </w:p>
     <w:p>
       <w:r>
+        <w:rPr>
+          <w:noProof/>
+        </w:rPr>
         <w:drawing>
           <wp:inline distT="0" distB="0" distL="0" distR="0" wp14:anchorId="0748E44A" wp14:editId="126A8FAD">
             <wp:extent cx="3801005" cy="2419688"/>
@@ -587,6 +611,9 @@
     <w:p/>
     <w:p>
       <w:r>
+        <w:rPr>
+          <w:noProof/>
+        </w:rPr>
         <w:lastRenderedPageBreak/>
         <w:drawing>
           <wp:anchor distT="0" distB="0" distL="114300" distR="114300" simplePos="0" relativeHeight="251658240" behindDoc="0" locked="0" layoutInCell="1" allowOverlap="1" wp14:anchorId="0CDFEDB5" wp14:editId="0D2A44C5">
@@ -645,6 +672,9 @@
         </w:drawing>
       </w:r>
       <w:r>
+        <w:rPr>
+          <w:noProof/>
+        </w:rPr>
         <w:drawing>
           <wp:inline distT="0" distB="0" distL="0" distR="0" wp14:anchorId="659C9B2B" wp14:editId="724743A9">
             <wp:extent cx="2848330" cy="1858108"/>
@@ -685,6 +715,9 @@
     <w:p/>
     <w:p>
       <w:r>
+        <w:rPr>
+          <w:noProof/>
+        </w:rPr>
         <w:drawing>
           <wp:inline distT="0" distB="0" distL="0" distR="0" wp14:anchorId="332AF1DC" wp14:editId="45CE6980">
             <wp:extent cx="5943600" cy="545465"/>
@@ -739,42 +772,21 @@
         <w:t>I</w:t>
       </w:r>
       <w:r>
-        <w:t xml:space="preserve">n first program </w:t>
-      </w:r>
-      <w:proofErr w:type="gramStart"/>
-      <w:r>
-        <w:t>it</w:t>
-      </w:r>
-      <w:proofErr w:type="gramEnd"/>
-      <w:r>
-        <w:t xml:space="preserve"> program is running in </w:t>
+        <w:t xml:space="preserve">n first program it program is running in </w:t>
       </w:r>
       <w:proofErr w:type="spellStart"/>
-      <w:proofErr w:type="gramStart"/>
       <w:r>
         <w:t>printName</w:t>
       </w:r>
       <w:proofErr w:type="spellEnd"/>
       <w:r>
-        <w:t>(</w:t>
-      </w:r>
-      <w:proofErr w:type="gramEnd"/>
-      <w:r>
-        <w:t>)</w:t>
-      </w:r>
-      <w:r>
-        <w:t xml:space="preserve"> method, and it calls in </w:t>
-      </w:r>
-      <w:proofErr w:type="gramStart"/>
-      <w:r>
-        <w:t>main</w:t>
-      </w:r>
-      <w:r>
-        <w:t>(</w:t>
-      </w:r>
-      <w:proofErr w:type="gramEnd"/>
-      <w:r>
-        <w:t>)</w:t>
+        <w:t>()</w:t>
+      </w:r>
+      <w:r>
+        <w:t xml:space="preserve"> method, and it calls in main</w:t>
+      </w:r>
+      <w:r>
+        <w:t>()</w:t>
       </w:r>
       <w:r>
         <w:t xml:space="preserve">                                                                                          method.</w:t>
@@ -782,28 +794,15 @@
     </w:p>
     <w:p>
       <w:r>
-        <w:t xml:space="preserve">But in second program some part of program </w:t>
-      </w:r>
-      <w:proofErr w:type="gramStart"/>
-      <w:r>
-        <w:t>run</w:t>
-      </w:r>
-      <w:proofErr w:type="gramEnd"/>
-      <w:r>
-        <w:t xml:space="preserve"> in main method and another part runs in </w:t>
+        <w:t xml:space="preserve">But in second program some part of program run in main method and another part runs in </w:t>
       </w:r>
       <w:proofErr w:type="spellStart"/>
-      <w:proofErr w:type="gramStart"/>
       <w:r>
         <w:t>printName</w:t>
       </w:r>
       <w:proofErr w:type="spellEnd"/>
       <w:r>
-        <w:t>(</w:t>
-      </w:r>
-      <w:proofErr w:type="gramEnd"/>
-      <w:r>
-        <w:t>)</w:t>
+        <w:t>()</w:t>
       </w:r>
       <w:r>
         <w:t xml:space="preserve"> </w:t>
@@ -827,19 +826,14 @@
         <w:t xml:space="preserve"> parameters </w:t>
       </w:r>
       <w:r>
-        <w:t xml:space="preserve">and it also calls in </w:t>
-      </w:r>
-      <w:proofErr w:type="gramStart"/>
-      <w:r>
-        <w:t>main(</w:t>
-      </w:r>
-      <w:proofErr w:type="gramEnd"/>
-      <w:r>
-        <w:t>) method.</w:t>
-      </w:r>
-    </w:p>
-    <w:p>
-      <w:r>
+        <w:t>and it also calls in main() method.</w:t>
+      </w:r>
+    </w:p>
+    <w:p>
+      <w:r>
+        <w:rPr>
+          <w:noProof/>
+        </w:rPr>
         <w:drawing>
           <wp:inline distT="0" distB="0" distL="0" distR="0" wp14:anchorId="542953BB" wp14:editId="5764A9F7">
             <wp:extent cx="5943600" cy="601980"/>
@@ -915,29 +909,13 @@
         <w:t>program</w:t>
       </w:r>
       <w:r>
-        <w:t xml:space="preserve"> 2, we </w:t>
-      </w:r>
-      <w:proofErr w:type="gramStart"/>
-      <w:r>
-        <w:t>have to</w:t>
-      </w:r>
-      <w:proofErr w:type="gramEnd"/>
-      <w:r>
-        <w:t xml:space="preserve"> link methods by parameters</w:t>
-      </w:r>
-      <w:r>
-        <w:t xml:space="preserve"> and </w:t>
-      </w:r>
-      <w:proofErr w:type="gramStart"/>
-      <w:r>
-        <w:t xml:space="preserve">arguments </w:t>
-      </w:r>
-      <w:r>
-        <w:t xml:space="preserve"> ,Without</w:t>
-      </w:r>
-      <w:proofErr w:type="gramEnd"/>
-      <w:r>
-        <w:t xml:space="preserve"> </w:t>
+        <w:t xml:space="preserve"> 2, we have to link methods by parameters</w:t>
+      </w:r>
+      <w:r>
+        <w:t xml:space="preserve"> and arguments </w:t>
+      </w:r>
+      <w:r>
+        <w:t xml:space="preserve"> ,Without </w:t>
       </w:r>
       <w:r>
         <w:t>arguments in main method,</w:t>
@@ -946,27 +924,20 @@
         <w:t xml:space="preserve"> we </w:t>
       </w:r>
       <w:proofErr w:type="spellStart"/>
-      <w:proofErr w:type="gramStart"/>
       <w:r>
         <w:t>cant</w:t>
       </w:r>
       <w:proofErr w:type="spellEnd"/>
-      <w:proofErr w:type="gramEnd"/>
       <w:r>
         <w:t xml:space="preserve"> run </w:t>
       </w:r>
       <w:proofErr w:type="spellStart"/>
-      <w:proofErr w:type="gramStart"/>
       <w:r>
         <w:t>printName</w:t>
       </w:r>
       <w:proofErr w:type="spellEnd"/>
       <w:r>
-        <w:t>(</w:t>
-      </w:r>
-      <w:proofErr w:type="gramEnd"/>
-      <w:r>
-        <w:t>) method.</w:t>
+        <w:t>() method.</w:t>
       </w:r>
     </w:p>
     <w:p/>
@@ -982,6 +953,9 @@
     </w:p>
     <w:p>
       <w:r>
+        <w:rPr>
+          <w:noProof/>
+        </w:rPr>
         <w:drawing>
           <wp:inline distT="0" distB="0" distL="0" distR="0" wp14:anchorId="20973ACC" wp14:editId="64B777CD">
             <wp:extent cx="5363323" cy="4020111"/>
@@ -1026,6 +1000,9 @@
     </w:p>
     <w:p>
       <w:r>
+        <w:rPr>
+          <w:noProof/>
+        </w:rPr>
         <w:drawing>
           <wp:inline distT="0" distB="0" distL="0" distR="0" wp14:anchorId="189715CF" wp14:editId="0C9C759B">
             <wp:extent cx="2268415" cy="1371159"/>
@@ -1065,6 +1042,9 @@
     </w:p>
     <w:p>
       <w:r>
+        <w:rPr>
+          <w:noProof/>
+        </w:rPr>
         <w:drawing>
           <wp:inline distT="0" distB="0" distL="0" distR="0" wp14:anchorId="04124C3B" wp14:editId="2F5E47A4">
             <wp:extent cx="1940169" cy="1507564"/>
@@ -1111,6 +1091,9 @@
     </w:p>
     <w:p>
       <w:r>
+        <w:rPr>
+          <w:noProof/>
+        </w:rPr>
         <w:drawing>
           <wp:inline distT="0" distB="0" distL="0" distR="0" wp14:anchorId="2510C8A0" wp14:editId="0FED6869">
             <wp:extent cx="5220429" cy="2600688"/>
@@ -1156,6 +1139,9 @@
     </w:p>
     <w:p>
       <w:r>
+        <w:rPr>
+          <w:noProof/>
+        </w:rPr>
         <w:drawing>
           <wp:inline distT="0" distB="0" distL="0" distR="0" wp14:anchorId="539CA7F0" wp14:editId="3BE3853E">
             <wp:extent cx="3219899" cy="2476846"/>
@@ -1207,6 +1193,9 @@
     </w:p>
     <w:p>
       <w:r>
+        <w:rPr>
+          <w:noProof/>
+        </w:rPr>
         <w:drawing>
           <wp:inline distT="0" distB="0" distL="0" distR="0" wp14:anchorId="40B46E75" wp14:editId="5E51DD88">
             <wp:extent cx="5943600" cy="3476625"/>
@@ -1252,6 +1241,9 @@
     </w:p>
     <w:p>
       <w:r>
+        <w:rPr>
+          <w:noProof/>
+        </w:rPr>
         <w:drawing>
           <wp:inline distT="0" distB="0" distL="0" distR="0" wp14:anchorId="5E233417" wp14:editId="079251C4">
             <wp:extent cx="5106113" cy="2162477"/>
@@ -1299,6 +1291,1204 @@
         <w:t>Q11.</w:t>
       </w:r>
     </w:p>
+    <w:p>
+      <w:r>
+        <w:drawing>
+          <wp:inline distT="0" distB="0" distL="0" distR="0" wp14:anchorId="02DF78D0" wp14:editId="522A7DA2">
+            <wp:extent cx="5096586" cy="3791479"/>
+            <wp:effectExtent l="0" t="0" r="8890" b="0"/>
+            <wp:docPr id="1139454565" name="Picture 1"/>
+            <wp:cNvGraphicFramePr>
+              <a:graphicFrameLocks xmlns:a="http://schemas.openxmlformats.org/drawingml/2006/main" noChangeAspect="1"/>
+            </wp:cNvGraphicFramePr>
+            <a:graphic xmlns:a="http://schemas.openxmlformats.org/drawingml/2006/main">
+              <a:graphicData uri="http://schemas.openxmlformats.org/drawingml/2006/picture">
+                <pic:pic xmlns:pic="http://schemas.openxmlformats.org/drawingml/2006/picture">
+                  <pic:nvPicPr>
+                    <pic:cNvPr id="1139454565" name=""/>
+                    <pic:cNvPicPr/>
+                  </pic:nvPicPr>
+                  <pic:blipFill>
+                    <a:blip r:embed="rId29"/>
+                    <a:stretch>
+                      <a:fillRect/>
+                    </a:stretch>
+                  </pic:blipFill>
+                  <pic:spPr>
+                    <a:xfrm>
+                      <a:off x="0" y="0"/>
+                      <a:ext cx="5096586" cy="3791479"/>
+                    </a:xfrm>
+                    <a:prstGeom prst="rect">
+                      <a:avLst/>
+                    </a:prstGeom>
+                  </pic:spPr>
+                </pic:pic>
+              </a:graphicData>
+            </a:graphic>
+          </wp:inline>
+        </w:drawing>
+      </w:r>
+    </w:p>
+    <w:p>
+      <w:r>
+        <w:t>Output.</w:t>
+      </w:r>
+    </w:p>
+    <w:p>
+      <w:r>
+        <w:drawing>
+          <wp:inline distT="0" distB="0" distL="0" distR="0" wp14:anchorId="0EB87247" wp14:editId="5504BA26">
+            <wp:extent cx="4115374" cy="2638793"/>
+            <wp:effectExtent l="0" t="0" r="0" b="9525"/>
+            <wp:docPr id="376018394" name="Picture 1"/>
+            <wp:cNvGraphicFramePr>
+              <a:graphicFrameLocks xmlns:a="http://schemas.openxmlformats.org/drawingml/2006/main" noChangeAspect="1"/>
+            </wp:cNvGraphicFramePr>
+            <a:graphic xmlns:a="http://schemas.openxmlformats.org/drawingml/2006/main">
+              <a:graphicData uri="http://schemas.openxmlformats.org/drawingml/2006/picture">
+                <pic:pic xmlns:pic="http://schemas.openxmlformats.org/drawingml/2006/picture">
+                  <pic:nvPicPr>
+                    <pic:cNvPr id="376018394" name=""/>
+                    <pic:cNvPicPr/>
+                  </pic:nvPicPr>
+                  <pic:blipFill>
+                    <a:blip r:embed="rId30"/>
+                    <a:stretch>
+                      <a:fillRect/>
+                    </a:stretch>
+                  </pic:blipFill>
+                  <pic:spPr>
+                    <a:xfrm>
+                      <a:off x="0" y="0"/>
+                      <a:ext cx="4115374" cy="2638793"/>
+                    </a:xfrm>
+                    <a:prstGeom prst="rect">
+                      <a:avLst/>
+                    </a:prstGeom>
+                  </pic:spPr>
+                </pic:pic>
+              </a:graphicData>
+            </a:graphic>
+          </wp:inline>
+        </w:drawing>
+      </w:r>
+    </w:p>
+    <w:p/>
+    <w:p/>
+    <w:p/>
+    <w:p>
+      <w:r>
+        <w:lastRenderedPageBreak/>
+        <w:t>Q12.</w:t>
+      </w:r>
+    </w:p>
+    <w:p>
+      <w:r>
+        <w:drawing>
+          <wp:inline distT="0" distB="0" distL="0" distR="0" wp14:anchorId="0CCAAAB8" wp14:editId="56041821">
+            <wp:extent cx="5410955" cy="3715268"/>
+            <wp:effectExtent l="0" t="0" r="0" b="0"/>
+            <wp:docPr id="784605314" name="Picture 1"/>
+            <wp:cNvGraphicFramePr>
+              <a:graphicFrameLocks xmlns:a="http://schemas.openxmlformats.org/drawingml/2006/main" noChangeAspect="1"/>
+            </wp:cNvGraphicFramePr>
+            <a:graphic xmlns:a="http://schemas.openxmlformats.org/drawingml/2006/main">
+              <a:graphicData uri="http://schemas.openxmlformats.org/drawingml/2006/picture">
+                <pic:pic xmlns:pic="http://schemas.openxmlformats.org/drawingml/2006/picture">
+                  <pic:nvPicPr>
+                    <pic:cNvPr id="784605314" name=""/>
+                    <pic:cNvPicPr/>
+                  </pic:nvPicPr>
+                  <pic:blipFill>
+                    <a:blip r:embed="rId31"/>
+                    <a:stretch>
+                      <a:fillRect/>
+                    </a:stretch>
+                  </pic:blipFill>
+                  <pic:spPr>
+                    <a:xfrm>
+                      <a:off x="0" y="0"/>
+                      <a:ext cx="5410955" cy="3715268"/>
+                    </a:xfrm>
+                    <a:prstGeom prst="rect">
+                      <a:avLst/>
+                    </a:prstGeom>
+                  </pic:spPr>
+                </pic:pic>
+              </a:graphicData>
+            </a:graphic>
+          </wp:inline>
+        </w:drawing>
+      </w:r>
+    </w:p>
+    <w:p>
+      <w:r>
+        <w:t>Output.</w:t>
+      </w:r>
+    </w:p>
+    <w:p>
+      <w:r>
+        <w:drawing>
+          <wp:inline distT="0" distB="0" distL="0" distR="0" wp14:anchorId="146481A6" wp14:editId="6ECE8C80">
+            <wp:extent cx="3858163" cy="2896004"/>
+            <wp:effectExtent l="0" t="0" r="9525" b="0"/>
+            <wp:docPr id="1258528887" name="Picture 1"/>
+            <wp:cNvGraphicFramePr>
+              <a:graphicFrameLocks xmlns:a="http://schemas.openxmlformats.org/drawingml/2006/main" noChangeAspect="1"/>
+            </wp:cNvGraphicFramePr>
+            <a:graphic xmlns:a="http://schemas.openxmlformats.org/drawingml/2006/main">
+              <a:graphicData uri="http://schemas.openxmlformats.org/drawingml/2006/picture">
+                <pic:pic xmlns:pic="http://schemas.openxmlformats.org/drawingml/2006/picture">
+                  <pic:nvPicPr>
+                    <pic:cNvPr id="1258528887" name=""/>
+                    <pic:cNvPicPr/>
+                  </pic:nvPicPr>
+                  <pic:blipFill>
+                    <a:blip r:embed="rId32"/>
+                    <a:stretch>
+                      <a:fillRect/>
+                    </a:stretch>
+                  </pic:blipFill>
+                  <pic:spPr>
+                    <a:xfrm>
+                      <a:off x="0" y="0"/>
+                      <a:ext cx="3858163" cy="2896004"/>
+                    </a:xfrm>
+                    <a:prstGeom prst="rect">
+                      <a:avLst/>
+                    </a:prstGeom>
+                  </pic:spPr>
+                </pic:pic>
+              </a:graphicData>
+            </a:graphic>
+          </wp:inline>
+        </w:drawing>
+      </w:r>
+    </w:p>
+    <w:p/>
+    <w:p/>
+    <w:p>
+      <w:r>
+        <w:lastRenderedPageBreak/>
+        <w:t>Q14.</w:t>
+      </w:r>
+    </w:p>
+    <w:p>
+      <w:r>
+        <w:drawing>
+          <wp:inline distT="0" distB="0" distL="0" distR="0" wp14:anchorId="7DD3115F" wp14:editId="45EBC7A1">
+            <wp:extent cx="5943600" cy="6158865"/>
+            <wp:effectExtent l="0" t="0" r="0" b="0"/>
+            <wp:docPr id="1704990410" name="Picture 1"/>
+            <wp:cNvGraphicFramePr>
+              <a:graphicFrameLocks xmlns:a="http://schemas.openxmlformats.org/drawingml/2006/main" noChangeAspect="1"/>
+            </wp:cNvGraphicFramePr>
+            <a:graphic xmlns:a="http://schemas.openxmlformats.org/drawingml/2006/main">
+              <a:graphicData uri="http://schemas.openxmlformats.org/drawingml/2006/picture">
+                <pic:pic xmlns:pic="http://schemas.openxmlformats.org/drawingml/2006/picture">
+                  <pic:nvPicPr>
+                    <pic:cNvPr id="1704990410" name=""/>
+                    <pic:cNvPicPr/>
+                  </pic:nvPicPr>
+                  <pic:blipFill>
+                    <a:blip r:embed="rId33"/>
+                    <a:stretch>
+                      <a:fillRect/>
+                    </a:stretch>
+                  </pic:blipFill>
+                  <pic:spPr>
+                    <a:xfrm>
+                      <a:off x="0" y="0"/>
+                      <a:ext cx="5943600" cy="6158865"/>
+                    </a:xfrm>
+                    <a:prstGeom prst="rect">
+                      <a:avLst/>
+                    </a:prstGeom>
+                  </pic:spPr>
+                </pic:pic>
+              </a:graphicData>
+            </a:graphic>
+          </wp:inline>
+        </w:drawing>
+      </w:r>
+    </w:p>
+    <w:p/>
+    <w:p/>
+    <w:p/>
+    <w:p/>
+    <w:p/>
+    <w:p>
+      <w:r>
+        <w:lastRenderedPageBreak/>
+        <w:t>Outputs.</w:t>
+      </w:r>
+    </w:p>
+    <w:p>
+      <w:r>
+        <w:drawing>
+          <wp:inline distT="0" distB="0" distL="0" distR="0" wp14:anchorId="17E53D1D" wp14:editId="17529715">
+            <wp:extent cx="2215662" cy="1377447"/>
+            <wp:effectExtent l="0" t="0" r="0" b="0"/>
+            <wp:docPr id="961874546" name="Picture 1"/>
+            <wp:cNvGraphicFramePr>
+              <a:graphicFrameLocks xmlns:a="http://schemas.openxmlformats.org/drawingml/2006/main" noChangeAspect="1"/>
+            </wp:cNvGraphicFramePr>
+            <a:graphic xmlns:a="http://schemas.openxmlformats.org/drawingml/2006/main">
+              <a:graphicData uri="http://schemas.openxmlformats.org/drawingml/2006/picture">
+                <pic:pic xmlns:pic="http://schemas.openxmlformats.org/drawingml/2006/picture">
+                  <pic:nvPicPr>
+                    <pic:cNvPr id="961874546" name=""/>
+                    <pic:cNvPicPr/>
+                  </pic:nvPicPr>
+                  <pic:blipFill>
+                    <a:blip r:embed="rId34"/>
+                    <a:stretch>
+                      <a:fillRect/>
+                    </a:stretch>
+                  </pic:blipFill>
+                  <pic:spPr>
+                    <a:xfrm>
+                      <a:off x="0" y="0"/>
+                      <a:ext cx="2227959" cy="1385092"/>
+                    </a:xfrm>
+                    <a:prstGeom prst="rect">
+                      <a:avLst/>
+                    </a:prstGeom>
+                  </pic:spPr>
+                </pic:pic>
+              </a:graphicData>
+            </a:graphic>
+          </wp:inline>
+        </w:drawing>
+      </w:r>
+    </w:p>
+    <w:p>
+      <w:r>
+        <w:drawing>
+          <wp:inline distT="0" distB="0" distL="0" distR="0" wp14:anchorId="3AF46F01" wp14:editId="47977F27">
+            <wp:extent cx="1893277" cy="1445217"/>
+            <wp:effectExtent l="0" t="0" r="0" b="3175"/>
+            <wp:docPr id="1268473778" name="Picture 1"/>
+            <wp:cNvGraphicFramePr>
+              <a:graphicFrameLocks xmlns:a="http://schemas.openxmlformats.org/drawingml/2006/main" noChangeAspect="1"/>
+            </wp:cNvGraphicFramePr>
+            <a:graphic xmlns:a="http://schemas.openxmlformats.org/drawingml/2006/main">
+              <a:graphicData uri="http://schemas.openxmlformats.org/drawingml/2006/picture">
+                <pic:pic xmlns:pic="http://schemas.openxmlformats.org/drawingml/2006/picture">
+                  <pic:nvPicPr>
+                    <pic:cNvPr id="1268473778" name=""/>
+                    <pic:cNvPicPr/>
+                  </pic:nvPicPr>
+                  <pic:blipFill>
+                    <a:blip r:embed="rId35"/>
+                    <a:stretch>
+                      <a:fillRect/>
+                    </a:stretch>
+                  </pic:blipFill>
+                  <pic:spPr>
+                    <a:xfrm>
+                      <a:off x="0" y="0"/>
+                      <a:ext cx="1900426" cy="1450674"/>
+                    </a:xfrm>
+                    <a:prstGeom prst="rect">
+                      <a:avLst/>
+                    </a:prstGeom>
+                  </pic:spPr>
+                </pic:pic>
+              </a:graphicData>
+            </a:graphic>
+          </wp:inline>
+        </w:drawing>
+      </w:r>
+    </w:p>
+    <w:p>
+      <w:r>
+        <w:drawing>
+          <wp:inline distT="0" distB="0" distL="0" distR="0" wp14:anchorId="04B07B40" wp14:editId="4EB66348">
+            <wp:extent cx="2614246" cy="1000920"/>
+            <wp:effectExtent l="0" t="0" r="0" b="8890"/>
+            <wp:docPr id="383818260" name="Picture 1"/>
+            <wp:cNvGraphicFramePr>
+              <a:graphicFrameLocks xmlns:a="http://schemas.openxmlformats.org/drawingml/2006/main" noChangeAspect="1"/>
+            </wp:cNvGraphicFramePr>
+            <a:graphic xmlns:a="http://schemas.openxmlformats.org/drawingml/2006/main">
+              <a:graphicData uri="http://schemas.openxmlformats.org/drawingml/2006/picture">
+                <pic:pic xmlns:pic="http://schemas.openxmlformats.org/drawingml/2006/picture">
+                  <pic:nvPicPr>
+                    <pic:cNvPr id="383818260" name=""/>
+                    <pic:cNvPicPr/>
+                  </pic:nvPicPr>
+                  <pic:blipFill>
+                    <a:blip r:embed="rId36"/>
+                    <a:stretch>
+                      <a:fillRect/>
+                    </a:stretch>
+                  </pic:blipFill>
+                  <pic:spPr>
+                    <a:xfrm>
+                      <a:off x="0" y="0"/>
+                      <a:ext cx="2628883" cy="1006524"/>
+                    </a:xfrm>
+                    <a:prstGeom prst="rect">
+                      <a:avLst/>
+                    </a:prstGeom>
+                  </pic:spPr>
+                </pic:pic>
+              </a:graphicData>
+            </a:graphic>
+          </wp:inline>
+        </w:drawing>
+      </w:r>
+    </w:p>
+    <w:p>
+      <w:r>
+        <w:drawing>
+          <wp:inline distT="0" distB="0" distL="0" distR="0" wp14:anchorId="513F6B85" wp14:editId="72DB8214">
+            <wp:extent cx="2526323" cy="1633006"/>
+            <wp:effectExtent l="0" t="0" r="7620" b="5715"/>
+            <wp:docPr id="1642031934" name="Picture 1"/>
+            <wp:cNvGraphicFramePr>
+              <a:graphicFrameLocks xmlns:a="http://schemas.openxmlformats.org/drawingml/2006/main" noChangeAspect="1"/>
+            </wp:cNvGraphicFramePr>
+            <a:graphic xmlns:a="http://schemas.openxmlformats.org/drawingml/2006/main">
+              <a:graphicData uri="http://schemas.openxmlformats.org/drawingml/2006/picture">
+                <pic:pic xmlns:pic="http://schemas.openxmlformats.org/drawingml/2006/picture">
+                  <pic:nvPicPr>
+                    <pic:cNvPr id="1642031934" name=""/>
+                    <pic:cNvPicPr/>
+                  </pic:nvPicPr>
+                  <pic:blipFill>
+                    <a:blip r:embed="rId37"/>
+                    <a:stretch>
+                      <a:fillRect/>
+                    </a:stretch>
+                  </pic:blipFill>
+                  <pic:spPr>
+                    <a:xfrm>
+                      <a:off x="0" y="0"/>
+                      <a:ext cx="2540626" cy="1642251"/>
+                    </a:xfrm>
+                    <a:prstGeom prst="rect">
+                      <a:avLst/>
+                    </a:prstGeom>
+                  </pic:spPr>
+                </pic:pic>
+              </a:graphicData>
+            </a:graphic>
+          </wp:inline>
+        </w:drawing>
+      </w:r>
+    </w:p>
+    <w:p>
+      <w:r>
+        <w:drawing>
+          <wp:inline distT="0" distB="0" distL="0" distR="0" wp14:anchorId="4FF14077" wp14:editId="4DF34FCF">
+            <wp:extent cx="2426677" cy="1667530"/>
+            <wp:effectExtent l="0" t="0" r="0" b="8890"/>
+            <wp:docPr id="1731687969" name="Picture 1"/>
+            <wp:cNvGraphicFramePr>
+              <a:graphicFrameLocks xmlns:a="http://schemas.openxmlformats.org/drawingml/2006/main" noChangeAspect="1"/>
+            </wp:cNvGraphicFramePr>
+            <a:graphic xmlns:a="http://schemas.openxmlformats.org/drawingml/2006/main">
+              <a:graphicData uri="http://schemas.openxmlformats.org/drawingml/2006/picture">
+                <pic:pic xmlns:pic="http://schemas.openxmlformats.org/drawingml/2006/picture">
+                  <pic:nvPicPr>
+                    <pic:cNvPr id="1731687969" name=""/>
+                    <pic:cNvPicPr/>
+                  </pic:nvPicPr>
+                  <pic:blipFill>
+                    <a:blip r:embed="rId38"/>
+                    <a:stretch>
+                      <a:fillRect/>
+                    </a:stretch>
+                  </pic:blipFill>
+                  <pic:spPr>
+                    <a:xfrm>
+                      <a:off x="0" y="0"/>
+                      <a:ext cx="2429902" cy="1669746"/>
+                    </a:xfrm>
+                    <a:prstGeom prst="rect">
+                      <a:avLst/>
+                    </a:prstGeom>
+                  </pic:spPr>
+                </pic:pic>
+              </a:graphicData>
+            </a:graphic>
+          </wp:inline>
+        </w:drawing>
+      </w:r>
+    </w:p>
+    <w:p>
+      <w:r>
+        <w:lastRenderedPageBreak/>
+        <w:t>Q15.</w:t>
+      </w:r>
+    </w:p>
+    <w:p>
+      <w:r>
+        <w:drawing>
+          <wp:inline distT="0" distB="0" distL="0" distR="0" wp14:anchorId="545F3F09" wp14:editId="65021642">
+            <wp:extent cx="4334480" cy="3248478"/>
+            <wp:effectExtent l="0" t="0" r="9525" b="9525"/>
+            <wp:docPr id="1326472575" name="Picture 1"/>
+            <wp:cNvGraphicFramePr>
+              <a:graphicFrameLocks xmlns:a="http://schemas.openxmlformats.org/drawingml/2006/main" noChangeAspect="1"/>
+            </wp:cNvGraphicFramePr>
+            <a:graphic xmlns:a="http://schemas.openxmlformats.org/drawingml/2006/main">
+              <a:graphicData uri="http://schemas.openxmlformats.org/drawingml/2006/picture">
+                <pic:pic xmlns:pic="http://schemas.openxmlformats.org/drawingml/2006/picture">
+                  <pic:nvPicPr>
+                    <pic:cNvPr id="1326472575" name=""/>
+                    <pic:cNvPicPr/>
+                  </pic:nvPicPr>
+                  <pic:blipFill>
+                    <a:blip r:embed="rId39"/>
+                    <a:stretch>
+                      <a:fillRect/>
+                    </a:stretch>
+                  </pic:blipFill>
+                  <pic:spPr>
+                    <a:xfrm>
+                      <a:off x="0" y="0"/>
+                      <a:ext cx="4334480" cy="3248478"/>
+                    </a:xfrm>
+                    <a:prstGeom prst="rect">
+                      <a:avLst/>
+                    </a:prstGeom>
+                  </pic:spPr>
+                </pic:pic>
+              </a:graphicData>
+            </a:graphic>
+          </wp:inline>
+        </w:drawing>
+      </w:r>
+    </w:p>
+    <w:p/>
+    <w:p/>
+    <w:p>
+      <w:r>
+        <w:t>Output.</w:t>
+      </w:r>
+    </w:p>
+    <w:p>
+      <w:r>
+        <w:drawing>
+          <wp:inline distT="0" distB="0" distL="0" distR="0" wp14:anchorId="46664CD5" wp14:editId="5D9E66B0">
+            <wp:extent cx="4001058" cy="2305372"/>
+            <wp:effectExtent l="0" t="0" r="0" b="0"/>
+            <wp:docPr id="1682483014" name="Picture 1"/>
+            <wp:cNvGraphicFramePr>
+              <a:graphicFrameLocks xmlns:a="http://schemas.openxmlformats.org/drawingml/2006/main" noChangeAspect="1"/>
+            </wp:cNvGraphicFramePr>
+            <a:graphic xmlns:a="http://schemas.openxmlformats.org/drawingml/2006/main">
+              <a:graphicData uri="http://schemas.openxmlformats.org/drawingml/2006/picture">
+                <pic:pic xmlns:pic="http://schemas.openxmlformats.org/drawingml/2006/picture">
+                  <pic:nvPicPr>
+                    <pic:cNvPr id="1682483014" name=""/>
+                    <pic:cNvPicPr/>
+                  </pic:nvPicPr>
+                  <pic:blipFill>
+                    <a:blip r:embed="rId40"/>
+                    <a:stretch>
+                      <a:fillRect/>
+                    </a:stretch>
+                  </pic:blipFill>
+                  <pic:spPr>
+                    <a:xfrm>
+                      <a:off x="0" y="0"/>
+                      <a:ext cx="4001058" cy="2305372"/>
+                    </a:xfrm>
+                    <a:prstGeom prst="rect">
+                      <a:avLst/>
+                    </a:prstGeom>
+                  </pic:spPr>
+                </pic:pic>
+              </a:graphicData>
+            </a:graphic>
+          </wp:inline>
+        </w:drawing>
+      </w:r>
+    </w:p>
+    <w:p/>
+    <w:p/>
+    <w:p/>
+    <w:p>
+      <w:r>
+        <w:lastRenderedPageBreak/>
+        <w:t>Q</w:t>
+      </w:r>
+      <w:r>
+        <w:t>16.</w:t>
+      </w:r>
+    </w:p>
+    <w:p>
+      <w:r>
+        <w:drawing>
+          <wp:inline distT="0" distB="0" distL="0" distR="0" wp14:anchorId="33894EA2" wp14:editId="2018D630">
+            <wp:extent cx="4999892" cy="4132924"/>
+            <wp:effectExtent l="0" t="0" r="0" b="1270"/>
+            <wp:docPr id="205633489" name="Picture 1"/>
+            <wp:cNvGraphicFramePr>
+              <a:graphicFrameLocks xmlns:a="http://schemas.openxmlformats.org/drawingml/2006/main" noChangeAspect="1"/>
+            </wp:cNvGraphicFramePr>
+            <a:graphic xmlns:a="http://schemas.openxmlformats.org/drawingml/2006/main">
+              <a:graphicData uri="http://schemas.openxmlformats.org/drawingml/2006/picture">
+                <pic:pic xmlns:pic="http://schemas.openxmlformats.org/drawingml/2006/picture">
+                  <pic:nvPicPr>
+                    <pic:cNvPr id="205633489" name=""/>
+                    <pic:cNvPicPr/>
+                  </pic:nvPicPr>
+                  <pic:blipFill>
+                    <a:blip r:embed="rId41"/>
+                    <a:stretch>
+                      <a:fillRect/>
+                    </a:stretch>
+                  </pic:blipFill>
+                  <pic:spPr>
+                    <a:xfrm>
+                      <a:off x="0" y="0"/>
+                      <a:ext cx="5011761" cy="4142735"/>
+                    </a:xfrm>
+                    <a:prstGeom prst="rect">
+                      <a:avLst/>
+                    </a:prstGeom>
+                  </pic:spPr>
+                </pic:pic>
+              </a:graphicData>
+            </a:graphic>
+          </wp:inline>
+        </w:drawing>
+      </w:r>
+    </w:p>
+    <w:p/>
+    <w:p>
+      <w:r>
+        <w:t>Output.</w:t>
+      </w:r>
+    </w:p>
+    <w:p>
+      <w:r>
+        <w:drawing>
+          <wp:inline distT="0" distB="0" distL="0" distR="0" wp14:anchorId="6636DB0D" wp14:editId="53F284E2">
+            <wp:extent cx="2297723" cy="1433622"/>
+            <wp:effectExtent l="0" t="0" r="7620" b="0"/>
+            <wp:docPr id="2034909959" name="Picture 1"/>
+            <wp:cNvGraphicFramePr>
+              <a:graphicFrameLocks xmlns:a="http://schemas.openxmlformats.org/drawingml/2006/main" noChangeAspect="1"/>
+            </wp:cNvGraphicFramePr>
+            <a:graphic xmlns:a="http://schemas.openxmlformats.org/drawingml/2006/main">
+              <a:graphicData uri="http://schemas.openxmlformats.org/drawingml/2006/picture">
+                <pic:pic xmlns:pic="http://schemas.openxmlformats.org/drawingml/2006/picture">
+                  <pic:nvPicPr>
+                    <pic:cNvPr id="2034909959" name=""/>
+                    <pic:cNvPicPr/>
+                  </pic:nvPicPr>
+                  <pic:blipFill>
+                    <a:blip r:embed="rId42"/>
+                    <a:stretch>
+                      <a:fillRect/>
+                    </a:stretch>
+                  </pic:blipFill>
+                  <pic:spPr>
+                    <a:xfrm>
+                      <a:off x="0" y="0"/>
+                      <a:ext cx="2304053" cy="1437571"/>
+                    </a:xfrm>
+                    <a:prstGeom prst="rect">
+                      <a:avLst/>
+                    </a:prstGeom>
+                  </pic:spPr>
+                </pic:pic>
+              </a:graphicData>
+            </a:graphic>
+          </wp:inline>
+        </w:drawing>
+      </w:r>
+    </w:p>
+    <w:p>
+      <w:r>
+        <w:drawing>
+          <wp:inline distT="0" distB="0" distL="0" distR="0" wp14:anchorId="38AA6A5E" wp14:editId="7CBF74FB">
+            <wp:extent cx="3200847" cy="1314633"/>
+            <wp:effectExtent l="0" t="0" r="0" b="0"/>
+            <wp:docPr id="1996903304" name="Picture 1"/>
+            <wp:cNvGraphicFramePr>
+              <a:graphicFrameLocks xmlns:a="http://schemas.openxmlformats.org/drawingml/2006/main" noChangeAspect="1"/>
+            </wp:cNvGraphicFramePr>
+            <a:graphic xmlns:a="http://schemas.openxmlformats.org/drawingml/2006/main">
+              <a:graphicData uri="http://schemas.openxmlformats.org/drawingml/2006/picture">
+                <pic:pic xmlns:pic="http://schemas.openxmlformats.org/drawingml/2006/picture">
+                  <pic:nvPicPr>
+                    <pic:cNvPr id="1996903304" name=""/>
+                    <pic:cNvPicPr/>
+                  </pic:nvPicPr>
+                  <pic:blipFill>
+                    <a:blip r:embed="rId43"/>
+                    <a:stretch>
+                      <a:fillRect/>
+                    </a:stretch>
+                  </pic:blipFill>
+                  <pic:spPr>
+                    <a:xfrm>
+                      <a:off x="0" y="0"/>
+                      <a:ext cx="3200847" cy="1314633"/>
+                    </a:xfrm>
+                    <a:prstGeom prst="rect">
+                      <a:avLst/>
+                    </a:prstGeom>
+                  </pic:spPr>
+                </pic:pic>
+              </a:graphicData>
+            </a:graphic>
+          </wp:inline>
+        </w:drawing>
+      </w:r>
+    </w:p>
+    <w:p>
+      <w:r>
+        <w:lastRenderedPageBreak/>
+        <w:t>Q17.</w:t>
+      </w:r>
+    </w:p>
+    <w:p>
+      <w:r>
+        <w:drawing>
+          <wp:inline distT="0" distB="0" distL="0" distR="0" wp14:anchorId="6A4714E2" wp14:editId="6F6856E6">
+            <wp:extent cx="5574323" cy="3129601"/>
+            <wp:effectExtent l="0" t="0" r="7620" b="0"/>
+            <wp:docPr id="1880711226" name="Picture 1"/>
+            <wp:cNvGraphicFramePr>
+              <a:graphicFrameLocks xmlns:a="http://schemas.openxmlformats.org/drawingml/2006/main" noChangeAspect="1"/>
+            </wp:cNvGraphicFramePr>
+            <a:graphic xmlns:a="http://schemas.openxmlformats.org/drawingml/2006/main">
+              <a:graphicData uri="http://schemas.openxmlformats.org/drawingml/2006/picture">
+                <pic:pic xmlns:pic="http://schemas.openxmlformats.org/drawingml/2006/picture">
+                  <pic:nvPicPr>
+                    <pic:cNvPr id="1880711226" name=""/>
+                    <pic:cNvPicPr/>
+                  </pic:nvPicPr>
+                  <pic:blipFill>
+                    <a:blip r:embed="rId44"/>
+                    <a:stretch>
+                      <a:fillRect/>
+                    </a:stretch>
+                  </pic:blipFill>
+                  <pic:spPr>
+                    <a:xfrm>
+                      <a:off x="0" y="0"/>
+                      <a:ext cx="5578892" cy="3132166"/>
+                    </a:xfrm>
+                    <a:prstGeom prst="rect">
+                      <a:avLst/>
+                    </a:prstGeom>
+                  </pic:spPr>
+                </pic:pic>
+              </a:graphicData>
+            </a:graphic>
+          </wp:inline>
+        </w:drawing>
+      </w:r>
+    </w:p>
+    <w:p/>
+    <w:p>
+      <w:r>
+        <w:t>Output.</w:t>
+      </w:r>
+    </w:p>
+    <w:p>
+      <w:r>
+        <w:drawing>
+          <wp:inline distT="0" distB="0" distL="0" distR="0" wp14:anchorId="37736CA5" wp14:editId="60C96BE2">
+            <wp:extent cx="5943600" cy="1411605"/>
+            <wp:effectExtent l="0" t="0" r="0" b="0"/>
+            <wp:docPr id="259078129" name="Picture 1"/>
+            <wp:cNvGraphicFramePr>
+              <a:graphicFrameLocks xmlns:a="http://schemas.openxmlformats.org/drawingml/2006/main" noChangeAspect="1"/>
+            </wp:cNvGraphicFramePr>
+            <a:graphic xmlns:a="http://schemas.openxmlformats.org/drawingml/2006/main">
+              <a:graphicData uri="http://schemas.openxmlformats.org/drawingml/2006/picture">
+                <pic:pic xmlns:pic="http://schemas.openxmlformats.org/drawingml/2006/picture">
+                  <pic:nvPicPr>
+                    <pic:cNvPr id="259078129" name=""/>
+                    <pic:cNvPicPr/>
+                  </pic:nvPicPr>
+                  <pic:blipFill>
+                    <a:blip r:embed="rId45"/>
+                    <a:stretch>
+                      <a:fillRect/>
+                    </a:stretch>
+                  </pic:blipFill>
+                  <pic:spPr>
+                    <a:xfrm>
+                      <a:off x="0" y="0"/>
+                      <a:ext cx="5943600" cy="1411605"/>
+                    </a:xfrm>
+                    <a:prstGeom prst="rect">
+                      <a:avLst/>
+                    </a:prstGeom>
+                  </pic:spPr>
+                </pic:pic>
+              </a:graphicData>
+            </a:graphic>
+          </wp:inline>
+        </w:drawing>
+      </w:r>
+    </w:p>
+    <w:p/>
+    <w:p/>
+    <w:p/>
+    <w:p/>
+    <w:p/>
+    <w:p/>
+    <w:p/>
+    <w:p/>
+    <w:p>
+      <w:r>
+        <w:lastRenderedPageBreak/>
+        <w:t>Q18.</w:t>
+      </w:r>
+    </w:p>
+    <w:p>
+      <w:r>
+        <w:drawing>
+          <wp:inline distT="0" distB="0" distL="0" distR="0" wp14:anchorId="03260000" wp14:editId="7906E959">
+            <wp:extent cx="3569677" cy="3124380"/>
+            <wp:effectExtent l="0" t="0" r="0" b="0"/>
+            <wp:docPr id="1422427547" name="Picture 1"/>
+            <wp:cNvGraphicFramePr>
+              <a:graphicFrameLocks xmlns:a="http://schemas.openxmlformats.org/drawingml/2006/main" noChangeAspect="1"/>
+            </wp:cNvGraphicFramePr>
+            <a:graphic xmlns:a="http://schemas.openxmlformats.org/drawingml/2006/main">
+              <a:graphicData uri="http://schemas.openxmlformats.org/drawingml/2006/picture">
+                <pic:pic xmlns:pic="http://schemas.openxmlformats.org/drawingml/2006/picture">
+                  <pic:nvPicPr>
+                    <pic:cNvPr id="1422427547" name=""/>
+                    <pic:cNvPicPr/>
+                  </pic:nvPicPr>
+                  <pic:blipFill>
+                    <a:blip r:embed="rId46"/>
+                    <a:stretch>
+                      <a:fillRect/>
+                    </a:stretch>
+                  </pic:blipFill>
+                  <pic:spPr>
+                    <a:xfrm>
+                      <a:off x="0" y="0"/>
+                      <a:ext cx="3575035" cy="3129069"/>
+                    </a:xfrm>
+                    <a:prstGeom prst="rect">
+                      <a:avLst/>
+                    </a:prstGeom>
+                  </pic:spPr>
+                </pic:pic>
+              </a:graphicData>
+            </a:graphic>
+          </wp:inline>
+        </w:drawing>
+      </w:r>
+    </w:p>
+    <w:p>
+      <w:pPr>
+        <w:spacing w:after="0"/>
+      </w:pPr>
+      <w:r>
+        <w:t>Answers:</w:t>
+      </w:r>
+    </w:p>
+    <w:p>
+      <w:pPr>
+        <w:spacing w:after="0"/>
+        <w:rPr>
+          <w:sz w:val="20"/>
+          <w:szCs w:val="20"/>
+        </w:rPr>
+      </w:pPr>
+      <w:r>
+        <w:rPr>
+          <w:sz w:val="20"/>
+          <w:szCs w:val="20"/>
+        </w:rPr>
+        <w:t>line 1 – legal</w:t>
+      </w:r>
+    </w:p>
+    <w:p>
+      <w:pPr>
+        <w:spacing w:after="0"/>
+        <w:rPr>
+          <w:sz w:val="20"/>
+          <w:szCs w:val="20"/>
+        </w:rPr>
+      </w:pPr>
+      <w:r>
+        <w:rPr>
+          <w:sz w:val="20"/>
+          <w:szCs w:val="20"/>
+        </w:rPr>
+        <w:tab/>
+        <w:t>* Standard String variable declaration and initialization.</w:t>
+      </w:r>
+    </w:p>
+    <w:p>
+      <w:pPr>
+        <w:spacing w:after="0"/>
+        <w:rPr>
+          <w:sz w:val="20"/>
+          <w:szCs w:val="20"/>
+        </w:rPr>
+      </w:pPr>
+      <w:r>
+        <w:rPr>
+          <w:sz w:val="20"/>
+          <w:szCs w:val="20"/>
+        </w:rPr>
+        <w:t>line 2 – illegal</w:t>
+      </w:r>
+    </w:p>
+    <w:p>
+      <w:pPr>
+        <w:spacing w:after="0"/>
+        <w:rPr>
+          <w:sz w:val="20"/>
+          <w:szCs w:val="20"/>
+        </w:rPr>
+      </w:pPr>
+      <w:r>
+        <w:rPr>
+          <w:sz w:val="20"/>
+          <w:szCs w:val="20"/>
+        </w:rPr>
+        <w:tab/>
+        <w:t>* Parentheses () are required when invoking/calling a method.</w:t>
+      </w:r>
+    </w:p>
+    <w:p>
+      <w:pPr>
+        <w:spacing w:after="0"/>
+        <w:rPr>
+          <w:sz w:val="20"/>
+          <w:szCs w:val="20"/>
+        </w:rPr>
+      </w:pPr>
+      <w:r>
+        <w:rPr>
+          <w:sz w:val="20"/>
+          <w:szCs w:val="20"/>
+        </w:rPr>
+        <w:t>line 3 – legal</w:t>
+      </w:r>
+    </w:p>
+    <w:p>
+      <w:pPr>
+        <w:spacing w:after="0"/>
+        <w:rPr>
+          <w:sz w:val="20"/>
+          <w:szCs w:val="20"/>
+        </w:rPr>
+      </w:pPr>
+      <w:r>
+        <w:rPr>
+          <w:sz w:val="20"/>
+          <w:szCs w:val="20"/>
+        </w:rPr>
+        <w:tab/>
+        <w:t>* Correct syntax for calling a static method with no arguments.</w:t>
+      </w:r>
+    </w:p>
+    <w:p>
+      <w:pPr>
+        <w:spacing w:after="0"/>
+        <w:rPr>
+          <w:sz w:val="20"/>
+          <w:szCs w:val="20"/>
+        </w:rPr>
+      </w:pPr>
+      <w:r>
+        <w:rPr>
+          <w:sz w:val="20"/>
+          <w:szCs w:val="20"/>
+        </w:rPr>
+        <w:t>line 4 – illegal</w:t>
+      </w:r>
+    </w:p>
+    <w:p>
+      <w:pPr>
+        <w:spacing w:after="0"/>
+        <w:rPr>
+          <w:sz w:val="20"/>
+          <w:szCs w:val="20"/>
+        </w:rPr>
+      </w:pPr>
+      <w:r>
+        <w:rPr>
+          <w:sz w:val="20"/>
+          <w:szCs w:val="20"/>
+        </w:rPr>
+        <w:tab/>
+        <w:t>* You cannot declare or define a method inside another method block (such as main).</w:t>
+      </w:r>
+    </w:p>
+    <w:p>
+      <w:pPr>
+        <w:spacing w:after="0"/>
+        <w:rPr>
+          <w:sz w:val="20"/>
+          <w:szCs w:val="20"/>
+        </w:rPr>
+      </w:pPr>
+      <w:r>
+        <w:rPr>
+          <w:sz w:val="20"/>
+          <w:szCs w:val="20"/>
+        </w:rPr>
+        <w:t>line 5 – illegal</w:t>
+      </w:r>
+    </w:p>
+    <w:p>
+      <w:pPr>
+        <w:spacing w:after="0"/>
+        <w:rPr>
+          <w:sz w:val="20"/>
+          <w:szCs w:val="20"/>
+        </w:rPr>
+      </w:pPr>
+      <w:r>
+        <w:rPr>
+          <w:sz w:val="20"/>
+          <w:szCs w:val="20"/>
+        </w:rPr>
+        <w:tab/>
+        <w:t>* Same as Line 4; method definitions are not allowed inside main.</w:t>
+      </w:r>
+    </w:p>
+    <w:p>
+      <w:pPr>
+        <w:spacing w:after="0"/>
+        <w:rPr>
+          <w:sz w:val="20"/>
+          <w:szCs w:val="20"/>
+        </w:rPr>
+      </w:pPr>
+      <w:r>
+        <w:rPr>
+          <w:sz w:val="20"/>
+          <w:szCs w:val="20"/>
+        </w:rPr>
+        <w:t>line 6 – legal</w:t>
+      </w:r>
+    </w:p>
+    <w:p>
+      <w:pPr>
+        <w:spacing w:after="0"/>
+        <w:rPr>
+          <w:sz w:val="20"/>
+          <w:szCs w:val="20"/>
+        </w:rPr>
+      </w:pPr>
+      <w:r>
+        <w:rPr>
+          <w:sz w:val="20"/>
+          <w:szCs w:val="20"/>
+        </w:rPr>
+        <w:tab/>
+        <w:t>* Valid static method invocation syntax (assuming a Demo class with a static test() method exists in the same package).</w:t>
+      </w:r>
+    </w:p>
+    <w:p>
+      <w:pPr>
+        <w:spacing w:after="0"/>
+        <w:rPr>
+          <w:sz w:val="20"/>
+          <w:szCs w:val="20"/>
+        </w:rPr>
+      </w:pPr>
+      <w:r>
+        <w:rPr>
+          <w:sz w:val="20"/>
+          <w:szCs w:val="20"/>
+        </w:rPr>
+        <w:t>line 7 – legal</w:t>
+      </w:r>
+    </w:p>
+    <w:p>
+      <w:pPr>
+        <w:spacing w:after="0"/>
+        <w:rPr>
+          <w:sz w:val="20"/>
+          <w:szCs w:val="20"/>
+        </w:rPr>
+      </w:pPr>
+      <w:r>
+        <w:rPr>
+          <w:sz w:val="20"/>
+          <w:szCs w:val="20"/>
+        </w:rPr>
+        <w:tab/>
+        <w:t>* Treats "test()" as a plain String literal inside quotes and prints it directly.</w:t>
+      </w:r>
+    </w:p>
+    <w:p>
+      <w:pPr>
+        <w:spacing w:after="0"/>
+        <w:rPr>
+          <w:sz w:val="20"/>
+          <w:szCs w:val="20"/>
+        </w:rPr>
+      </w:pPr>
+      <w:r>
+        <w:rPr>
+          <w:sz w:val="20"/>
+          <w:szCs w:val="20"/>
+        </w:rPr>
+        <w:t>line 8 – illegal</w:t>
+      </w:r>
+    </w:p>
+    <w:p>
+      <w:pPr>
+        <w:spacing w:after="0"/>
+        <w:rPr>
+          <w:sz w:val="20"/>
+          <w:szCs w:val="20"/>
+        </w:rPr>
+      </w:pPr>
+      <w:r>
+        <w:rPr>
+          <w:sz w:val="20"/>
+          <w:szCs w:val="20"/>
+        </w:rPr>
+        <w:tab/>
+        <w:t>* test() is a void method, meaning it returns nothing. You cannot pass a void method call as an argument to System.out.println().</w:t>
+      </w:r>
+    </w:p>
+    <w:p>
+      <w:pPr>
+        <w:spacing w:after="0"/>
+        <w:rPr>
+          <w:sz w:val="20"/>
+          <w:szCs w:val="20"/>
+        </w:rPr>
+      </w:pPr>
+      <w:r>
+        <w:rPr>
+          <w:sz w:val="20"/>
+          <w:szCs w:val="20"/>
+        </w:rPr>
+        <w:t>line 9 – legal</w:t>
+      </w:r>
+    </w:p>
+    <w:p>
+      <w:pPr>
+        <w:spacing w:after="0"/>
+        <w:rPr>
+          <w:sz w:val="20"/>
+          <w:szCs w:val="20"/>
+        </w:rPr>
+      </w:pPr>
+      <w:r>
+        <w:rPr>
+          <w:sz w:val="20"/>
+          <w:szCs w:val="20"/>
+        </w:rPr>
+        <w:tab/>
+        <w:t>* Correct syntax for calling the overloaded method test(String name) passing s as an argument.</w:t>
+      </w:r>
+    </w:p>
+    <w:p>
+      <w:pPr>
+        <w:spacing w:after="0"/>
+        <w:rPr>
+          <w:sz w:val="20"/>
+          <w:szCs w:val="20"/>
+        </w:rPr>
+      </w:pPr>
+      <w:r>
+        <w:rPr>
+          <w:sz w:val="20"/>
+          <w:szCs w:val="20"/>
+        </w:rPr>
+        <w:t>line 10 – illegal</w:t>
+      </w:r>
+    </w:p>
+    <w:p>
+      <w:pPr>
+        <w:spacing w:after="0"/>
+        <w:rPr>
+          <w:sz w:val="20"/>
+          <w:szCs w:val="20"/>
+        </w:rPr>
+      </w:pPr>
+      <w:r>
+        <w:rPr>
+          <w:sz w:val="20"/>
+          <w:szCs w:val="20"/>
+        </w:rPr>
+        <w:tab/>
+        <w:t>* test(s) is also a void method and has no return value to pass into System.out.println().</w:t>
+      </w:r>
+    </w:p>
+    <w:p>
+      <w:pPr>
+        <w:spacing w:after="0"/>
+        <w:rPr>
+          <w:sz w:val="20"/>
+          <w:szCs w:val="20"/>
+        </w:rPr>
+      </w:pPr>
+      <w:r>
+        <w:rPr>
+          <w:sz w:val="20"/>
+          <w:szCs w:val="20"/>
+        </w:rPr>
+        <w:t>line 11 – legal</w:t>
+      </w:r>
+    </w:p>
+    <w:p>
+      <w:pPr>
+        <w:spacing w:after="0"/>
+        <w:rPr>
+          <w:sz w:val="20"/>
+          <w:szCs w:val="20"/>
+        </w:rPr>
+      </w:pPr>
+      <w:r>
+        <w:rPr>
+          <w:sz w:val="20"/>
+          <w:szCs w:val="20"/>
+        </w:rPr>
+        <w:tab/>
+        <w:t>* Treats "test(s)" as a plain String literal inside quotes and prints it directly.</w:t>
+      </w:r>
+    </w:p>
+    <w:p>
+      <w:pPr>
+        <w:spacing w:after="0"/>
+      </w:pPr>
+      <w:r>
+        <w:lastRenderedPageBreak/>
+        <w:t>Q19.</w:t>
+      </w:r>
+    </w:p>
+    <w:p>
+      <w:pPr>
+        <w:spacing w:after="0"/>
+      </w:pPr>
+    </w:p>
+    <w:p/>
+    <w:p/>
+    <w:p/>
+    <w:p/>
+    <w:p/>
+    <w:p/>
+    <w:p/>
+    <w:p/>
+    <w:p/>
+    <w:p/>
+    <w:p/>
+    <w:p/>
+    <w:p/>
+    <w:p/>
+    <w:p/>
+    <w:p/>
     <w:p/>
     <w:p/>
     <w:p/>
@@ -1328,7 +2518,7 @@
 </file>
 
 <file path=word/numbering.xml><?xml version="1.0" encoding="utf-8"?>
-<w:numbering xmlns:wpc="http://schemas.microsoft.com/office/word/2010/wordprocessingCanvas" xmlns:cx="http://schemas.microsoft.com/office/drawing/2014/chartex" xmlns:cx1="http://schemas.microsoft.com/office/drawing/2015/9/8/chartex" xmlns:cx2="http://schemas.microsoft.com/office/drawing/2015/10/21/chartex" xmlns:cx3="http://schemas.microsoft.com/office/drawing/2016/5/9/chartex" xmlns:cx4="http://schemas.microsoft.com/office/drawing/2016/5/10/chartex" xmlns:cx5="http://schemas.microsoft.com/office/drawing/2016/5/11/chartex" xmlns:cx6="http://schemas.microsoft.com/office/drawing/2016/5/12/chartex" xmlns:cx7="http://schemas.microsoft.com/office/drawing/2016/5/13/chartex" xmlns:cx8="http://schemas.microsoft.com/office/drawing/2016/5/14/chartex" xmlns:mc="http://schemas.openxmlformats.org/markup-compatibility/2006" xmlns:aink="http://schemas.microsoft.com/office/drawing/2016/ink" xmlns:am3d="http://schemas.microsoft.com/office/drawing/2017/model3d" xmlns:o="urn:schemas-microsoft-com:office:office" xmlns:oel="http://schemas.microsoft.com/office/2019/extlst" xmlns:r="http://schemas.openxmlformats.org/officeDocument/2006/relationships" xmlns:m="http://schemas.openxmlformats.org/officeDocument/2006/math" xmlns:v="urn:schemas-microsoft-com:vml" xmlns:wp14="http://schemas.microsoft.com/office/word/2010/wordprocessingDrawing" xmlns:wp="http://schemas.openxmlformats.org/drawingml/2006/wordprocessingDrawing" xmlns:w10="urn:schemas-microsoft-com:office:word" xmlns:w="http://schemas.openxmlformats.org/wordprocessingml/2006/main" xmlns:w14="http://schemas.microsoft.com/office/word/2010/wordml" xmlns:w15="http://schemas.microsoft.com/office/word/2012/wordml" xmlns:w16cei="http://schemas.microsoft.com/office/word/2026/wordml/cei" xmlns:w16cex="http://schemas.microsoft.com/office/word/2018/wordml/cex" xmlns:w16cid="http://schemas.microsoft.com/office/word/2016/wordml/cid" xmlns:w16="http://schemas.microsoft.com/office/word/2018/wordml" xmlns:w16du="http://schemas.microsoft.com/office/word/2023/wordml/word16du" xmlns:w16sdtdh="http://schemas.microsoft.com/office/word/2020/wordml/sdtdatahash" xmlns:w16sdtfl="http://schemas.microsoft.com/office/word/2024/wordml/sdtformatlock" xmlns:w16se="http://schemas.microsoft.com/office/word/2015/wordml/symex" xmlns:wpg="http://schemas.microsoft.com/office/word/2010/wordprocessingGroup" xmlns:wpi="http://schemas.microsoft.com/office/word/2010/wordprocessingInk" xmlns:wne="http://schemas.microsoft.com/office/word/2006/wordml" xmlns:wps="http://schemas.microsoft.com/office/word/2010/wordprocessingShape" mc:Ignorable="w14 w15 w16se w16cid w16 w16cex w16sdtdh w16sdtfl w16du wp14">
+<w:numbering xmlns:wpc="http://schemas.microsoft.com/office/word/2010/wordprocessingCanvas" xmlns:cx="http://schemas.microsoft.com/office/drawing/2014/chartex" xmlns:cx1="http://schemas.microsoft.com/office/drawing/2015/9/8/chartex" xmlns:cx2="http://schemas.microsoft.com/office/drawing/2015/10/21/chartex" xmlns:cx3="http://schemas.microsoft.com/office/drawing/2016/5/9/chartex" xmlns:cx4="http://schemas.microsoft.com/office/drawing/2016/5/10/chartex" xmlns:cx5="http://schemas.microsoft.com/office/drawing/2016/5/11/chartex" xmlns:cx6="http://schemas.microsoft.com/office/drawing/2016/5/12/chartex" xmlns:cx7="http://schemas.microsoft.com/office/drawing/2016/5/13/chartex" xmlns:cx8="http://schemas.microsoft.com/office/drawing/2016/5/14/chartex" xmlns:mc="http://schemas.openxmlformats.org/markup-compatibility/2006" xmlns:aink="http://schemas.microsoft.com/office/drawing/2016/ink" xmlns:am3d="http://schemas.microsoft.com/office/drawing/2017/model3d" xmlns:o="urn:schemas-microsoft-com:office:office" xmlns:oel="http://schemas.microsoft.com/office/2019/extlst" xmlns:r="http://schemas.openxmlformats.org/officeDocument/2006/relationships" xmlns:m="http://schemas.openxmlformats.org/officeDocument/2006/math" xmlns:v="urn:schemas-microsoft-com:vml" xmlns:wp14="http://schemas.microsoft.com/office/word/2010/wordprocessingDrawing" xmlns:wp="http://schemas.openxmlformats.org/drawingml/2006/wordprocessingDrawing" xmlns:w10="urn:schemas-microsoft-com:office:word" xmlns:w="http://schemas.openxmlformats.org/wordprocessingml/2006/main" xmlns:w14="http://schemas.microsoft.com/office/word/2010/wordml" xmlns:w15="http://schemas.microsoft.com/office/word/2012/wordml" xmlns:w16cex="http://schemas.microsoft.com/office/word/2018/wordml/cex" xmlns:w16cid="http://schemas.microsoft.com/office/word/2016/wordml/cid" xmlns:w16="http://schemas.microsoft.com/office/word/2018/wordml" xmlns:w16du="http://schemas.microsoft.com/office/word/2023/wordml/word16du" xmlns:w16sdtdh="http://schemas.microsoft.com/office/word/2020/wordml/sdtdatahash" xmlns:w16sdtfl="http://schemas.microsoft.com/office/word/2024/wordml/sdtformatlock" xmlns:w16se="http://schemas.microsoft.com/office/word/2015/wordml/symex" xmlns:wpg="http://schemas.microsoft.com/office/word/2010/wordprocessingGroup" xmlns:wpi="http://schemas.microsoft.com/office/word/2010/wordprocessingInk" xmlns:wne="http://schemas.microsoft.com/office/word/2006/wordml" xmlns:wps="http://schemas.microsoft.com/office/word/2010/wordprocessingShape" mc:Ignorable="w14 w15 w16se w16cid w16 w16cex w16sdtdh w16sdtfl w16du wp14">
   <w:abstractNum w:abstractNumId="0" w15:restartNumberingAfterBreak="0">
     <w:nsid w:val="64F60F15"/>
     <w:multiLevelType w:val="hybridMultilevel"/>

</xml_diff>

<commit_message>
Week 6 to Week11 work file
</commit_message>
<xml_diff>
--- a/DAY 6/n/Assignment6/Assignment6.docx
+++ b/DAY 6/n/Assignment6/Assignment6.docx
@@ -774,21 +774,16 @@
       <w:r>
         <w:t xml:space="preserve">n first program it program is running in </w:t>
       </w:r>
-      <w:proofErr w:type="spellStart"/>
-      <w:r>
-        <w:t>printName</w:t>
-      </w:r>
-      <w:proofErr w:type="spellEnd"/>
+      <w:r>
+        <w:t>printName()</w:t>
+      </w:r>
+      <w:r>
+        <w:t xml:space="preserve"> method, and it calls in main</w:t>
+      </w:r>
       <w:r>
         <w:t>()</w:t>
       </w:r>
       <w:r>
-        <w:t xml:space="preserve"> method, and it calls in main</w:t>
-      </w:r>
-      <w:r>
-        <w:t>()</w:t>
-      </w:r>
-      <w:r>
         <w:t xml:space="preserve">                                                                                          method.</w:t>
       </w:r>
     </w:p>
@@ -796,13 +791,8 @@
       <w:r>
         <w:t xml:space="preserve">But in second program some part of program run in main method and another part runs in </w:t>
       </w:r>
-      <w:proofErr w:type="spellStart"/>
-      <w:r>
-        <w:t>printName</w:t>
-      </w:r>
-      <w:proofErr w:type="spellEnd"/>
-      <w:r>
-        <w:t>()</w:t>
+      <w:r>
+        <w:t>printName()</w:t>
       </w:r>
       <w:r>
         <w:t xml:space="preserve"> </w:t>
@@ -921,23 +911,7 @@
         <w:t>arguments in main method,</w:t>
       </w:r>
       <w:r>
-        <w:t xml:space="preserve"> we </w:t>
-      </w:r>
-      <w:proofErr w:type="spellStart"/>
-      <w:r>
-        <w:t>cant</w:t>
-      </w:r>
-      <w:proofErr w:type="spellEnd"/>
-      <w:r>
-        <w:t xml:space="preserve"> run </w:t>
-      </w:r>
-      <w:proofErr w:type="spellStart"/>
-      <w:r>
-        <w:t>printName</w:t>
-      </w:r>
-      <w:proofErr w:type="spellEnd"/>
-      <w:r>
-        <w:t>() method.</w:t>
+        <w:t xml:space="preserve"> we cant run printName() method.</w:t>
       </w:r>
     </w:p>
     <w:p/>
@@ -1293,6 +1267,9 @@
     </w:p>
     <w:p>
       <w:r>
+        <w:rPr>
+          <w:noProof/>
+        </w:rPr>
         <w:drawing>
           <wp:inline distT="0" distB="0" distL="0" distR="0" wp14:anchorId="02DF78D0" wp14:editId="522A7DA2">
             <wp:extent cx="5096586" cy="3791479"/>
@@ -1337,6 +1314,9 @@
     </w:p>
     <w:p>
       <w:r>
+        <w:rPr>
+          <w:noProof/>
+        </w:rPr>
         <w:drawing>
           <wp:inline distT="0" distB="0" distL="0" distR="0" wp14:anchorId="0EB87247" wp14:editId="5504BA26">
             <wp:extent cx="4115374" cy="2638793"/>
@@ -1385,6 +1365,9 @@
     </w:p>
     <w:p>
       <w:r>
+        <w:rPr>
+          <w:noProof/>
+        </w:rPr>
         <w:drawing>
           <wp:inline distT="0" distB="0" distL="0" distR="0" wp14:anchorId="0CCAAAB8" wp14:editId="56041821">
             <wp:extent cx="5410955" cy="3715268"/>
@@ -1429,6 +1412,9 @@
     </w:p>
     <w:p>
       <w:r>
+        <w:rPr>
+          <w:noProof/>
+        </w:rPr>
         <w:drawing>
           <wp:inline distT="0" distB="0" distL="0" distR="0" wp14:anchorId="146481A6" wp14:editId="6ECE8C80">
             <wp:extent cx="3858163" cy="2896004"/>
@@ -1476,6 +1462,9 @@
     </w:p>
     <w:p>
       <w:r>
+        <w:rPr>
+          <w:noProof/>
+        </w:rPr>
         <w:drawing>
           <wp:inline distT="0" distB="0" distL="0" distR="0" wp14:anchorId="7DD3115F" wp14:editId="45EBC7A1">
             <wp:extent cx="5943600" cy="6158865"/>
@@ -1526,6 +1515,9 @@
     </w:p>
     <w:p>
       <w:r>
+        <w:rPr>
+          <w:noProof/>
+        </w:rPr>
         <w:drawing>
           <wp:inline distT="0" distB="0" distL="0" distR="0" wp14:anchorId="17E53D1D" wp14:editId="17529715">
             <wp:extent cx="2215662" cy="1377447"/>
@@ -1565,6 +1557,9 @@
     </w:p>
     <w:p>
       <w:r>
+        <w:rPr>
+          <w:noProof/>
+        </w:rPr>
         <w:drawing>
           <wp:inline distT="0" distB="0" distL="0" distR="0" wp14:anchorId="3AF46F01" wp14:editId="47977F27">
             <wp:extent cx="1893277" cy="1445217"/>
@@ -1604,6 +1599,9 @@
     </w:p>
     <w:p>
       <w:r>
+        <w:rPr>
+          <w:noProof/>
+        </w:rPr>
         <w:drawing>
           <wp:inline distT="0" distB="0" distL="0" distR="0" wp14:anchorId="04B07B40" wp14:editId="4EB66348">
             <wp:extent cx="2614246" cy="1000920"/>
@@ -1643,6 +1641,9 @@
     </w:p>
     <w:p>
       <w:r>
+        <w:rPr>
+          <w:noProof/>
+        </w:rPr>
         <w:drawing>
           <wp:inline distT="0" distB="0" distL="0" distR="0" wp14:anchorId="513F6B85" wp14:editId="72DB8214">
             <wp:extent cx="2526323" cy="1633006"/>
@@ -1682,6 +1683,9 @@
     </w:p>
     <w:p>
       <w:r>
+        <w:rPr>
+          <w:noProof/>
+        </w:rPr>
         <w:drawing>
           <wp:inline distT="0" distB="0" distL="0" distR="0" wp14:anchorId="4FF14077" wp14:editId="4DF34FCF">
             <wp:extent cx="2426677" cy="1667530"/>
@@ -1727,6 +1731,9 @@
     </w:p>
     <w:p>
       <w:r>
+        <w:rPr>
+          <w:noProof/>
+        </w:rPr>
         <w:drawing>
           <wp:inline distT="0" distB="0" distL="0" distR="0" wp14:anchorId="545F3F09" wp14:editId="65021642">
             <wp:extent cx="4334480" cy="3248478"/>
@@ -1773,6 +1780,9 @@
     </w:p>
     <w:p>
       <w:r>
+        <w:rPr>
+          <w:noProof/>
+        </w:rPr>
         <w:drawing>
           <wp:inline distT="0" distB="0" distL="0" distR="0" wp14:anchorId="46664CD5" wp14:editId="5D9E66B0">
             <wp:extent cx="4001058" cy="2305372"/>
@@ -1824,6 +1834,9 @@
     </w:p>
     <w:p>
       <w:r>
+        <w:rPr>
+          <w:noProof/>
+        </w:rPr>
         <w:drawing>
           <wp:inline distT="0" distB="0" distL="0" distR="0" wp14:anchorId="33894EA2" wp14:editId="2018D630">
             <wp:extent cx="4999892" cy="4132924"/>
@@ -1869,6 +1882,9 @@
     </w:p>
     <w:p>
       <w:r>
+        <w:rPr>
+          <w:noProof/>
+        </w:rPr>
         <w:drawing>
           <wp:inline distT="0" distB="0" distL="0" distR="0" wp14:anchorId="6636DB0D" wp14:editId="53F284E2">
             <wp:extent cx="2297723" cy="1433622"/>
@@ -1908,6 +1924,9 @@
     </w:p>
     <w:p>
       <w:r>
+        <w:rPr>
+          <w:noProof/>
+        </w:rPr>
         <w:drawing>
           <wp:inline distT="0" distB="0" distL="0" distR="0" wp14:anchorId="38AA6A5E" wp14:editId="7CBF74FB">
             <wp:extent cx="3200847" cy="1314633"/>
@@ -1953,6 +1972,9 @@
     </w:p>
     <w:p>
       <w:r>
+        <w:rPr>
+          <w:noProof/>
+        </w:rPr>
         <w:drawing>
           <wp:inline distT="0" distB="0" distL="0" distR="0" wp14:anchorId="6A4714E2" wp14:editId="6F6856E6">
             <wp:extent cx="5574323" cy="3129601"/>
@@ -1998,6 +2020,9 @@
     </w:p>
     <w:p>
       <w:r>
+        <w:rPr>
+          <w:noProof/>
+        </w:rPr>
         <w:drawing>
           <wp:inline distT="0" distB="0" distL="0" distR="0" wp14:anchorId="37736CA5" wp14:editId="60C96BE2">
             <wp:extent cx="5943600" cy="1411605"/>
@@ -2051,6 +2076,9 @@
     </w:p>
     <w:p>
       <w:r>
+        <w:rPr>
+          <w:noProof/>
+        </w:rPr>
         <w:drawing>
           <wp:inline distT="0" distB="0" distL="0" distR="0" wp14:anchorId="03260000" wp14:editId="7906E959">
             <wp:extent cx="3569677" cy="3124380"/>
@@ -2472,12 +2500,3739 @@
       <w:pPr>
         <w:spacing w:after="0"/>
       </w:pPr>
-    </w:p>
-    <w:p/>
-    <w:p/>
-    <w:p/>
-    <w:p/>
-    <w:p/>
+      <w:r>
+        <w:rPr>
+          <w:noProof/>
+        </w:rPr>
+        <w:drawing>
+          <wp:inline distT="0" distB="0" distL="0" distR="0" wp14:anchorId="3F18E890" wp14:editId="07724C58">
+            <wp:extent cx="5943600" cy="4205605"/>
+            <wp:effectExtent l="0" t="0" r="0" b="4445"/>
+            <wp:docPr id="1288794748" name="Picture 1"/>
+            <wp:cNvGraphicFramePr>
+              <a:graphicFrameLocks xmlns:a="http://schemas.openxmlformats.org/drawingml/2006/main" noChangeAspect="1"/>
+            </wp:cNvGraphicFramePr>
+            <a:graphic xmlns:a="http://schemas.openxmlformats.org/drawingml/2006/main">
+              <a:graphicData uri="http://schemas.openxmlformats.org/drawingml/2006/picture">
+                <pic:pic xmlns:pic="http://schemas.openxmlformats.org/drawingml/2006/picture">
+                  <pic:nvPicPr>
+                    <pic:cNvPr id="1288794748" name=""/>
+                    <pic:cNvPicPr/>
+                  </pic:nvPicPr>
+                  <pic:blipFill>
+                    <a:blip r:embed="rId47"/>
+                    <a:stretch>
+                      <a:fillRect/>
+                    </a:stretch>
+                  </pic:blipFill>
+                  <pic:spPr>
+                    <a:xfrm>
+                      <a:off x="0" y="0"/>
+                      <a:ext cx="5943600" cy="4205605"/>
+                    </a:xfrm>
+                    <a:prstGeom prst="rect">
+                      <a:avLst/>
+                    </a:prstGeom>
+                  </pic:spPr>
+                </pic:pic>
+              </a:graphicData>
+            </a:graphic>
+          </wp:inline>
+        </w:drawing>
+      </w:r>
+    </w:p>
+    <w:p>
+      <w:pPr>
+        <w:spacing w:after="0"/>
+      </w:pPr>
+      <w:r>
+        <w:t>Output.</w:t>
+      </w:r>
+    </w:p>
+    <w:p>
+      <w:pPr>
+        <w:spacing w:after="0"/>
+      </w:pPr>
+      <w:r>
+        <w:rPr>
+          <w:noProof/>
+        </w:rPr>
+        <w:drawing>
+          <wp:inline distT="0" distB="0" distL="0" distR="0" wp14:anchorId="0910541F" wp14:editId="712AF733">
+            <wp:extent cx="3343275" cy="1914241"/>
+            <wp:effectExtent l="0" t="0" r="0" b="0"/>
+            <wp:docPr id="2104962927" name="Picture 1"/>
+            <wp:cNvGraphicFramePr>
+              <a:graphicFrameLocks xmlns:a="http://schemas.openxmlformats.org/drawingml/2006/main" noChangeAspect="1"/>
+            </wp:cNvGraphicFramePr>
+            <a:graphic xmlns:a="http://schemas.openxmlformats.org/drawingml/2006/main">
+              <a:graphicData uri="http://schemas.openxmlformats.org/drawingml/2006/picture">
+                <pic:pic xmlns:pic="http://schemas.openxmlformats.org/drawingml/2006/picture">
+                  <pic:nvPicPr>
+                    <pic:cNvPr id="2104962927" name=""/>
+                    <pic:cNvPicPr/>
+                  </pic:nvPicPr>
+                  <pic:blipFill>
+                    <a:blip r:embed="rId48"/>
+                    <a:stretch>
+                      <a:fillRect/>
+                    </a:stretch>
+                  </pic:blipFill>
+                  <pic:spPr>
+                    <a:xfrm>
+                      <a:off x="0" y="0"/>
+                      <a:ext cx="3355066" cy="1920992"/>
+                    </a:xfrm>
+                    <a:prstGeom prst="rect">
+                      <a:avLst/>
+                    </a:prstGeom>
+                  </pic:spPr>
+                </pic:pic>
+              </a:graphicData>
+            </a:graphic>
+          </wp:inline>
+        </w:drawing>
+      </w:r>
+    </w:p>
+    <w:p>
+      <w:pPr>
+        <w:spacing w:after="0"/>
+      </w:pPr>
+    </w:p>
+    <w:p>
+      <w:pPr>
+        <w:spacing w:after="0"/>
+      </w:pPr>
+    </w:p>
+    <w:p>
+      <w:pPr>
+        <w:spacing w:after="0"/>
+      </w:pPr>
+    </w:p>
+    <w:p>
+      <w:pPr>
+        <w:spacing w:after="0"/>
+      </w:pPr>
+    </w:p>
+    <w:p>
+      <w:pPr>
+        <w:spacing w:after="0"/>
+      </w:pPr>
+    </w:p>
+    <w:p>
+      <w:pPr>
+        <w:spacing w:after="0"/>
+      </w:pPr>
+    </w:p>
+    <w:p>
+      <w:pPr>
+        <w:spacing w:after="0"/>
+      </w:pPr>
+    </w:p>
+    <w:p>
+      <w:pPr>
+        <w:spacing w:after="0"/>
+      </w:pPr>
+      <w:r>
+        <w:lastRenderedPageBreak/>
+        <w:t>Q20.</w:t>
+      </w:r>
+    </w:p>
+    <w:p>
+      <w:pPr>
+        <w:spacing w:after="0"/>
+      </w:pPr>
+      <w:r>
+        <w:rPr>
+          <w:noProof/>
+        </w:rPr>
+        <w:drawing>
+          <wp:inline distT="0" distB="0" distL="0" distR="0" wp14:anchorId="1A21B111" wp14:editId="097AA739">
+            <wp:extent cx="3691050" cy="3286125"/>
+            <wp:effectExtent l="0" t="0" r="5080" b="0"/>
+            <wp:docPr id="1660657808" name="Picture 1"/>
+            <wp:cNvGraphicFramePr>
+              <a:graphicFrameLocks xmlns:a="http://schemas.openxmlformats.org/drawingml/2006/main" noChangeAspect="1"/>
+            </wp:cNvGraphicFramePr>
+            <a:graphic xmlns:a="http://schemas.openxmlformats.org/drawingml/2006/main">
+              <a:graphicData uri="http://schemas.openxmlformats.org/drawingml/2006/picture">
+                <pic:pic xmlns:pic="http://schemas.openxmlformats.org/drawingml/2006/picture">
+                  <pic:nvPicPr>
+                    <pic:cNvPr id="1660657808" name=""/>
+                    <pic:cNvPicPr/>
+                  </pic:nvPicPr>
+                  <pic:blipFill>
+                    <a:blip r:embed="rId49"/>
+                    <a:stretch>
+                      <a:fillRect/>
+                    </a:stretch>
+                  </pic:blipFill>
+                  <pic:spPr>
+                    <a:xfrm>
+                      <a:off x="0" y="0"/>
+                      <a:ext cx="3694895" cy="3289549"/>
+                    </a:xfrm>
+                    <a:prstGeom prst="rect">
+                      <a:avLst/>
+                    </a:prstGeom>
+                  </pic:spPr>
+                </pic:pic>
+              </a:graphicData>
+            </a:graphic>
+          </wp:inline>
+        </w:drawing>
+      </w:r>
+    </w:p>
+    <w:p>
+      <w:pPr>
+        <w:rPr>
+          <w:sz w:val="44"/>
+          <w:szCs w:val="44"/>
+        </w:rPr>
+      </w:pPr>
+      <w:r>
+        <w:rPr>
+          <w:sz w:val="44"/>
+          <w:szCs w:val="44"/>
+        </w:rPr>
+        <w:t>Answer.</w:t>
+      </w:r>
+    </w:p>
+    <w:p>
+      <w:r>
+        <w:t xml:space="preserve">Line 2 and Line 5  </w:t>
+      </w:r>
+      <w:r>
+        <w:t>-</w:t>
+      </w:r>
+      <w:r>
+        <w:t xml:space="preserve"> compile error  because testMethod2()/Demo.testMethod2 are non static, and static method can’t be directly call non static methods.</w:t>
+      </w:r>
+    </w:p>
+    <w:p/>
+    <w:p/>
+    <w:p/>
+    <w:p/>
+    <w:p/>
+    <w:p/>
+    <w:p/>
+    <w:p/>
+    <w:p/>
+    <w:p/>
+    <w:p/>
+    <w:p>
+      <w:r>
+        <w:lastRenderedPageBreak/>
+        <w:t>Q21.</w:t>
+      </w:r>
+    </w:p>
+    <w:p>
+      <w:r>
+        <w:rPr>
+          <w:noProof/>
+        </w:rPr>
+        <w:drawing>
+          <wp:inline distT="0" distB="0" distL="0" distR="0" wp14:anchorId="5223F70D" wp14:editId="48C98996">
+            <wp:extent cx="3905795" cy="2905530"/>
+            <wp:effectExtent l="0" t="0" r="0" b="9525"/>
+            <wp:docPr id="1600457006" name="Picture 1"/>
+            <wp:cNvGraphicFramePr>
+              <a:graphicFrameLocks xmlns:a="http://schemas.openxmlformats.org/drawingml/2006/main" noChangeAspect="1"/>
+            </wp:cNvGraphicFramePr>
+            <a:graphic xmlns:a="http://schemas.openxmlformats.org/drawingml/2006/main">
+              <a:graphicData uri="http://schemas.openxmlformats.org/drawingml/2006/picture">
+                <pic:pic xmlns:pic="http://schemas.openxmlformats.org/drawingml/2006/picture">
+                  <pic:nvPicPr>
+                    <pic:cNvPr id="1600457006" name=""/>
+                    <pic:cNvPicPr/>
+                  </pic:nvPicPr>
+                  <pic:blipFill>
+                    <a:blip r:embed="rId50"/>
+                    <a:stretch>
+                      <a:fillRect/>
+                    </a:stretch>
+                  </pic:blipFill>
+                  <pic:spPr>
+                    <a:xfrm>
+                      <a:off x="0" y="0"/>
+                      <a:ext cx="3905795" cy="2905530"/>
+                    </a:xfrm>
+                    <a:prstGeom prst="rect">
+                      <a:avLst/>
+                    </a:prstGeom>
+                  </pic:spPr>
+                </pic:pic>
+              </a:graphicData>
+            </a:graphic>
+          </wp:inline>
+        </w:drawing>
+      </w:r>
+    </w:p>
+    <w:p>
+      <w:pPr>
+        <w:rPr>
+          <w:sz w:val="40"/>
+          <w:szCs w:val="40"/>
+        </w:rPr>
+      </w:pPr>
+      <w:r>
+        <w:rPr>
+          <w:sz w:val="40"/>
+          <w:szCs w:val="40"/>
+        </w:rPr>
+        <w:t>Answers</w:t>
+      </w:r>
+      <w:r>
+        <w:rPr>
+          <w:sz w:val="40"/>
+          <w:szCs w:val="40"/>
+        </w:rPr>
+        <w:t>.</w:t>
+      </w:r>
+    </w:p>
+    <w:p>
+      <w:pPr>
+        <w:numPr>
+          <w:ilvl w:val="0"/>
+          <w:numId w:val="2"/>
+        </w:numPr>
+        <w:spacing w:after="0"/>
+      </w:pPr>
+      <w:r>
+        <w:t>Legal</w:t>
+      </w:r>
+    </w:p>
+    <w:p>
+      <w:pPr>
+        <w:numPr>
+          <w:ilvl w:val="0"/>
+          <w:numId w:val="2"/>
+        </w:numPr>
+        <w:spacing w:after="0"/>
+      </w:pPr>
+      <w:r>
+        <w:t>Legal</w:t>
+      </w:r>
+    </w:p>
+    <w:p>
+      <w:pPr>
+        <w:numPr>
+          <w:ilvl w:val="0"/>
+          <w:numId w:val="2"/>
+        </w:numPr>
+        <w:spacing w:after="0"/>
+      </w:pPr>
+      <w:r>
+        <w:t>Illegal</w:t>
+      </w:r>
+    </w:p>
+    <w:p>
+      <w:pPr>
+        <w:spacing w:after="0"/>
+        <w:ind w:left="720" w:firstLine="720"/>
+      </w:pPr>
+      <w:r>
+        <w:t>*   method body { } is missing</w:t>
+      </w:r>
+    </w:p>
+    <w:p>
+      <w:pPr>
+        <w:spacing w:after="0"/>
+      </w:pPr>
+      <w:r>
+        <w:t xml:space="preserve">      d.   Illegal</w:t>
+      </w:r>
+    </w:p>
+    <w:p>
+      <w:pPr>
+        <w:spacing w:after="0"/>
+      </w:pPr>
+      <w:r>
+        <w:tab/>
+        <w:t xml:space="preserve">      </w:t>
+      </w:r>
+      <w:r>
+        <w:tab/>
+      </w:r>
+      <w:r>
+        <w:t xml:space="preserve"> * missing method identifier(name)</w:t>
+      </w:r>
+    </w:p>
+    <w:p>
+      <w:pPr>
+        <w:spacing w:after="0"/>
+      </w:pPr>
+      <w:r>
+        <w:t xml:space="preserve">  </w:t>
+      </w:r>
+      <w:r>
+        <w:t xml:space="preserve">   </w:t>
+      </w:r>
+      <w:r>
+        <w:t xml:space="preserve"> e.   Illegal</w:t>
+      </w:r>
+    </w:p>
+    <w:p>
+      <w:pPr>
+        <w:spacing w:after="0"/>
+      </w:pPr>
+      <w:r>
+        <w:tab/>
+        <w:t xml:space="preserve">       * method body { } is missing</w:t>
+      </w:r>
+    </w:p>
+    <w:p>
+      <w:pPr>
+        <w:spacing w:after="0"/>
+      </w:pPr>
+      <w:r>
+        <w:t xml:space="preserve">    </w:t>
+      </w:r>
+      <w:r>
+        <w:t xml:space="preserve"> </w:t>
+      </w:r>
+      <w:r>
+        <w:t xml:space="preserve"> f.    legal</w:t>
+      </w:r>
+    </w:p>
+    <w:p>
+      <w:pPr>
+        <w:spacing w:after="0"/>
+      </w:pPr>
+      <w:r>
+        <w:t xml:space="preserve">   </w:t>
+      </w:r>
+      <w:r>
+        <w:t xml:space="preserve">  </w:t>
+      </w:r>
+      <w:r>
+        <w:t>g.   Illegal</w:t>
+      </w:r>
+    </w:p>
+    <w:p>
+      <w:pPr>
+        <w:spacing w:after="0"/>
+      </w:pPr>
+      <w:r>
+        <w:tab/>
+        <w:t xml:space="preserve">       *  we can’t use semicolons when passing parameters  </w:t>
+      </w:r>
+    </w:p>
+    <w:p>
+      <w:pPr>
+        <w:spacing w:after="0"/>
+      </w:pPr>
+      <w:r>
+        <w:t xml:space="preserve">     h.   Illegal</w:t>
+      </w:r>
+    </w:p>
+    <w:p>
+      <w:pPr>
+        <w:spacing w:after="0"/>
+      </w:pPr>
+      <w:r>
+        <w:tab/>
+        <w:t xml:space="preserve">      *   Missing data type for parameter( x )</w:t>
+      </w:r>
+    </w:p>
+    <w:p>
+      <w:pPr>
+        <w:spacing w:after="0"/>
+      </w:pPr>
+      <w:r>
+        <w:t xml:space="preserve">     I.     illegal</w:t>
+      </w:r>
+    </w:p>
+    <w:p>
+      <w:pPr>
+        <w:spacing w:after="0"/>
+      </w:pPr>
+      <w:r>
+        <w:tab/>
+        <w:t xml:space="preserve">      *   Missing data type and variable name </w:t>
+      </w:r>
+    </w:p>
+    <w:p>
+      <w:pPr>
+        <w:spacing w:after="0"/>
+      </w:pPr>
+      <w:r>
+        <w:t xml:space="preserve">     j.     illegal</w:t>
+      </w:r>
+    </w:p>
+    <w:p>
+      <w:pPr>
+        <w:spacing w:after="0"/>
+      </w:pPr>
+      <w:r>
+        <w:t xml:space="preserve"> </w:t>
+      </w:r>
+      <w:r>
+        <w:t xml:space="preserve">   </w:t>
+      </w:r>
+      <w:r>
+        <w:t xml:space="preserve"> k.     illegal</w:t>
+      </w:r>
+    </w:p>
+    <w:p>
+      <w:pPr>
+        <w:spacing w:after="0"/>
+      </w:pPr>
+      <w:r>
+        <w:tab/>
+        <w:t xml:space="preserve">       * without condition it was illegal    </w:t>
+      </w:r>
+    </w:p>
+    <w:p>
+      <w:pPr>
+        <w:spacing w:after="0"/>
+      </w:pPr>
+      <w:r>
+        <w:t xml:space="preserve"> </w:t>
+      </w:r>
+      <w:r>
+        <w:t xml:space="preserve">  </w:t>
+      </w:r>
+      <w:r>
+        <w:t xml:space="preserve"> l.     legal</w:t>
+      </w:r>
+    </w:p>
+    <w:p/>
+    <w:p>
+      <w:r>
+        <w:lastRenderedPageBreak/>
+        <w:t>Q22.</w:t>
+      </w:r>
+    </w:p>
+    <w:p>
+      <w:r>
+        <w:rPr>
+          <w:noProof/>
+        </w:rPr>
+        <w:drawing>
+          <wp:inline distT="0" distB="0" distL="0" distR="0" wp14:anchorId="31A6097B" wp14:editId="49C685BB">
+            <wp:extent cx="5849166" cy="3667637"/>
+            <wp:effectExtent l="0" t="0" r="0" b="9525"/>
+            <wp:docPr id="870545623" name="Picture 1"/>
+            <wp:cNvGraphicFramePr>
+              <a:graphicFrameLocks xmlns:a="http://schemas.openxmlformats.org/drawingml/2006/main" noChangeAspect="1"/>
+            </wp:cNvGraphicFramePr>
+            <a:graphic xmlns:a="http://schemas.openxmlformats.org/drawingml/2006/main">
+              <a:graphicData uri="http://schemas.openxmlformats.org/drawingml/2006/picture">
+                <pic:pic xmlns:pic="http://schemas.openxmlformats.org/drawingml/2006/picture">
+                  <pic:nvPicPr>
+                    <pic:cNvPr id="870545623" name=""/>
+                    <pic:cNvPicPr/>
+                  </pic:nvPicPr>
+                  <pic:blipFill>
+                    <a:blip r:embed="rId51"/>
+                    <a:stretch>
+                      <a:fillRect/>
+                    </a:stretch>
+                  </pic:blipFill>
+                  <pic:spPr>
+                    <a:xfrm>
+                      <a:off x="0" y="0"/>
+                      <a:ext cx="5849166" cy="3667637"/>
+                    </a:xfrm>
+                    <a:prstGeom prst="rect">
+                      <a:avLst/>
+                    </a:prstGeom>
+                  </pic:spPr>
+                </pic:pic>
+              </a:graphicData>
+            </a:graphic>
+          </wp:inline>
+        </w:drawing>
+      </w:r>
+    </w:p>
+    <w:p>
+      <w:r>
+        <w:t>Output.</w:t>
+      </w:r>
+    </w:p>
+    <w:p>
+      <w:r>
+        <w:rPr>
+          <w:noProof/>
+        </w:rPr>
+        <w:drawing>
+          <wp:inline distT="0" distB="0" distL="0" distR="0" wp14:anchorId="6677CAED" wp14:editId="1CB0D080">
+            <wp:extent cx="5096586" cy="2362530"/>
+            <wp:effectExtent l="0" t="0" r="0" b="0"/>
+            <wp:docPr id="1883608715" name="Picture 1"/>
+            <wp:cNvGraphicFramePr>
+              <a:graphicFrameLocks xmlns:a="http://schemas.openxmlformats.org/drawingml/2006/main" noChangeAspect="1"/>
+            </wp:cNvGraphicFramePr>
+            <a:graphic xmlns:a="http://schemas.openxmlformats.org/drawingml/2006/main">
+              <a:graphicData uri="http://schemas.openxmlformats.org/drawingml/2006/picture">
+                <pic:pic xmlns:pic="http://schemas.openxmlformats.org/drawingml/2006/picture">
+                  <pic:nvPicPr>
+                    <pic:cNvPr id="1883608715" name=""/>
+                    <pic:cNvPicPr/>
+                  </pic:nvPicPr>
+                  <pic:blipFill>
+                    <a:blip r:embed="rId52"/>
+                    <a:stretch>
+                      <a:fillRect/>
+                    </a:stretch>
+                  </pic:blipFill>
+                  <pic:spPr>
+                    <a:xfrm>
+                      <a:off x="0" y="0"/>
+                      <a:ext cx="5096586" cy="2362530"/>
+                    </a:xfrm>
+                    <a:prstGeom prst="rect">
+                      <a:avLst/>
+                    </a:prstGeom>
+                  </pic:spPr>
+                </pic:pic>
+              </a:graphicData>
+            </a:graphic>
+          </wp:inline>
+        </w:drawing>
+      </w:r>
+    </w:p>
+    <w:p/>
+    <w:p/>
+    <w:p/>
+    <w:p/>
+    <w:p>
+      <w:r>
+        <w:lastRenderedPageBreak/>
+        <w:t>Q23.</w:t>
+      </w:r>
+    </w:p>
+    <w:p>
+      <w:r>
+        <w:rPr>
+          <w:noProof/>
+        </w:rPr>
+        <w:drawing>
+          <wp:inline distT="0" distB="0" distL="0" distR="0" wp14:anchorId="79BB901C" wp14:editId="2B948094">
+            <wp:extent cx="5906324" cy="4220164"/>
+            <wp:effectExtent l="0" t="0" r="0" b="9525"/>
+            <wp:docPr id="2040058569" name="Picture 1"/>
+            <wp:cNvGraphicFramePr>
+              <a:graphicFrameLocks xmlns:a="http://schemas.openxmlformats.org/drawingml/2006/main" noChangeAspect="1"/>
+            </wp:cNvGraphicFramePr>
+            <a:graphic xmlns:a="http://schemas.openxmlformats.org/drawingml/2006/main">
+              <a:graphicData uri="http://schemas.openxmlformats.org/drawingml/2006/picture">
+                <pic:pic xmlns:pic="http://schemas.openxmlformats.org/drawingml/2006/picture">
+                  <pic:nvPicPr>
+                    <pic:cNvPr id="2040058569" name=""/>
+                    <pic:cNvPicPr/>
+                  </pic:nvPicPr>
+                  <pic:blipFill>
+                    <a:blip r:embed="rId53"/>
+                    <a:stretch>
+                      <a:fillRect/>
+                    </a:stretch>
+                  </pic:blipFill>
+                  <pic:spPr>
+                    <a:xfrm>
+                      <a:off x="0" y="0"/>
+                      <a:ext cx="5906324" cy="4220164"/>
+                    </a:xfrm>
+                    <a:prstGeom prst="rect">
+                      <a:avLst/>
+                    </a:prstGeom>
+                  </pic:spPr>
+                </pic:pic>
+              </a:graphicData>
+            </a:graphic>
+          </wp:inline>
+        </w:drawing>
+      </w:r>
+    </w:p>
+    <w:p>
+      <w:r>
+        <w:t>Output.</w:t>
+      </w:r>
+    </w:p>
+    <w:p>
+      <w:r>
+        <w:rPr>
+          <w:noProof/>
+        </w:rPr>
+        <w:drawing>
+          <wp:inline distT="0" distB="0" distL="0" distR="0" wp14:anchorId="3024AD70" wp14:editId="0A1E741D">
+            <wp:extent cx="4772691" cy="2734057"/>
+            <wp:effectExtent l="0" t="0" r="0" b="9525"/>
+            <wp:docPr id="434789308" name="Picture 1"/>
+            <wp:cNvGraphicFramePr>
+              <a:graphicFrameLocks xmlns:a="http://schemas.openxmlformats.org/drawingml/2006/main" noChangeAspect="1"/>
+            </wp:cNvGraphicFramePr>
+            <a:graphic xmlns:a="http://schemas.openxmlformats.org/drawingml/2006/main">
+              <a:graphicData uri="http://schemas.openxmlformats.org/drawingml/2006/picture">
+                <pic:pic xmlns:pic="http://schemas.openxmlformats.org/drawingml/2006/picture">
+                  <pic:nvPicPr>
+                    <pic:cNvPr id="434789308" name=""/>
+                    <pic:cNvPicPr/>
+                  </pic:nvPicPr>
+                  <pic:blipFill>
+                    <a:blip r:embed="rId54"/>
+                    <a:stretch>
+                      <a:fillRect/>
+                    </a:stretch>
+                  </pic:blipFill>
+                  <pic:spPr>
+                    <a:xfrm>
+                      <a:off x="0" y="0"/>
+                      <a:ext cx="4772691" cy="2734057"/>
+                    </a:xfrm>
+                    <a:prstGeom prst="rect">
+                      <a:avLst/>
+                    </a:prstGeom>
+                  </pic:spPr>
+                </pic:pic>
+              </a:graphicData>
+            </a:graphic>
+          </wp:inline>
+        </w:drawing>
+      </w:r>
+    </w:p>
+    <w:p/>
+    <w:p>
+      <w:r>
+        <w:lastRenderedPageBreak/>
+        <w:t>Q24.</w:t>
+      </w:r>
+    </w:p>
+    <w:p>
+      <w:r>
+        <w:rPr>
+          <w:noProof/>
+        </w:rPr>
+        <w:drawing>
+          <wp:inline distT="0" distB="0" distL="0" distR="0" wp14:anchorId="2B76400B" wp14:editId="7283B92A">
+            <wp:extent cx="5582429" cy="3515216"/>
+            <wp:effectExtent l="0" t="0" r="0" b="9525"/>
+            <wp:docPr id="1800870217" name="Picture 1"/>
+            <wp:cNvGraphicFramePr>
+              <a:graphicFrameLocks xmlns:a="http://schemas.openxmlformats.org/drawingml/2006/main" noChangeAspect="1"/>
+            </wp:cNvGraphicFramePr>
+            <a:graphic xmlns:a="http://schemas.openxmlformats.org/drawingml/2006/main">
+              <a:graphicData uri="http://schemas.openxmlformats.org/drawingml/2006/picture">
+                <pic:pic xmlns:pic="http://schemas.openxmlformats.org/drawingml/2006/picture">
+                  <pic:nvPicPr>
+                    <pic:cNvPr id="1800870217" name=""/>
+                    <pic:cNvPicPr/>
+                  </pic:nvPicPr>
+                  <pic:blipFill>
+                    <a:blip r:embed="rId55"/>
+                    <a:stretch>
+                      <a:fillRect/>
+                    </a:stretch>
+                  </pic:blipFill>
+                  <pic:spPr>
+                    <a:xfrm>
+                      <a:off x="0" y="0"/>
+                      <a:ext cx="5582429" cy="3515216"/>
+                    </a:xfrm>
+                    <a:prstGeom prst="rect">
+                      <a:avLst/>
+                    </a:prstGeom>
+                  </pic:spPr>
+                </pic:pic>
+              </a:graphicData>
+            </a:graphic>
+          </wp:inline>
+        </w:drawing>
+      </w:r>
+    </w:p>
+    <w:p>
+      <w:r>
+        <w:t>Output.</w:t>
+      </w:r>
+    </w:p>
+    <w:p>
+      <w:r>
+        <w:rPr>
+          <w:noProof/>
+        </w:rPr>
+        <w:drawing>
+          <wp:inline distT="0" distB="0" distL="0" distR="0" wp14:anchorId="1F2616A4" wp14:editId="133F5025">
+            <wp:extent cx="5029902" cy="2810267"/>
+            <wp:effectExtent l="0" t="0" r="0" b="9525"/>
+            <wp:docPr id="1601490773" name="Picture 1"/>
+            <wp:cNvGraphicFramePr>
+              <a:graphicFrameLocks xmlns:a="http://schemas.openxmlformats.org/drawingml/2006/main" noChangeAspect="1"/>
+            </wp:cNvGraphicFramePr>
+            <a:graphic xmlns:a="http://schemas.openxmlformats.org/drawingml/2006/main">
+              <a:graphicData uri="http://schemas.openxmlformats.org/drawingml/2006/picture">
+                <pic:pic xmlns:pic="http://schemas.openxmlformats.org/drawingml/2006/picture">
+                  <pic:nvPicPr>
+                    <pic:cNvPr id="1601490773" name=""/>
+                    <pic:cNvPicPr/>
+                  </pic:nvPicPr>
+                  <pic:blipFill>
+                    <a:blip r:embed="rId56"/>
+                    <a:stretch>
+                      <a:fillRect/>
+                    </a:stretch>
+                  </pic:blipFill>
+                  <pic:spPr>
+                    <a:xfrm>
+                      <a:off x="0" y="0"/>
+                      <a:ext cx="5029902" cy="2810267"/>
+                    </a:xfrm>
+                    <a:prstGeom prst="rect">
+                      <a:avLst/>
+                    </a:prstGeom>
+                  </pic:spPr>
+                </pic:pic>
+              </a:graphicData>
+            </a:graphic>
+          </wp:inline>
+        </w:drawing>
+      </w:r>
+    </w:p>
+    <w:p/>
+    <w:p/>
+    <w:p/>
+    <w:p>
+      <w:r>
+        <w:lastRenderedPageBreak/>
+        <w:t>Q25.</w:t>
+      </w:r>
+    </w:p>
+    <w:p>
+      <w:r>
+        <w:rPr>
+          <w:noProof/>
+        </w:rPr>
+        <w:drawing>
+          <wp:inline distT="0" distB="0" distL="0" distR="0" wp14:anchorId="09E40A1D" wp14:editId="0C64A326">
+            <wp:extent cx="5544324" cy="3972479"/>
+            <wp:effectExtent l="0" t="0" r="0" b="9525"/>
+            <wp:docPr id="543615027" name="Picture 1"/>
+            <wp:cNvGraphicFramePr>
+              <a:graphicFrameLocks xmlns:a="http://schemas.openxmlformats.org/drawingml/2006/main" noChangeAspect="1"/>
+            </wp:cNvGraphicFramePr>
+            <a:graphic xmlns:a="http://schemas.openxmlformats.org/drawingml/2006/main">
+              <a:graphicData uri="http://schemas.openxmlformats.org/drawingml/2006/picture">
+                <pic:pic xmlns:pic="http://schemas.openxmlformats.org/drawingml/2006/picture">
+                  <pic:nvPicPr>
+                    <pic:cNvPr id="543615027" name=""/>
+                    <pic:cNvPicPr/>
+                  </pic:nvPicPr>
+                  <pic:blipFill>
+                    <a:blip r:embed="rId57"/>
+                    <a:stretch>
+                      <a:fillRect/>
+                    </a:stretch>
+                  </pic:blipFill>
+                  <pic:spPr>
+                    <a:xfrm>
+                      <a:off x="0" y="0"/>
+                      <a:ext cx="5544324" cy="3972479"/>
+                    </a:xfrm>
+                    <a:prstGeom prst="rect">
+                      <a:avLst/>
+                    </a:prstGeom>
+                  </pic:spPr>
+                </pic:pic>
+              </a:graphicData>
+            </a:graphic>
+          </wp:inline>
+        </w:drawing>
+      </w:r>
+    </w:p>
+    <w:p>
+      <w:r>
+        <w:t>Output.</w:t>
+      </w:r>
+    </w:p>
+    <w:p>
+      <w:r>
+        <w:rPr>
+          <w:noProof/>
+        </w:rPr>
+        <w:drawing>
+          <wp:inline distT="0" distB="0" distL="0" distR="0" wp14:anchorId="67BCF1F1" wp14:editId="569A9EFD">
+            <wp:extent cx="4706007" cy="2819794"/>
+            <wp:effectExtent l="0" t="0" r="0" b="0"/>
+            <wp:docPr id="994455995" name="Picture 1"/>
+            <wp:cNvGraphicFramePr>
+              <a:graphicFrameLocks xmlns:a="http://schemas.openxmlformats.org/drawingml/2006/main" noChangeAspect="1"/>
+            </wp:cNvGraphicFramePr>
+            <a:graphic xmlns:a="http://schemas.openxmlformats.org/drawingml/2006/main">
+              <a:graphicData uri="http://schemas.openxmlformats.org/drawingml/2006/picture">
+                <pic:pic xmlns:pic="http://schemas.openxmlformats.org/drawingml/2006/picture">
+                  <pic:nvPicPr>
+                    <pic:cNvPr id="994455995" name=""/>
+                    <pic:cNvPicPr/>
+                  </pic:nvPicPr>
+                  <pic:blipFill>
+                    <a:blip r:embed="rId58"/>
+                    <a:stretch>
+                      <a:fillRect/>
+                    </a:stretch>
+                  </pic:blipFill>
+                  <pic:spPr>
+                    <a:xfrm>
+                      <a:off x="0" y="0"/>
+                      <a:ext cx="4706007" cy="2819794"/>
+                    </a:xfrm>
+                    <a:prstGeom prst="rect">
+                      <a:avLst/>
+                    </a:prstGeom>
+                  </pic:spPr>
+                </pic:pic>
+              </a:graphicData>
+            </a:graphic>
+          </wp:inline>
+        </w:drawing>
+      </w:r>
+    </w:p>
+    <w:p/>
+    <w:p/>
+    <w:p>
+      <w:r>
+        <w:lastRenderedPageBreak/>
+        <w:t>Q26.</w:t>
+      </w:r>
+    </w:p>
+    <w:p>
+      <w:r>
+        <w:rPr>
+          <w:noProof/>
+        </w:rPr>
+        <w:drawing>
+          <wp:inline distT="0" distB="0" distL="0" distR="0" wp14:anchorId="5D69E933" wp14:editId="432443CF">
+            <wp:extent cx="3553321" cy="3362794"/>
+            <wp:effectExtent l="0" t="0" r="9525" b="9525"/>
+            <wp:docPr id="1169630151" name="Picture 1"/>
+            <wp:cNvGraphicFramePr>
+              <a:graphicFrameLocks xmlns:a="http://schemas.openxmlformats.org/drawingml/2006/main" noChangeAspect="1"/>
+            </wp:cNvGraphicFramePr>
+            <a:graphic xmlns:a="http://schemas.openxmlformats.org/drawingml/2006/main">
+              <a:graphicData uri="http://schemas.openxmlformats.org/drawingml/2006/picture">
+                <pic:pic xmlns:pic="http://schemas.openxmlformats.org/drawingml/2006/picture">
+                  <pic:nvPicPr>
+                    <pic:cNvPr id="1169630151" name=""/>
+                    <pic:cNvPicPr/>
+                  </pic:nvPicPr>
+                  <pic:blipFill>
+                    <a:blip r:embed="rId59"/>
+                    <a:stretch>
+                      <a:fillRect/>
+                    </a:stretch>
+                  </pic:blipFill>
+                  <pic:spPr>
+                    <a:xfrm>
+                      <a:off x="0" y="0"/>
+                      <a:ext cx="3553321" cy="3362794"/>
+                    </a:xfrm>
+                    <a:prstGeom prst="rect">
+                      <a:avLst/>
+                    </a:prstGeom>
+                  </pic:spPr>
+                </pic:pic>
+              </a:graphicData>
+            </a:graphic>
+          </wp:inline>
+        </w:drawing>
+      </w:r>
+    </w:p>
+    <w:p>
+      <w:r>
+        <w:t>Output.</w:t>
+      </w:r>
+    </w:p>
+    <w:p>
+      <w:r>
+        <w:rPr>
+          <w:noProof/>
+        </w:rPr>
+        <w:drawing>
+          <wp:inline distT="0" distB="0" distL="0" distR="0" wp14:anchorId="146A5012" wp14:editId="4D8E74BE">
+            <wp:extent cx="1914792" cy="1609950"/>
+            <wp:effectExtent l="0" t="0" r="0" b="9525"/>
+            <wp:docPr id="1270908055" name="Picture 1"/>
+            <wp:cNvGraphicFramePr>
+              <a:graphicFrameLocks xmlns:a="http://schemas.openxmlformats.org/drawingml/2006/main" noChangeAspect="1"/>
+            </wp:cNvGraphicFramePr>
+            <a:graphic xmlns:a="http://schemas.openxmlformats.org/drawingml/2006/main">
+              <a:graphicData uri="http://schemas.openxmlformats.org/drawingml/2006/picture">
+                <pic:pic xmlns:pic="http://schemas.openxmlformats.org/drawingml/2006/picture">
+                  <pic:nvPicPr>
+                    <pic:cNvPr id="1270908055" name=""/>
+                    <pic:cNvPicPr/>
+                  </pic:nvPicPr>
+                  <pic:blipFill>
+                    <a:blip r:embed="rId60"/>
+                    <a:stretch>
+                      <a:fillRect/>
+                    </a:stretch>
+                  </pic:blipFill>
+                  <pic:spPr>
+                    <a:xfrm>
+                      <a:off x="0" y="0"/>
+                      <a:ext cx="1914792" cy="1609950"/>
+                    </a:xfrm>
+                    <a:prstGeom prst="rect">
+                      <a:avLst/>
+                    </a:prstGeom>
+                  </pic:spPr>
+                </pic:pic>
+              </a:graphicData>
+            </a:graphic>
+          </wp:inline>
+        </w:drawing>
+      </w:r>
+    </w:p>
+    <w:p/>
+    <w:p/>
+    <w:p>
+      <w:r>
+        <w:t>Explain .</w:t>
+      </w:r>
+    </w:p>
+    <w:p/>
+    <w:p>
+      <w:pPr>
+        <w:spacing w:after="0"/>
+      </w:pPr>
+      <w:r>
+        <w:t>System.out.println("x: " + x); (Line 1)</w:t>
+      </w:r>
+    </w:p>
+    <w:p>
+      <w:pPr>
+        <w:numPr>
+          <w:ilvl w:val="0"/>
+          <w:numId w:val="3"/>
+        </w:numPr>
+        <w:spacing w:after="0"/>
+      </w:pPr>
+      <w:r>
+        <w:t>In the main method, x is initialized to 100.</w:t>
+      </w:r>
+    </w:p>
+    <w:p>
+      <w:pPr>
+        <w:numPr>
+          <w:ilvl w:val="0"/>
+          <w:numId w:val="3"/>
+        </w:numPr>
+        <w:spacing w:after="0"/>
+      </w:pPr>
+      <w:r>
+        <w:t>Output</w:t>
+      </w:r>
+      <w:r>
+        <w:rPr>
+          <w:b/>
+          <w:bCs/>
+        </w:rPr>
+        <w:t>:</w:t>
+      </w:r>
+      <w:r>
+        <w:t xml:space="preserve"> x: 100</w:t>
+      </w:r>
+    </w:p>
+    <w:p>
+      <w:pPr>
+        <w:spacing w:after="0"/>
+      </w:pPr>
+      <w:r>
+        <w:t>increment(x); (Line 2)</w:t>
+      </w:r>
+    </w:p>
+    <w:p>
+      <w:pPr>
+        <w:numPr>
+          <w:ilvl w:val="0"/>
+          <w:numId w:val="4"/>
+        </w:numPr>
+        <w:spacing w:after="0"/>
+      </w:pPr>
+      <w:r>
+        <w:t>The value of x (100) is passed into the increment method.</w:t>
+      </w:r>
+    </w:p>
+    <w:p>
+      <w:pPr>
+        <w:numPr>
+          <w:ilvl w:val="0"/>
+          <w:numId w:val="4"/>
+        </w:numPr>
+        <w:spacing w:after="0"/>
+      </w:pPr>
+      <w:r>
+        <w:lastRenderedPageBreak/>
+        <w:t>Inside increment, x++ increases the local variable x to 101.</w:t>
+      </w:r>
+    </w:p>
+    <w:p>
+      <w:pPr>
+        <w:numPr>
+          <w:ilvl w:val="0"/>
+          <w:numId w:val="4"/>
+        </w:numPr>
+        <w:spacing w:after="0"/>
+      </w:pPr>
+      <w:r>
+        <w:t>System.out.println("x: " + x); inside the method executes.</w:t>
+      </w:r>
+    </w:p>
+    <w:p>
+      <w:pPr>
+        <w:numPr>
+          <w:ilvl w:val="0"/>
+          <w:numId w:val="4"/>
+        </w:numPr>
+        <w:spacing w:after="0"/>
+      </w:pPr>
+      <w:r>
+        <w:t>Output</w:t>
+      </w:r>
+      <w:r>
+        <w:rPr>
+          <w:b/>
+          <w:bCs/>
+        </w:rPr>
+        <w:t>:</w:t>
+      </w:r>
+      <w:r>
+        <w:t xml:space="preserve"> x: 101</w:t>
+      </w:r>
+    </w:p>
+    <w:p>
+      <w:pPr>
+        <w:spacing w:after="0"/>
+      </w:pPr>
+      <w:r>
+        <w:t xml:space="preserve"> System.out.println("x: " + x); (Line 3)</w:t>
+      </w:r>
+    </w:p>
+    <w:p>
+      <w:pPr>
+        <w:numPr>
+          <w:ilvl w:val="0"/>
+          <w:numId w:val="5"/>
+        </w:numPr>
+        <w:spacing w:after="0"/>
+      </w:pPr>
+      <w:r>
+        <w:t>In Java, primitive data types are passed by value. Changes made to x inside the increment method do not affect the original variable x in the main method.</w:t>
+      </w:r>
+    </w:p>
+    <w:p>
+      <w:pPr>
+        <w:numPr>
+          <w:ilvl w:val="0"/>
+          <w:numId w:val="5"/>
+        </w:numPr>
+        <w:spacing w:after="0"/>
+      </w:pPr>
+      <w:r>
+        <w:t>Therefore, x in main remains 100.</w:t>
+      </w:r>
+    </w:p>
+    <w:p>
+      <w:pPr>
+        <w:numPr>
+          <w:ilvl w:val="0"/>
+          <w:numId w:val="5"/>
+        </w:numPr>
+        <w:spacing w:after="0"/>
+      </w:pPr>
+      <w:r>
+        <w:t>Output</w:t>
+      </w:r>
+      <w:r>
+        <w:rPr>
+          <w:b/>
+          <w:bCs/>
+        </w:rPr>
+        <w:t>:</w:t>
+      </w:r>
+      <w:r>
+        <w:t xml:space="preserve"> x: 100</w:t>
+      </w:r>
+    </w:p>
+    <w:p>
+      <w:pPr>
+        <w:spacing w:after="0"/>
+      </w:pPr>
+      <w:r>
+        <w:t xml:space="preserve"> x = increment(x); (Line 4)</w:t>
+      </w:r>
+    </w:p>
+    <w:p>
+      <w:pPr>
+        <w:numPr>
+          <w:ilvl w:val="0"/>
+          <w:numId w:val="6"/>
+        </w:numPr>
+        <w:spacing w:after="0"/>
+      </w:pPr>
+      <w:r>
+        <w:t>The increment(x) method is called again, printing x: 101 from inside the method. (Output</w:t>
+      </w:r>
+      <w:r>
+        <w:rPr>
+          <w:b/>
+          <w:bCs/>
+        </w:rPr>
+        <w:t>:</w:t>
+      </w:r>
+      <w:r>
+        <w:t xml:space="preserve"> x: 101)</w:t>
+      </w:r>
+    </w:p>
+    <w:p>
+      <w:pPr>
+        <w:numPr>
+          <w:ilvl w:val="0"/>
+          <w:numId w:val="6"/>
+        </w:numPr>
+        <w:spacing w:after="0"/>
+      </w:pPr>
+      <w:r>
+        <w:t>This time, the returned value (101) is reassigned back to x in the main method (x = ...).</w:t>
+      </w:r>
+    </w:p>
+    <w:p>
+      <w:pPr>
+        <w:spacing w:after="0"/>
+      </w:pPr>
+      <w:r>
+        <w:t xml:space="preserve">  System.out.println("x: " + x); (Line 5)</w:t>
+      </w:r>
+    </w:p>
+    <w:p>
+      <w:pPr>
+        <w:numPr>
+          <w:ilvl w:val="0"/>
+          <w:numId w:val="7"/>
+        </w:numPr>
+        <w:spacing w:after="0"/>
+      </w:pPr>
+      <w:r>
+        <w:t>Now x in main has been updated to 101.</w:t>
+      </w:r>
+    </w:p>
+    <w:p>
+      <w:pPr>
+        <w:numPr>
+          <w:ilvl w:val="0"/>
+          <w:numId w:val="7"/>
+        </w:numPr>
+        <w:spacing w:after="0"/>
+      </w:pPr>
+      <w:r>
+        <w:t>Output</w:t>
+      </w:r>
+      <w:r>
+        <w:rPr>
+          <w:b/>
+          <w:bCs/>
+        </w:rPr>
+        <w:t>:</w:t>
+      </w:r>
+      <w:r>
+        <w:t xml:space="preserve"> x: 101</w:t>
+      </w:r>
+    </w:p>
+    <w:p/>
+    <w:p/>
+    <w:p/>
+    <w:p/>
+    <w:p/>
+    <w:p/>
+    <w:p/>
+    <w:p/>
+    <w:p/>
+    <w:p/>
+    <w:p/>
+    <w:p/>
+    <w:p/>
+    <w:p/>
+    <w:p/>
+    <w:p>
+      <w:r>
+        <w:lastRenderedPageBreak/>
+        <w:t>Q27.</w:t>
+      </w:r>
+    </w:p>
+    <w:p>
+      <w:r>
+        <w:rPr>
+          <w:noProof/>
+        </w:rPr>
+        <w:drawing>
+          <wp:inline distT="0" distB="0" distL="0" distR="0" wp14:anchorId="3A733E0C" wp14:editId="76082657">
+            <wp:extent cx="4371975" cy="4553536"/>
+            <wp:effectExtent l="0" t="0" r="0" b="0"/>
+            <wp:docPr id="1507125569" name="Picture 1"/>
+            <wp:cNvGraphicFramePr>
+              <a:graphicFrameLocks xmlns:a="http://schemas.openxmlformats.org/drawingml/2006/main" noChangeAspect="1"/>
+            </wp:cNvGraphicFramePr>
+            <a:graphic xmlns:a="http://schemas.openxmlformats.org/drawingml/2006/main">
+              <a:graphicData uri="http://schemas.openxmlformats.org/drawingml/2006/picture">
+                <pic:pic xmlns:pic="http://schemas.openxmlformats.org/drawingml/2006/picture">
+                  <pic:nvPicPr>
+                    <pic:cNvPr id="1507125569" name=""/>
+                    <pic:cNvPicPr/>
+                  </pic:nvPicPr>
+                  <pic:blipFill>
+                    <a:blip r:embed="rId61"/>
+                    <a:stretch>
+                      <a:fillRect/>
+                    </a:stretch>
+                  </pic:blipFill>
+                  <pic:spPr>
+                    <a:xfrm>
+                      <a:off x="0" y="0"/>
+                      <a:ext cx="4379001" cy="4560854"/>
+                    </a:xfrm>
+                    <a:prstGeom prst="rect">
+                      <a:avLst/>
+                    </a:prstGeom>
+                  </pic:spPr>
+                </pic:pic>
+              </a:graphicData>
+            </a:graphic>
+          </wp:inline>
+        </w:drawing>
+      </w:r>
+    </w:p>
+    <w:p/>
+    <w:p>
+      <w:r>
+        <w:t>Output.</w:t>
+      </w:r>
+    </w:p>
+    <w:p>
+      <w:r>
+        <w:rPr>
+          <w:noProof/>
+        </w:rPr>
+        <w:drawing>
+          <wp:inline distT="0" distB="0" distL="0" distR="0" wp14:anchorId="06A384DA" wp14:editId="35BDD18C">
+            <wp:extent cx="2171700" cy="751515"/>
+            <wp:effectExtent l="0" t="0" r="0" b="0"/>
+            <wp:docPr id="2015907644" name="Picture 1"/>
+            <wp:cNvGraphicFramePr>
+              <a:graphicFrameLocks xmlns:a="http://schemas.openxmlformats.org/drawingml/2006/main" noChangeAspect="1"/>
+            </wp:cNvGraphicFramePr>
+            <a:graphic xmlns:a="http://schemas.openxmlformats.org/drawingml/2006/main">
+              <a:graphicData uri="http://schemas.openxmlformats.org/drawingml/2006/picture">
+                <pic:pic xmlns:pic="http://schemas.openxmlformats.org/drawingml/2006/picture">
+                  <pic:nvPicPr>
+                    <pic:cNvPr id="2015907644" name=""/>
+                    <pic:cNvPicPr/>
+                  </pic:nvPicPr>
+                  <pic:blipFill>
+                    <a:blip r:embed="rId62"/>
+                    <a:stretch>
+                      <a:fillRect/>
+                    </a:stretch>
+                  </pic:blipFill>
+                  <pic:spPr>
+                    <a:xfrm>
+                      <a:off x="0" y="0"/>
+                      <a:ext cx="2186710" cy="756709"/>
+                    </a:xfrm>
+                    <a:prstGeom prst="rect">
+                      <a:avLst/>
+                    </a:prstGeom>
+                  </pic:spPr>
+                </pic:pic>
+              </a:graphicData>
+            </a:graphic>
+          </wp:inline>
+        </w:drawing>
+      </w:r>
+    </w:p>
+    <w:p>
+      <w:r>
+        <w:rPr>
+          <w:noProof/>
+        </w:rPr>
+        <w:drawing>
+          <wp:inline distT="0" distB="0" distL="0" distR="0" wp14:anchorId="69E88A83" wp14:editId="1916BB67">
+            <wp:extent cx="3315163" cy="895475"/>
+            <wp:effectExtent l="0" t="0" r="0" b="0"/>
+            <wp:docPr id="635930581" name="Picture 1"/>
+            <wp:cNvGraphicFramePr>
+              <a:graphicFrameLocks xmlns:a="http://schemas.openxmlformats.org/drawingml/2006/main" noChangeAspect="1"/>
+            </wp:cNvGraphicFramePr>
+            <a:graphic xmlns:a="http://schemas.openxmlformats.org/drawingml/2006/main">
+              <a:graphicData uri="http://schemas.openxmlformats.org/drawingml/2006/picture">
+                <pic:pic xmlns:pic="http://schemas.openxmlformats.org/drawingml/2006/picture">
+                  <pic:nvPicPr>
+                    <pic:cNvPr id="635930581" name=""/>
+                    <pic:cNvPicPr/>
+                  </pic:nvPicPr>
+                  <pic:blipFill>
+                    <a:blip r:embed="rId63"/>
+                    <a:stretch>
+                      <a:fillRect/>
+                    </a:stretch>
+                  </pic:blipFill>
+                  <pic:spPr>
+                    <a:xfrm>
+                      <a:off x="0" y="0"/>
+                      <a:ext cx="3315163" cy="895475"/>
+                    </a:xfrm>
+                    <a:prstGeom prst="rect">
+                      <a:avLst/>
+                    </a:prstGeom>
+                  </pic:spPr>
+                </pic:pic>
+              </a:graphicData>
+            </a:graphic>
+          </wp:inline>
+        </w:drawing>
+      </w:r>
+    </w:p>
+    <w:p/>
+    <w:p/>
+    <w:p>
+      <w:r>
+        <w:lastRenderedPageBreak/>
+        <w:t>Q28.</w:t>
+      </w:r>
+    </w:p>
+    <w:p>
+      <w:r>
+        <w:rPr>
+          <w:noProof/>
+        </w:rPr>
+        <w:drawing>
+          <wp:inline distT="0" distB="0" distL="0" distR="0" wp14:anchorId="2ED5A5CF" wp14:editId="5546CE64">
+            <wp:extent cx="4544059" cy="3477110"/>
+            <wp:effectExtent l="0" t="0" r="9525" b="9525"/>
+            <wp:docPr id="767083363" name="Picture 1"/>
+            <wp:cNvGraphicFramePr>
+              <a:graphicFrameLocks xmlns:a="http://schemas.openxmlformats.org/drawingml/2006/main" noChangeAspect="1"/>
+            </wp:cNvGraphicFramePr>
+            <a:graphic xmlns:a="http://schemas.openxmlformats.org/drawingml/2006/main">
+              <a:graphicData uri="http://schemas.openxmlformats.org/drawingml/2006/picture">
+                <pic:pic xmlns:pic="http://schemas.openxmlformats.org/drawingml/2006/picture">
+                  <pic:nvPicPr>
+                    <pic:cNvPr id="767083363" name=""/>
+                    <pic:cNvPicPr/>
+                  </pic:nvPicPr>
+                  <pic:blipFill>
+                    <a:blip r:embed="rId64"/>
+                    <a:stretch>
+                      <a:fillRect/>
+                    </a:stretch>
+                  </pic:blipFill>
+                  <pic:spPr>
+                    <a:xfrm>
+                      <a:off x="0" y="0"/>
+                      <a:ext cx="4544059" cy="3477110"/>
+                    </a:xfrm>
+                    <a:prstGeom prst="rect">
+                      <a:avLst/>
+                    </a:prstGeom>
+                  </pic:spPr>
+                </pic:pic>
+              </a:graphicData>
+            </a:graphic>
+          </wp:inline>
+        </w:drawing>
+      </w:r>
+    </w:p>
+    <w:p>
+      <w:pPr>
+        <w:rPr>
+          <w:b/>
+          <w:bCs/>
+          <w:sz w:val="36"/>
+          <w:szCs w:val="36"/>
+        </w:rPr>
+      </w:pPr>
+      <w:r>
+        <w:rPr>
+          <w:b/>
+          <w:bCs/>
+          <w:sz w:val="36"/>
+          <w:szCs w:val="36"/>
+        </w:rPr>
+        <w:t>Answers</w:t>
+      </w:r>
+    </w:p>
+    <w:p>
+      <w:pPr>
+        <w:rPr>
+          <w:b/>
+          <w:bCs/>
+          <w:sz w:val="36"/>
+          <w:szCs w:val="36"/>
+        </w:rPr>
+      </w:pPr>
+      <w:r>
+        <w:rPr>
+          <w:b/>
+          <w:bCs/>
+          <w:sz w:val="36"/>
+          <w:szCs w:val="36"/>
+        </w:rPr>
+        <w:t>B,C,D,G</w:t>
+      </w:r>
+    </w:p>
+    <w:p>
+      <w:pPr>
+        <w:rPr>
+          <w:b/>
+          <w:bCs/>
+        </w:rPr>
+      </w:pPr>
+    </w:p>
+    <w:p>
+      <w:pPr>
+        <w:rPr>
+          <w:b/>
+          <w:bCs/>
+        </w:rPr>
+      </w:pPr>
+    </w:p>
+    <w:p>
+      <w:pPr>
+        <w:rPr>
+          <w:b/>
+          <w:bCs/>
+        </w:rPr>
+      </w:pPr>
+    </w:p>
+    <w:p>
+      <w:pPr>
+        <w:rPr>
+          <w:b/>
+          <w:bCs/>
+        </w:rPr>
+      </w:pPr>
+    </w:p>
+    <w:p>
+      <w:pPr>
+        <w:rPr>
+          <w:b/>
+          <w:bCs/>
+        </w:rPr>
+      </w:pPr>
+    </w:p>
+    <w:p>
+      <w:pPr>
+        <w:rPr>
+          <w:b/>
+          <w:bCs/>
+        </w:rPr>
+      </w:pPr>
+    </w:p>
+    <w:p>
+      <w:pPr>
+        <w:rPr>
+          <w:b/>
+          <w:bCs/>
+        </w:rPr>
+      </w:pPr>
+    </w:p>
+    <w:p>
+      <w:pPr>
+        <w:rPr>
+          <w:b/>
+          <w:bCs/>
+        </w:rPr>
+      </w:pPr>
+    </w:p>
+    <w:p>
+      <w:pPr>
+        <w:rPr>
+          <w:b/>
+          <w:bCs/>
+        </w:rPr>
+      </w:pPr>
+    </w:p>
+    <w:p>
+      <w:pPr>
+        <w:rPr>
+          <w:b/>
+          <w:bCs/>
+        </w:rPr>
+      </w:pPr>
+    </w:p>
+    <w:p>
+      <w:pPr>
+        <w:rPr>
+          <w:b/>
+          <w:bCs/>
+        </w:rPr>
+      </w:pPr>
+    </w:p>
+    <w:p>
+      <w:r>
+        <w:lastRenderedPageBreak/>
+        <w:t>Q29.</w:t>
+      </w:r>
+    </w:p>
+    <w:p>
+      <w:r>
+        <w:rPr>
+          <w:noProof/>
+        </w:rPr>
+        <w:drawing>
+          <wp:inline distT="0" distB="0" distL="0" distR="0" wp14:anchorId="70F41486" wp14:editId="525D3EE1">
+            <wp:extent cx="4514850" cy="4842012"/>
+            <wp:effectExtent l="0" t="0" r="0" b="0"/>
+            <wp:docPr id="335180675" name="Picture 1"/>
+            <wp:cNvGraphicFramePr>
+              <a:graphicFrameLocks xmlns:a="http://schemas.openxmlformats.org/drawingml/2006/main" noChangeAspect="1"/>
+            </wp:cNvGraphicFramePr>
+            <a:graphic xmlns:a="http://schemas.openxmlformats.org/drawingml/2006/main">
+              <a:graphicData uri="http://schemas.openxmlformats.org/drawingml/2006/picture">
+                <pic:pic xmlns:pic="http://schemas.openxmlformats.org/drawingml/2006/picture">
+                  <pic:nvPicPr>
+                    <pic:cNvPr id="335180675" name=""/>
+                    <pic:cNvPicPr/>
+                  </pic:nvPicPr>
+                  <pic:blipFill>
+                    <a:blip r:embed="rId65"/>
+                    <a:stretch>
+                      <a:fillRect/>
+                    </a:stretch>
+                  </pic:blipFill>
+                  <pic:spPr>
+                    <a:xfrm>
+                      <a:off x="0" y="0"/>
+                      <a:ext cx="4518446" cy="4845869"/>
+                    </a:xfrm>
+                    <a:prstGeom prst="rect">
+                      <a:avLst/>
+                    </a:prstGeom>
+                  </pic:spPr>
+                </pic:pic>
+              </a:graphicData>
+            </a:graphic>
+          </wp:inline>
+        </w:drawing>
+      </w:r>
+    </w:p>
+    <w:p>
+      <w:r>
+        <w:t>Output.</w:t>
+      </w:r>
+    </w:p>
+    <w:p>
+      <w:r>
+        <w:rPr>
+          <w:noProof/>
+        </w:rPr>
+        <w:drawing>
+          <wp:inline distT="0" distB="0" distL="0" distR="0" wp14:anchorId="1F3DBE9E" wp14:editId="79FC8217">
+            <wp:extent cx="2952750" cy="1999846"/>
+            <wp:effectExtent l="0" t="0" r="0" b="635"/>
+            <wp:docPr id="49619409" name="Picture 1"/>
+            <wp:cNvGraphicFramePr>
+              <a:graphicFrameLocks xmlns:a="http://schemas.openxmlformats.org/drawingml/2006/main" noChangeAspect="1"/>
+            </wp:cNvGraphicFramePr>
+            <a:graphic xmlns:a="http://schemas.openxmlformats.org/drawingml/2006/main">
+              <a:graphicData uri="http://schemas.openxmlformats.org/drawingml/2006/picture">
+                <pic:pic xmlns:pic="http://schemas.openxmlformats.org/drawingml/2006/picture">
+                  <pic:nvPicPr>
+                    <pic:cNvPr id="49619409" name=""/>
+                    <pic:cNvPicPr/>
+                  </pic:nvPicPr>
+                  <pic:blipFill>
+                    <a:blip r:embed="rId66"/>
+                    <a:stretch>
+                      <a:fillRect/>
+                    </a:stretch>
+                  </pic:blipFill>
+                  <pic:spPr>
+                    <a:xfrm>
+                      <a:off x="0" y="0"/>
+                      <a:ext cx="2958795" cy="2003940"/>
+                    </a:xfrm>
+                    <a:prstGeom prst="rect">
+                      <a:avLst/>
+                    </a:prstGeom>
+                  </pic:spPr>
+                </pic:pic>
+              </a:graphicData>
+            </a:graphic>
+          </wp:inline>
+        </w:drawing>
+      </w:r>
+    </w:p>
+    <w:p/>
+    <w:p>
+      <w:r>
+        <w:lastRenderedPageBreak/>
+        <w:t>Q30.</w:t>
+      </w:r>
+    </w:p>
+    <w:p>
+      <w:r>
+        <w:rPr>
+          <w:noProof/>
+        </w:rPr>
+        <w:drawing>
+          <wp:inline distT="0" distB="0" distL="0" distR="0" wp14:anchorId="34C0D9A3" wp14:editId="1B114E7F">
+            <wp:extent cx="4714875" cy="4700771"/>
+            <wp:effectExtent l="0" t="0" r="0" b="5080"/>
+            <wp:docPr id="692486604" name="Picture 1"/>
+            <wp:cNvGraphicFramePr>
+              <a:graphicFrameLocks xmlns:a="http://schemas.openxmlformats.org/drawingml/2006/main" noChangeAspect="1"/>
+            </wp:cNvGraphicFramePr>
+            <a:graphic xmlns:a="http://schemas.openxmlformats.org/drawingml/2006/main">
+              <a:graphicData uri="http://schemas.openxmlformats.org/drawingml/2006/picture">
+                <pic:pic xmlns:pic="http://schemas.openxmlformats.org/drawingml/2006/picture">
+                  <pic:nvPicPr>
+                    <pic:cNvPr id="692486604" name=""/>
+                    <pic:cNvPicPr/>
+                  </pic:nvPicPr>
+                  <pic:blipFill>
+                    <a:blip r:embed="rId67"/>
+                    <a:stretch>
+                      <a:fillRect/>
+                    </a:stretch>
+                  </pic:blipFill>
+                  <pic:spPr>
+                    <a:xfrm>
+                      <a:off x="0" y="0"/>
+                      <a:ext cx="4717893" cy="4703780"/>
+                    </a:xfrm>
+                    <a:prstGeom prst="rect">
+                      <a:avLst/>
+                    </a:prstGeom>
+                  </pic:spPr>
+                </pic:pic>
+              </a:graphicData>
+            </a:graphic>
+          </wp:inline>
+        </w:drawing>
+      </w:r>
+    </w:p>
+    <w:p>
+      <w:r>
+        <w:t>Output.</w:t>
+      </w:r>
+    </w:p>
+    <w:p>
+      <w:r>
+        <w:rPr>
+          <w:noProof/>
+        </w:rPr>
+        <w:drawing>
+          <wp:inline distT="0" distB="0" distL="0" distR="0" wp14:anchorId="75C807EA" wp14:editId="5DF02766">
+            <wp:extent cx="2705100" cy="1919544"/>
+            <wp:effectExtent l="0" t="0" r="0" b="5080"/>
+            <wp:docPr id="1965285571" name="Picture 1"/>
+            <wp:cNvGraphicFramePr>
+              <a:graphicFrameLocks xmlns:a="http://schemas.openxmlformats.org/drawingml/2006/main" noChangeAspect="1"/>
+            </wp:cNvGraphicFramePr>
+            <a:graphic xmlns:a="http://schemas.openxmlformats.org/drawingml/2006/main">
+              <a:graphicData uri="http://schemas.openxmlformats.org/drawingml/2006/picture">
+                <pic:pic xmlns:pic="http://schemas.openxmlformats.org/drawingml/2006/picture">
+                  <pic:nvPicPr>
+                    <pic:cNvPr id="1965285571" name=""/>
+                    <pic:cNvPicPr/>
+                  </pic:nvPicPr>
+                  <pic:blipFill>
+                    <a:blip r:embed="rId68"/>
+                    <a:stretch>
+                      <a:fillRect/>
+                    </a:stretch>
+                  </pic:blipFill>
+                  <pic:spPr>
+                    <a:xfrm>
+                      <a:off x="0" y="0"/>
+                      <a:ext cx="2708118" cy="1921686"/>
+                    </a:xfrm>
+                    <a:prstGeom prst="rect">
+                      <a:avLst/>
+                    </a:prstGeom>
+                  </pic:spPr>
+                </pic:pic>
+              </a:graphicData>
+            </a:graphic>
+          </wp:inline>
+        </w:drawing>
+      </w:r>
+    </w:p>
+    <w:p/>
+    <w:p/>
+    <w:p>
+      <w:r>
+        <w:lastRenderedPageBreak/>
+        <w:t>Q31.</w:t>
+      </w:r>
+    </w:p>
+    <w:p>
+      <w:r>
+        <w:rPr>
+          <w:noProof/>
+        </w:rPr>
+        <w:drawing>
+          <wp:inline distT="0" distB="0" distL="0" distR="0" wp14:anchorId="0824DCE8" wp14:editId="093B5466">
+            <wp:extent cx="4963218" cy="3219899"/>
+            <wp:effectExtent l="0" t="0" r="8890" b="0"/>
+            <wp:docPr id="1665637682" name="Picture 1"/>
+            <wp:cNvGraphicFramePr>
+              <a:graphicFrameLocks xmlns:a="http://schemas.openxmlformats.org/drawingml/2006/main" noChangeAspect="1"/>
+            </wp:cNvGraphicFramePr>
+            <a:graphic xmlns:a="http://schemas.openxmlformats.org/drawingml/2006/main">
+              <a:graphicData uri="http://schemas.openxmlformats.org/drawingml/2006/picture">
+                <pic:pic xmlns:pic="http://schemas.openxmlformats.org/drawingml/2006/picture">
+                  <pic:nvPicPr>
+                    <pic:cNvPr id="1665637682" name=""/>
+                    <pic:cNvPicPr/>
+                  </pic:nvPicPr>
+                  <pic:blipFill>
+                    <a:blip r:embed="rId69"/>
+                    <a:stretch>
+                      <a:fillRect/>
+                    </a:stretch>
+                  </pic:blipFill>
+                  <pic:spPr>
+                    <a:xfrm>
+                      <a:off x="0" y="0"/>
+                      <a:ext cx="4963218" cy="3219899"/>
+                    </a:xfrm>
+                    <a:prstGeom prst="rect">
+                      <a:avLst/>
+                    </a:prstGeom>
+                  </pic:spPr>
+                </pic:pic>
+              </a:graphicData>
+            </a:graphic>
+          </wp:inline>
+        </w:drawing>
+      </w:r>
+    </w:p>
+    <w:p>
+      <w:r>
+        <w:t>Output.</w:t>
+      </w:r>
+    </w:p>
+    <w:p>
+      <w:r>
+        <w:rPr>
+          <w:noProof/>
+        </w:rPr>
+        <w:drawing>
+          <wp:inline distT="0" distB="0" distL="0" distR="0" wp14:anchorId="3EDA7322" wp14:editId="5D7FA722">
+            <wp:extent cx="5077534" cy="3581900"/>
+            <wp:effectExtent l="0" t="0" r="8890" b="0"/>
+            <wp:docPr id="398489644" name="Picture 1"/>
+            <wp:cNvGraphicFramePr>
+              <a:graphicFrameLocks xmlns:a="http://schemas.openxmlformats.org/drawingml/2006/main" noChangeAspect="1"/>
+            </wp:cNvGraphicFramePr>
+            <a:graphic xmlns:a="http://schemas.openxmlformats.org/drawingml/2006/main">
+              <a:graphicData uri="http://schemas.openxmlformats.org/drawingml/2006/picture">
+                <pic:pic xmlns:pic="http://schemas.openxmlformats.org/drawingml/2006/picture">
+                  <pic:nvPicPr>
+                    <pic:cNvPr id="398489644" name=""/>
+                    <pic:cNvPicPr/>
+                  </pic:nvPicPr>
+                  <pic:blipFill>
+                    <a:blip r:embed="rId70"/>
+                    <a:stretch>
+                      <a:fillRect/>
+                    </a:stretch>
+                  </pic:blipFill>
+                  <pic:spPr>
+                    <a:xfrm>
+                      <a:off x="0" y="0"/>
+                      <a:ext cx="5077534" cy="3581900"/>
+                    </a:xfrm>
+                    <a:prstGeom prst="rect">
+                      <a:avLst/>
+                    </a:prstGeom>
+                  </pic:spPr>
+                </pic:pic>
+              </a:graphicData>
+            </a:graphic>
+          </wp:inline>
+        </w:drawing>
+      </w:r>
+    </w:p>
+    <w:p/>
+    <w:p/>
+    <w:p>
+      <w:r>
+        <w:lastRenderedPageBreak/>
+        <w:t>Q32.</w:t>
+      </w:r>
+    </w:p>
+    <w:p/>
+    <w:p>
+      <w:r>
+        <w:t>Line 1 can inserted A,B,C,G</w:t>
+      </w:r>
+    </w:p>
+    <w:p>
+      <w:r>
+        <w:t>and line2 can inserted A,B,C,E,G</w:t>
+      </w:r>
+    </w:p>
+    <w:p/>
+    <w:p/>
+    <w:p>
+      <w:r>
+        <w:t>Q33.</w:t>
+      </w:r>
+    </w:p>
+    <w:p>
+      <w:r>
+        <w:t>Answers</w:t>
+      </w:r>
+    </w:p>
+    <w:p>
+      <w:r>
+        <w:t>C,D,E,F,H,K,O</w:t>
+      </w:r>
+    </w:p>
+    <w:p/>
+    <w:p/>
+    <w:p/>
+    <w:p/>
+    <w:p/>
+    <w:p/>
+    <w:p/>
+    <w:p/>
+    <w:p/>
+    <w:p/>
+    <w:p/>
+    <w:p/>
+    <w:p/>
+    <w:p/>
+    <w:p/>
+    <w:p/>
+    <w:p/>
+    <w:p>
+      <w:r>
+        <w:lastRenderedPageBreak/>
+        <w:t>Q34.</w:t>
+      </w:r>
+    </w:p>
+    <w:p>
+      <w:r>
+        <w:rPr>
+          <w:noProof/>
+        </w:rPr>
+        <w:drawing>
+          <wp:inline distT="0" distB="0" distL="0" distR="0" wp14:anchorId="3526FB4B" wp14:editId="3404A2C7">
+            <wp:extent cx="3829050" cy="4340564"/>
+            <wp:effectExtent l="0" t="0" r="0" b="3175"/>
+            <wp:docPr id="809626902" name="Picture 1"/>
+            <wp:cNvGraphicFramePr>
+              <a:graphicFrameLocks xmlns:a="http://schemas.openxmlformats.org/drawingml/2006/main" noChangeAspect="1"/>
+            </wp:cNvGraphicFramePr>
+            <a:graphic xmlns:a="http://schemas.openxmlformats.org/drawingml/2006/main">
+              <a:graphicData uri="http://schemas.openxmlformats.org/drawingml/2006/picture">
+                <pic:pic xmlns:pic="http://schemas.openxmlformats.org/drawingml/2006/picture">
+                  <pic:nvPicPr>
+                    <pic:cNvPr id="809626902" name=""/>
+                    <pic:cNvPicPr/>
+                  </pic:nvPicPr>
+                  <pic:blipFill>
+                    <a:blip r:embed="rId71"/>
+                    <a:stretch>
+                      <a:fillRect/>
+                    </a:stretch>
+                  </pic:blipFill>
+                  <pic:spPr>
+                    <a:xfrm>
+                      <a:off x="0" y="0"/>
+                      <a:ext cx="3832573" cy="4344557"/>
+                    </a:xfrm>
+                    <a:prstGeom prst="rect">
+                      <a:avLst/>
+                    </a:prstGeom>
+                  </pic:spPr>
+                </pic:pic>
+              </a:graphicData>
+            </a:graphic>
+          </wp:inline>
+        </w:drawing>
+      </w:r>
+    </w:p>
+    <w:p>
+      <w:r>
+        <w:t>Output.</w:t>
+      </w:r>
+    </w:p>
+    <w:p>
+      <w:r>
+        <w:rPr>
+          <w:noProof/>
+        </w:rPr>
+        <w:drawing>
+          <wp:inline distT="0" distB="0" distL="0" distR="0" wp14:anchorId="18FA4F14" wp14:editId="55B8745A">
+            <wp:extent cx="4258269" cy="2829320"/>
+            <wp:effectExtent l="0" t="0" r="9525" b="9525"/>
+            <wp:docPr id="759179111" name="Picture 1"/>
+            <wp:cNvGraphicFramePr>
+              <a:graphicFrameLocks xmlns:a="http://schemas.openxmlformats.org/drawingml/2006/main" noChangeAspect="1"/>
+            </wp:cNvGraphicFramePr>
+            <a:graphic xmlns:a="http://schemas.openxmlformats.org/drawingml/2006/main">
+              <a:graphicData uri="http://schemas.openxmlformats.org/drawingml/2006/picture">
+                <pic:pic xmlns:pic="http://schemas.openxmlformats.org/drawingml/2006/picture">
+                  <pic:nvPicPr>
+                    <pic:cNvPr id="759179111" name=""/>
+                    <pic:cNvPicPr/>
+                  </pic:nvPicPr>
+                  <pic:blipFill>
+                    <a:blip r:embed="rId72"/>
+                    <a:stretch>
+                      <a:fillRect/>
+                    </a:stretch>
+                  </pic:blipFill>
+                  <pic:spPr>
+                    <a:xfrm>
+                      <a:off x="0" y="0"/>
+                      <a:ext cx="4258269" cy="2829320"/>
+                    </a:xfrm>
+                    <a:prstGeom prst="rect">
+                      <a:avLst/>
+                    </a:prstGeom>
+                  </pic:spPr>
+                </pic:pic>
+              </a:graphicData>
+            </a:graphic>
+          </wp:inline>
+        </w:drawing>
+      </w:r>
+    </w:p>
+    <w:p>
+      <w:r>
+        <w:lastRenderedPageBreak/>
+        <w:t>Q35.</w:t>
+      </w:r>
+    </w:p>
+    <w:p>
+      <w:r>
+        <w:rPr>
+          <w:noProof/>
+        </w:rPr>
+        <w:drawing>
+          <wp:inline distT="0" distB="0" distL="0" distR="0" wp14:anchorId="1AE104D9" wp14:editId="4DA44EC8">
+            <wp:extent cx="5943600" cy="2847975"/>
+            <wp:effectExtent l="0" t="0" r="0" b="9525"/>
+            <wp:docPr id="2101616310" name="Picture 1"/>
+            <wp:cNvGraphicFramePr>
+              <a:graphicFrameLocks xmlns:a="http://schemas.openxmlformats.org/drawingml/2006/main" noChangeAspect="1"/>
+            </wp:cNvGraphicFramePr>
+            <a:graphic xmlns:a="http://schemas.openxmlformats.org/drawingml/2006/main">
+              <a:graphicData uri="http://schemas.openxmlformats.org/drawingml/2006/picture">
+                <pic:pic xmlns:pic="http://schemas.openxmlformats.org/drawingml/2006/picture">
+                  <pic:nvPicPr>
+                    <pic:cNvPr id="2101616310" name=""/>
+                    <pic:cNvPicPr/>
+                  </pic:nvPicPr>
+                  <pic:blipFill>
+                    <a:blip r:embed="rId73"/>
+                    <a:stretch>
+                      <a:fillRect/>
+                    </a:stretch>
+                  </pic:blipFill>
+                  <pic:spPr>
+                    <a:xfrm>
+                      <a:off x="0" y="0"/>
+                      <a:ext cx="5943600" cy="2847975"/>
+                    </a:xfrm>
+                    <a:prstGeom prst="rect">
+                      <a:avLst/>
+                    </a:prstGeom>
+                  </pic:spPr>
+                </pic:pic>
+              </a:graphicData>
+            </a:graphic>
+          </wp:inline>
+        </w:drawing>
+      </w:r>
+    </w:p>
+    <w:p>
+      <w:r>
+        <w:t>Output.</w:t>
+      </w:r>
+    </w:p>
+    <w:p>
+      <w:r>
+        <w:rPr>
+          <w:noProof/>
+        </w:rPr>
+        <w:drawing>
+          <wp:inline distT="0" distB="0" distL="0" distR="0" wp14:anchorId="13FA8271" wp14:editId="0A199A3D">
+            <wp:extent cx="5943600" cy="1720215"/>
+            <wp:effectExtent l="0" t="0" r="0" b="0"/>
+            <wp:docPr id="902331915" name="Picture 1"/>
+            <wp:cNvGraphicFramePr>
+              <a:graphicFrameLocks xmlns:a="http://schemas.openxmlformats.org/drawingml/2006/main" noChangeAspect="1"/>
+            </wp:cNvGraphicFramePr>
+            <a:graphic xmlns:a="http://schemas.openxmlformats.org/drawingml/2006/main">
+              <a:graphicData uri="http://schemas.openxmlformats.org/drawingml/2006/picture">
+                <pic:pic xmlns:pic="http://schemas.openxmlformats.org/drawingml/2006/picture">
+                  <pic:nvPicPr>
+                    <pic:cNvPr id="902331915" name=""/>
+                    <pic:cNvPicPr/>
+                  </pic:nvPicPr>
+                  <pic:blipFill>
+                    <a:blip r:embed="rId74"/>
+                    <a:stretch>
+                      <a:fillRect/>
+                    </a:stretch>
+                  </pic:blipFill>
+                  <pic:spPr>
+                    <a:xfrm>
+                      <a:off x="0" y="0"/>
+                      <a:ext cx="5943600" cy="1720215"/>
+                    </a:xfrm>
+                    <a:prstGeom prst="rect">
+                      <a:avLst/>
+                    </a:prstGeom>
+                  </pic:spPr>
+                </pic:pic>
+              </a:graphicData>
+            </a:graphic>
+          </wp:inline>
+        </w:drawing>
+      </w:r>
+    </w:p>
+    <w:p/>
+    <w:p/>
+    <w:p/>
+    <w:p/>
+    <w:p/>
+    <w:p/>
+    <w:p/>
+    <w:p/>
+    <w:p/>
+    <w:p>
+      <w:r>
+        <w:lastRenderedPageBreak/>
+        <w:t>Q36.</w:t>
+      </w:r>
+    </w:p>
+    <w:p>
+      <w:r>
+        <w:rPr>
+          <w:noProof/>
+        </w:rPr>
+        <w:drawing>
+          <wp:inline distT="0" distB="0" distL="0" distR="0" wp14:anchorId="45315F1A" wp14:editId="7429E25F">
+            <wp:extent cx="5295894" cy="3914775"/>
+            <wp:effectExtent l="0" t="0" r="635" b="0"/>
+            <wp:docPr id="747145431" name="Picture 1"/>
+            <wp:cNvGraphicFramePr>
+              <a:graphicFrameLocks xmlns:a="http://schemas.openxmlformats.org/drawingml/2006/main" noChangeAspect="1"/>
+            </wp:cNvGraphicFramePr>
+            <a:graphic xmlns:a="http://schemas.openxmlformats.org/drawingml/2006/main">
+              <a:graphicData uri="http://schemas.openxmlformats.org/drawingml/2006/picture">
+                <pic:pic xmlns:pic="http://schemas.openxmlformats.org/drawingml/2006/picture">
+                  <pic:nvPicPr>
+                    <pic:cNvPr id="747145431" name=""/>
+                    <pic:cNvPicPr/>
+                  </pic:nvPicPr>
+                  <pic:blipFill>
+                    <a:blip r:embed="rId75"/>
+                    <a:stretch>
+                      <a:fillRect/>
+                    </a:stretch>
+                  </pic:blipFill>
+                  <pic:spPr>
+                    <a:xfrm>
+                      <a:off x="0" y="0"/>
+                      <a:ext cx="5299732" cy="3917612"/>
+                    </a:xfrm>
+                    <a:prstGeom prst="rect">
+                      <a:avLst/>
+                    </a:prstGeom>
+                  </pic:spPr>
+                </pic:pic>
+              </a:graphicData>
+            </a:graphic>
+          </wp:inline>
+        </w:drawing>
+      </w:r>
+    </w:p>
+    <w:p>
+      <w:r>
+        <w:t>Output.</w:t>
+      </w:r>
+    </w:p>
+    <w:p>
+      <w:r>
+        <w:rPr>
+          <w:noProof/>
+        </w:rPr>
+        <w:drawing>
+          <wp:inline distT="0" distB="0" distL="0" distR="0" wp14:anchorId="502E393E" wp14:editId="1856D9D1">
+            <wp:extent cx="5115639" cy="3515216"/>
+            <wp:effectExtent l="0" t="0" r="0" b="9525"/>
+            <wp:docPr id="2084455532" name="Picture 1"/>
+            <wp:cNvGraphicFramePr>
+              <a:graphicFrameLocks xmlns:a="http://schemas.openxmlformats.org/drawingml/2006/main" noChangeAspect="1"/>
+            </wp:cNvGraphicFramePr>
+            <a:graphic xmlns:a="http://schemas.openxmlformats.org/drawingml/2006/main">
+              <a:graphicData uri="http://schemas.openxmlformats.org/drawingml/2006/picture">
+                <pic:pic xmlns:pic="http://schemas.openxmlformats.org/drawingml/2006/picture">
+                  <pic:nvPicPr>
+                    <pic:cNvPr id="2084455532" name=""/>
+                    <pic:cNvPicPr/>
+                  </pic:nvPicPr>
+                  <pic:blipFill>
+                    <a:blip r:embed="rId76"/>
+                    <a:stretch>
+                      <a:fillRect/>
+                    </a:stretch>
+                  </pic:blipFill>
+                  <pic:spPr>
+                    <a:xfrm>
+                      <a:off x="0" y="0"/>
+                      <a:ext cx="5115639" cy="3515216"/>
+                    </a:xfrm>
+                    <a:prstGeom prst="rect">
+                      <a:avLst/>
+                    </a:prstGeom>
+                  </pic:spPr>
+                </pic:pic>
+              </a:graphicData>
+            </a:graphic>
+          </wp:inline>
+        </w:drawing>
+      </w:r>
+    </w:p>
+    <w:p>
+      <w:r>
+        <w:lastRenderedPageBreak/>
+        <w:t>Q37.</w:t>
+      </w:r>
+    </w:p>
+    <w:p>
+      <w:r>
+        <w:rPr>
+          <w:noProof/>
+        </w:rPr>
+        <w:drawing>
+          <wp:inline distT="0" distB="0" distL="0" distR="0" wp14:anchorId="33B59269" wp14:editId="57BEA30E">
+            <wp:extent cx="5430008" cy="4477375"/>
+            <wp:effectExtent l="0" t="0" r="0" b="0"/>
+            <wp:docPr id="236250818" name="Picture 1"/>
+            <wp:cNvGraphicFramePr>
+              <a:graphicFrameLocks xmlns:a="http://schemas.openxmlformats.org/drawingml/2006/main" noChangeAspect="1"/>
+            </wp:cNvGraphicFramePr>
+            <a:graphic xmlns:a="http://schemas.openxmlformats.org/drawingml/2006/main">
+              <a:graphicData uri="http://schemas.openxmlformats.org/drawingml/2006/picture">
+                <pic:pic xmlns:pic="http://schemas.openxmlformats.org/drawingml/2006/picture">
+                  <pic:nvPicPr>
+                    <pic:cNvPr id="236250818" name=""/>
+                    <pic:cNvPicPr/>
+                  </pic:nvPicPr>
+                  <pic:blipFill>
+                    <a:blip r:embed="rId77"/>
+                    <a:stretch>
+                      <a:fillRect/>
+                    </a:stretch>
+                  </pic:blipFill>
+                  <pic:spPr>
+                    <a:xfrm>
+                      <a:off x="0" y="0"/>
+                      <a:ext cx="5430008" cy="4477375"/>
+                    </a:xfrm>
+                    <a:prstGeom prst="rect">
+                      <a:avLst/>
+                    </a:prstGeom>
+                  </pic:spPr>
+                </pic:pic>
+              </a:graphicData>
+            </a:graphic>
+          </wp:inline>
+        </w:drawing>
+      </w:r>
+    </w:p>
+    <w:p>
+      <w:r>
+        <w:t>Output.</w:t>
+      </w:r>
+    </w:p>
+    <w:p>
+      <w:r>
+        <w:rPr>
+          <w:noProof/>
+        </w:rPr>
+        <w:drawing>
+          <wp:inline distT="0" distB="0" distL="0" distR="0" wp14:anchorId="0068464E" wp14:editId="6FFE393B">
+            <wp:extent cx="3057525" cy="2112356"/>
+            <wp:effectExtent l="0" t="0" r="0" b="2540"/>
+            <wp:docPr id="425605059" name="Picture 1"/>
+            <wp:cNvGraphicFramePr>
+              <a:graphicFrameLocks xmlns:a="http://schemas.openxmlformats.org/drawingml/2006/main" noChangeAspect="1"/>
+            </wp:cNvGraphicFramePr>
+            <a:graphic xmlns:a="http://schemas.openxmlformats.org/drawingml/2006/main">
+              <a:graphicData uri="http://schemas.openxmlformats.org/drawingml/2006/picture">
+                <pic:pic xmlns:pic="http://schemas.openxmlformats.org/drawingml/2006/picture">
+                  <pic:nvPicPr>
+                    <pic:cNvPr id="425605059" name=""/>
+                    <pic:cNvPicPr/>
+                  </pic:nvPicPr>
+                  <pic:blipFill>
+                    <a:blip r:embed="rId78"/>
+                    <a:stretch>
+                      <a:fillRect/>
+                    </a:stretch>
+                  </pic:blipFill>
+                  <pic:spPr>
+                    <a:xfrm>
+                      <a:off x="0" y="0"/>
+                      <a:ext cx="3061147" cy="2114858"/>
+                    </a:xfrm>
+                    <a:prstGeom prst="rect">
+                      <a:avLst/>
+                    </a:prstGeom>
+                  </pic:spPr>
+                </pic:pic>
+              </a:graphicData>
+            </a:graphic>
+          </wp:inline>
+        </w:drawing>
+      </w:r>
+    </w:p>
+    <w:p/>
+    <w:p/>
+    <w:p>
+      <w:r>
+        <w:lastRenderedPageBreak/>
+        <w:t>Q38.</w:t>
+      </w:r>
+    </w:p>
+    <w:p>
+      <w:r>
+        <w:rPr>
+          <w:noProof/>
+        </w:rPr>
+        <w:drawing>
+          <wp:inline distT="0" distB="0" distL="0" distR="0" wp14:anchorId="17EB73D8" wp14:editId="295385B8">
+            <wp:extent cx="5067300" cy="4201095"/>
+            <wp:effectExtent l="0" t="0" r="0" b="9525"/>
+            <wp:docPr id="617041424" name="Picture 1"/>
+            <wp:cNvGraphicFramePr>
+              <a:graphicFrameLocks xmlns:a="http://schemas.openxmlformats.org/drawingml/2006/main" noChangeAspect="1"/>
+            </wp:cNvGraphicFramePr>
+            <a:graphic xmlns:a="http://schemas.openxmlformats.org/drawingml/2006/main">
+              <a:graphicData uri="http://schemas.openxmlformats.org/drawingml/2006/picture">
+                <pic:pic xmlns:pic="http://schemas.openxmlformats.org/drawingml/2006/picture">
+                  <pic:nvPicPr>
+                    <pic:cNvPr id="617041424" name=""/>
+                    <pic:cNvPicPr/>
+                  </pic:nvPicPr>
+                  <pic:blipFill>
+                    <a:blip r:embed="rId79"/>
+                    <a:stretch>
+                      <a:fillRect/>
+                    </a:stretch>
+                  </pic:blipFill>
+                  <pic:spPr>
+                    <a:xfrm>
+                      <a:off x="0" y="0"/>
+                      <a:ext cx="5070527" cy="4203770"/>
+                    </a:xfrm>
+                    <a:prstGeom prst="rect">
+                      <a:avLst/>
+                    </a:prstGeom>
+                  </pic:spPr>
+                </pic:pic>
+              </a:graphicData>
+            </a:graphic>
+          </wp:inline>
+        </w:drawing>
+      </w:r>
+    </w:p>
+    <w:p>
+      <w:r>
+        <w:t>Output.</w:t>
+      </w:r>
+    </w:p>
+    <w:p>
+      <w:r>
+        <w:rPr>
+          <w:noProof/>
+        </w:rPr>
+        <w:drawing>
+          <wp:inline distT="0" distB="0" distL="0" distR="0" wp14:anchorId="06464B39" wp14:editId="67954DC0">
+            <wp:extent cx="2886075" cy="2540936"/>
+            <wp:effectExtent l="0" t="0" r="0" b="0"/>
+            <wp:docPr id="1842688214" name="Picture 1"/>
+            <wp:cNvGraphicFramePr>
+              <a:graphicFrameLocks xmlns:a="http://schemas.openxmlformats.org/drawingml/2006/main" noChangeAspect="1"/>
+            </wp:cNvGraphicFramePr>
+            <a:graphic xmlns:a="http://schemas.openxmlformats.org/drawingml/2006/main">
+              <a:graphicData uri="http://schemas.openxmlformats.org/drawingml/2006/picture">
+                <pic:pic xmlns:pic="http://schemas.openxmlformats.org/drawingml/2006/picture">
+                  <pic:nvPicPr>
+                    <pic:cNvPr id="1842688214" name=""/>
+                    <pic:cNvPicPr/>
+                  </pic:nvPicPr>
+                  <pic:blipFill>
+                    <a:blip r:embed="rId80"/>
+                    <a:stretch>
+                      <a:fillRect/>
+                    </a:stretch>
+                  </pic:blipFill>
+                  <pic:spPr>
+                    <a:xfrm>
+                      <a:off x="0" y="0"/>
+                      <a:ext cx="2889464" cy="2543919"/>
+                    </a:xfrm>
+                    <a:prstGeom prst="rect">
+                      <a:avLst/>
+                    </a:prstGeom>
+                  </pic:spPr>
+                </pic:pic>
+              </a:graphicData>
+            </a:graphic>
+          </wp:inline>
+        </w:drawing>
+      </w:r>
+    </w:p>
+    <w:p/>
+    <w:p/>
+    <w:p>
+      <w:r>
+        <w:lastRenderedPageBreak/>
+        <w:t>Q39.</w:t>
+      </w:r>
+    </w:p>
+    <w:p>
+      <w:r>
+        <w:rPr>
+          <w:noProof/>
+        </w:rPr>
+        <w:drawing>
+          <wp:inline distT="0" distB="0" distL="0" distR="0" wp14:anchorId="2D25E8BD" wp14:editId="225E6E82">
+            <wp:extent cx="4896533" cy="3124636"/>
+            <wp:effectExtent l="0" t="0" r="0" b="0"/>
+            <wp:docPr id="1805277548" name="Picture 1"/>
+            <wp:cNvGraphicFramePr>
+              <a:graphicFrameLocks xmlns:a="http://schemas.openxmlformats.org/drawingml/2006/main" noChangeAspect="1"/>
+            </wp:cNvGraphicFramePr>
+            <a:graphic xmlns:a="http://schemas.openxmlformats.org/drawingml/2006/main">
+              <a:graphicData uri="http://schemas.openxmlformats.org/drawingml/2006/picture">
+                <pic:pic xmlns:pic="http://schemas.openxmlformats.org/drawingml/2006/picture">
+                  <pic:nvPicPr>
+                    <pic:cNvPr id="1805277548" name=""/>
+                    <pic:cNvPicPr/>
+                  </pic:nvPicPr>
+                  <pic:blipFill>
+                    <a:blip r:embed="rId81"/>
+                    <a:stretch>
+                      <a:fillRect/>
+                    </a:stretch>
+                  </pic:blipFill>
+                  <pic:spPr>
+                    <a:xfrm>
+                      <a:off x="0" y="0"/>
+                      <a:ext cx="4896533" cy="3124636"/>
+                    </a:xfrm>
+                    <a:prstGeom prst="rect">
+                      <a:avLst/>
+                    </a:prstGeom>
+                  </pic:spPr>
+                </pic:pic>
+              </a:graphicData>
+            </a:graphic>
+          </wp:inline>
+        </w:drawing>
+      </w:r>
+    </w:p>
+    <w:p>
+      <w:r>
+        <w:t>Output.</w:t>
+      </w:r>
+    </w:p>
+    <w:p>
+      <w:r>
+        <w:rPr>
+          <w:noProof/>
+        </w:rPr>
+        <w:drawing>
+          <wp:inline distT="0" distB="0" distL="0" distR="0" wp14:anchorId="4227577F" wp14:editId="7A546F09">
+            <wp:extent cx="4305901" cy="3210373"/>
+            <wp:effectExtent l="0" t="0" r="0" b="9525"/>
+            <wp:docPr id="1052011246" name="Picture 1"/>
+            <wp:cNvGraphicFramePr>
+              <a:graphicFrameLocks xmlns:a="http://schemas.openxmlformats.org/drawingml/2006/main" noChangeAspect="1"/>
+            </wp:cNvGraphicFramePr>
+            <a:graphic xmlns:a="http://schemas.openxmlformats.org/drawingml/2006/main">
+              <a:graphicData uri="http://schemas.openxmlformats.org/drawingml/2006/picture">
+                <pic:pic xmlns:pic="http://schemas.openxmlformats.org/drawingml/2006/picture">
+                  <pic:nvPicPr>
+                    <pic:cNvPr id="1052011246" name=""/>
+                    <pic:cNvPicPr/>
+                  </pic:nvPicPr>
+                  <pic:blipFill>
+                    <a:blip r:embed="rId82"/>
+                    <a:stretch>
+                      <a:fillRect/>
+                    </a:stretch>
+                  </pic:blipFill>
+                  <pic:spPr>
+                    <a:xfrm>
+                      <a:off x="0" y="0"/>
+                      <a:ext cx="4305901" cy="3210373"/>
+                    </a:xfrm>
+                    <a:prstGeom prst="rect">
+                      <a:avLst/>
+                    </a:prstGeom>
+                  </pic:spPr>
+                </pic:pic>
+              </a:graphicData>
+            </a:graphic>
+          </wp:inline>
+        </w:drawing>
+      </w:r>
+    </w:p>
+    <w:p/>
+    <w:p/>
+    <w:p/>
+    <w:p>
+      <w:r>
+        <w:lastRenderedPageBreak/>
+        <w:t>Q40.</w:t>
+      </w:r>
+    </w:p>
+    <w:p>
+      <w:r>
+        <w:drawing>
+          <wp:inline distT="0" distB="0" distL="0" distR="0" wp14:anchorId="7DAC44CF" wp14:editId="37B7C98E">
+            <wp:extent cx="5943600" cy="5256530"/>
+            <wp:effectExtent l="0" t="0" r="0" b="1270"/>
+            <wp:docPr id="601787893" name="Picture 1"/>
+            <wp:cNvGraphicFramePr>
+              <a:graphicFrameLocks xmlns:a="http://schemas.openxmlformats.org/drawingml/2006/main" noChangeAspect="1"/>
+            </wp:cNvGraphicFramePr>
+            <a:graphic xmlns:a="http://schemas.openxmlformats.org/drawingml/2006/main">
+              <a:graphicData uri="http://schemas.openxmlformats.org/drawingml/2006/picture">
+                <pic:pic xmlns:pic="http://schemas.openxmlformats.org/drawingml/2006/picture">
+                  <pic:nvPicPr>
+                    <pic:cNvPr id="601787893" name=""/>
+                    <pic:cNvPicPr/>
+                  </pic:nvPicPr>
+                  <pic:blipFill>
+                    <a:blip r:embed="rId83"/>
+                    <a:stretch>
+                      <a:fillRect/>
+                    </a:stretch>
+                  </pic:blipFill>
+                  <pic:spPr>
+                    <a:xfrm>
+                      <a:off x="0" y="0"/>
+                      <a:ext cx="5943600" cy="5256530"/>
+                    </a:xfrm>
+                    <a:prstGeom prst="rect">
+                      <a:avLst/>
+                    </a:prstGeom>
+                  </pic:spPr>
+                </pic:pic>
+              </a:graphicData>
+            </a:graphic>
+          </wp:inline>
+        </w:drawing>
+      </w:r>
+    </w:p>
+    <w:p>
+      <w:r>
+        <w:t>Output.</w:t>
+      </w:r>
+    </w:p>
+    <w:p>
+      <w:r>
+        <w:drawing>
+          <wp:inline distT="0" distB="0" distL="0" distR="0" wp14:anchorId="0FC901DE" wp14:editId="0E2154CE">
+            <wp:extent cx="3274828" cy="1939132"/>
+            <wp:effectExtent l="0" t="0" r="1905" b="4445"/>
+            <wp:docPr id="1094405856" name="Picture 1"/>
+            <wp:cNvGraphicFramePr>
+              <a:graphicFrameLocks xmlns:a="http://schemas.openxmlformats.org/drawingml/2006/main" noChangeAspect="1"/>
+            </wp:cNvGraphicFramePr>
+            <a:graphic xmlns:a="http://schemas.openxmlformats.org/drawingml/2006/main">
+              <a:graphicData uri="http://schemas.openxmlformats.org/drawingml/2006/picture">
+                <pic:pic xmlns:pic="http://schemas.openxmlformats.org/drawingml/2006/picture">
+                  <pic:nvPicPr>
+                    <pic:cNvPr id="1094405856" name=""/>
+                    <pic:cNvPicPr/>
+                  </pic:nvPicPr>
+                  <pic:blipFill>
+                    <a:blip r:embed="rId84"/>
+                    <a:stretch>
+                      <a:fillRect/>
+                    </a:stretch>
+                  </pic:blipFill>
+                  <pic:spPr>
+                    <a:xfrm>
+                      <a:off x="0" y="0"/>
+                      <a:ext cx="3287730" cy="1946772"/>
+                    </a:xfrm>
+                    <a:prstGeom prst="rect">
+                      <a:avLst/>
+                    </a:prstGeom>
+                  </pic:spPr>
+                </pic:pic>
+              </a:graphicData>
+            </a:graphic>
+          </wp:inline>
+        </w:drawing>
+      </w:r>
+    </w:p>
+    <w:p>
+      <w:r>
+        <w:lastRenderedPageBreak/>
+        <w:drawing>
+          <wp:anchor distT="0" distB="0" distL="114300" distR="114300" simplePos="0" relativeHeight="251659264" behindDoc="1" locked="0" layoutInCell="1" allowOverlap="1" wp14:anchorId="12486564" wp14:editId="2AB437FF">
+            <wp:simplePos x="0" y="0"/>
+            <wp:positionH relativeFrom="margin">
+              <wp:align>center</wp:align>
+            </wp:positionH>
+            <wp:positionV relativeFrom="paragraph">
+              <wp:posOffset>286395</wp:posOffset>
+            </wp:positionV>
+            <wp:extent cx="6775336" cy="7110483"/>
+            <wp:effectExtent l="0" t="0" r="6985" b="0"/>
+            <wp:wrapTight wrapText="bothSides">
+              <wp:wrapPolygon edited="0">
+                <wp:start x="0" y="0"/>
+                <wp:lineTo x="0" y="21529"/>
+                <wp:lineTo x="21562" y="21529"/>
+                <wp:lineTo x="21562" y="0"/>
+                <wp:lineTo x="0" y="0"/>
+              </wp:wrapPolygon>
+            </wp:wrapTight>
+            <wp:docPr id="59068502" name="Picture 1"/>
+            <wp:cNvGraphicFramePr>
+              <a:graphicFrameLocks xmlns:a="http://schemas.openxmlformats.org/drawingml/2006/main" noChangeAspect="1"/>
+            </wp:cNvGraphicFramePr>
+            <a:graphic xmlns:a="http://schemas.openxmlformats.org/drawingml/2006/main">
+              <a:graphicData uri="http://schemas.openxmlformats.org/drawingml/2006/picture">
+                <pic:pic xmlns:pic="http://schemas.openxmlformats.org/drawingml/2006/picture">
+                  <pic:nvPicPr>
+                    <pic:cNvPr id="59068502" name=""/>
+                    <pic:cNvPicPr/>
+                  </pic:nvPicPr>
+                  <pic:blipFill>
+                    <a:blip r:embed="rId85">
+                      <a:extLst>
+                        <a:ext uri="{28A0092B-C50C-407E-A947-70E740481C1C}">
+                          <a14:useLocalDpi xmlns:a14="http://schemas.microsoft.com/office/drawing/2010/main" val="0"/>
+                        </a:ext>
+                      </a:extLst>
+                    </a:blip>
+                    <a:stretch>
+                      <a:fillRect/>
+                    </a:stretch>
+                  </pic:blipFill>
+                  <pic:spPr>
+                    <a:xfrm>
+                      <a:off x="0" y="0"/>
+                      <a:ext cx="6775336" cy="7110483"/>
+                    </a:xfrm>
+                    <a:prstGeom prst="rect">
+                      <a:avLst/>
+                    </a:prstGeom>
+                  </pic:spPr>
+                </pic:pic>
+              </a:graphicData>
+            </a:graphic>
+          </wp:anchor>
+        </w:drawing>
+      </w:r>
+      <w:r>
+        <w:t>Q41.</w:t>
+      </w:r>
+    </w:p>
+    <w:p/>
+    <w:p/>
+    <w:p/>
+    <w:p/>
+    <w:p>
+      <w:r>
+        <w:t>Output.</w:t>
+      </w:r>
+    </w:p>
+    <w:p/>
+    <w:p>
+      <w:r>
+        <w:drawing>
+          <wp:inline distT="0" distB="0" distL="0" distR="0" wp14:anchorId="55246CA4" wp14:editId="3F39B1B1">
+            <wp:extent cx="3462405" cy="3643953"/>
+            <wp:effectExtent l="0" t="0" r="5080" b="0"/>
+            <wp:docPr id="537884066" name="Picture 1"/>
+            <wp:cNvGraphicFramePr>
+              <a:graphicFrameLocks xmlns:a="http://schemas.openxmlformats.org/drawingml/2006/main" noChangeAspect="1"/>
+            </wp:cNvGraphicFramePr>
+            <a:graphic xmlns:a="http://schemas.openxmlformats.org/drawingml/2006/main">
+              <a:graphicData uri="http://schemas.openxmlformats.org/drawingml/2006/picture">
+                <pic:pic xmlns:pic="http://schemas.openxmlformats.org/drawingml/2006/picture">
+                  <pic:nvPicPr>
+                    <pic:cNvPr id="537884066" name=""/>
+                    <pic:cNvPicPr/>
+                  </pic:nvPicPr>
+                  <pic:blipFill>
+                    <a:blip r:embed="rId86"/>
+                    <a:stretch>
+                      <a:fillRect/>
+                    </a:stretch>
+                  </pic:blipFill>
+                  <pic:spPr>
+                    <a:xfrm>
+                      <a:off x="0" y="0"/>
+                      <a:ext cx="3462405" cy="3643953"/>
+                    </a:xfrm>
+                    <a:prstGeom prst="rect">
+                      <a:avLst/>
+                    </a:prstGeom>
+                  </pic:spPr>
+                </pic:pic>
+              </a:graphicData>
+            </a:graphic>
+          </wp:inline>
+        </w:drawing>
+      </w:r>
+    </w:p>
+    <w:p>
+      <w:r>
+        <w:drawing>
+          <wp:inline distT="0" distB="0" distL="0" distR="0" wp14:anchorId="7DA76E61" wp14:editId="1B4289EF">
+            <wp:extent cx="2599286" cy="3384645"/>
+            <wp:effectExtent l="0" t="0" r="0" b="6350"/>
+            <wp:docPr id="1246625972" name="Picture 1"/>
+            <wp:cNvGraphicFramePr>
+              <a:graphicFrameLocks xmlns:a="http://schemas.openxmlformats.org/drawingml/2006/main" noChangeAspect="1"/>
+            </wp:cNvGraphicFramePr>
+            <a:graphic xmlns:a="http://schemas.openxmlformats.org/drawingml/2006/main">
+              <a:graphicData uri="http://schemas.openxmlformats.org/drawingml/2006/picture">
+                <pic:pic xmlns:pic="http://schemas.openxmlformats.org/drawingml/2006/picture">
+                  <pic:nvPicPr>
+                    <pic:cNvPr id="1246625972" name=""/>
+                    <pic:cNvPicPr/>
+                  </pic:nvPicPr>
+                  <pic:blipFill>
+                    <a:blip r:embed="rId87"/>
+                    <a:stretch>
+                      <a:fillRect/>
+                    </a:stretch>
+                  </pic:blipFill>
+                  <pic:spPr>
+                    <a:xfrm>
+                      <a:off x="0" y="0"/>
+                      <a:ext cx="2607705" cy="3395607"/>
+                    </a:xfrm>
+                    <a:prstGeom prst="rect">
+                      <a:avLst/>
+                    </a:prstGeom>
+                  </pic:spPr>
+                </pic:pic>
+              </a:graphicData>
+            </a:graphic>
+          </wp:inline>
+        </w:drawing>
+      </w:r>
+    </w:p>
+    <w:p>
+      <w:r>
+        <w:lastRenderedPageBreak/>
+        <w:t>Q42.</w:t>
+      </w:r>
+    </w:p>
+    <w:p>
+      <w:r>
+        <w:drawing>
+          <wp:inline distT="0" distB="0" distL="0" distR="0" wp14:anchorId="767C900F" wp14:editId="415E04C0">
+            <wp:extent cx="5472752" cy="4996225"/>
+            <wp:effectExtent l="0" t="0" r="0" b="0"/>
+            <wp:docPr id="1335904825" name="Picture 1"/>
+            <wp:cNvGraphicFramePr>
+              <a:graphicFrameLocks xmlns:a="http://schemas.openxmlformats.org/drawingml/2006/main" noChangeAspect="1"/>
+            </wp:cNvGraphicFramePr>
+            <a:graphic xmlns:a="http://schemas.openxmlformats.org/drawingml/2006/main">
+              <a:graphicData uri="http://schemas.openxmlformats.org/drawingml/2006/picture">
+                <pic:pic xmlns:pic="http://schemas.openxmlformats.org/drawingml/2006/picture">
+                  <pic:nvPicPr>
+                    <pic:cNvPr id="1335904825" name=""/>
+                    <pic:cNvPicPr/>
+                  </pic:nvPicPr>
+                  <pic:blipFill>
+                    <a:blip r:embed="rId88"/>
+                    <a:stretch>
+                      <a:fillRect/>
+                    </a:stretch>
+                  </pic:blipFill>
+                  <pic:spPr>
+                    <a:xfrm>
+                      <a:off x="0" y="0"/>
+                      <a:ext cx="5475806" cy="4999013"/>
+                    </a:xfrm>
+                    <a:prstGeom prst="rect">
+                      <a:avLst/>
+                    </a:prstGeom>
+                  </pic:spPr>
+                </pic:pic>
+              </a:graphicData>
+            </a:graphic>
+          </wp:inline>
+        </w:drawing>
+      </w:r>
+    </w:p>
+    <w:p>
+      <w:r>
+        <w:drawing>
+          <wp:anchor distT="0" distB="0" distL="114300" distR="114300" simplePos="0" relativeHeight="251660288" behindDoc="0" locked="0" layoutInCell="1" allowOverlap="1" wp14:anchorId="24DAB08F" wp14:editId="11708EDB">
+            <wp:simplePos x="0" y="0"/>
+            <wp:positionH relativeFrom="margin">
+              <wp:align>left</wp:align>
+            </wp:positionH>
+            <wp:positionV relativeFrom="paragraph">
+              <wp:posOffset>314325</wp:posOffset>
+            </wp:positionV>
+            <wp:extent cx="2929255" cy="1732915"/>
+            <wp:effectExtent l="0" t="0" r="4445" b="635"/>
+            <wp:wrapSquare wrapText="bothSides"/>
+            <wp:docPr id="354434905" name="Picture 1"/>
+            <wp:cNvGraphicFramePr>
+              <a:graphicFrameLocks xmlns:a="http://schemas.openxmlformats.org/drawingml/2006/main" noChangeAspect="1"/>
+            </wp:cNvGraphicFramePr>
+            <a:graphic xmlns:a="http://schemas.openxmlformats.org/drawingml/2006/main">
+              <a:graphicData uri="http://schemas.openxmlformats.org/drawingml/2006/picture">
+                <pic:pic xmlns:pic="http://schemas.openxmlformats.org/drawingml/2006/picture">
+                  <pic:nvPicPr>
+                    <pic:cNvPr id="354434905" name=""/>
+                    <pic:cNvPicPr/>
+                  </pic:nvPicPr>
+                  <pic:blipFill>
+                    <a:blip r:embed="rId89">
+                      <a:extLst>
+                        <a:ext uri="{28A0092B-C50C-407E-A947-70E740481C1C}">
+                          <a14:useLocalDpi xmlns:a14="http://schemas.microsoft.com/office/drawing/2010/main" val="0"/>
+                        </a:ext>
+                      </a:extLst>
+                    </a:blip>
+                    <a:stretch>
+                      <a:fillRect/>
+                    </a:stretch>
+                  </pic:blipFill>
+                  <pic:spPr>
+                    <a:xfrm>
+                      <a:off x="0" y="0"/>
+                      <a:ext cx="2929255" cy="1732915"/>
+                    </a:xfrm>
+                    <a:prstGeom prst="rect">
+                      <a:avLst/>
+                    </a:prstGeom>
+                  </pic:spPr>
+                </pic:pic>
+              </a:graphicData>
+            </a:graphic>
+            <wp14:sizeRelH relativeFrom="margin">
+              <wp14:pctWidth>0</wp14:pctWidth>
+            </wp14:sizeRelH>
+            <wp14:sizeRelV relativeFrom="margin">
+              <wp14:pctHeight>0</wp14:pctHeight>
+            </wp14:sizeRelV>
+          </wp:anchor>
+        </w:drawing>
+      </w:r>
+      <w:r>
+        <w:t>Output.</w:t>
+      </w:r>
+    </w:p>
+    <w:p>
+      <w:r>
+        <w:drawing>
+          <wp:inline distT="0" distB="0" distL="0" distR="0" wp14:anchorId="178E8ABC" wp14:editId="6FCC17F5">
+            <wp:extent cx="2565779" cy="1891476"/>
+            <wp:effectExtent l="0" t="0" r="6350" b="0"/>
+            <wp:docPr id="1812815171" name="Picture 1"/>
+            <wp:cNvGraphicFramePr>
+              <a:graphicFrameLocks xmlns:a="http://schemas.openxmlformats.org/drawingml/2006/main" noChangeAspect="1"/>
+            </wp:cNvGraphicFramePr>
+            <a:graphic xmlns:a="http://schemas.openxmlformats.org/drawingml/2006/main">
+              <a:graphicData uri="http://schemas.openxmlformats.org/drawingml/2006/picture">
+                <pic:pic xmlns:pic="http://schemas.openxmlformats.org/drawingml/2006/picture">
+                  <pic:nvPicPr>
+                    <pic:cNvPr id="1812815171" name=""/>
+                    <pic:cNvPicPr/>
+                  </pic:nvPicPr>
+                  <pic:blipFill>
+                    <a:blip r:embed="rId90"/>
+                    <a:stretch>
+                      <a:fillRect/>
+                    </a:stretch>
+                  </pic:blipFill>
+                  <pic:spPr>
+                    <a:xfrm>
+                      <a:off x="0" y="0"/>
+                      <a:ext cx="2576959" cy="1899718"/>
+                    </a:xfrm>
+                    <a:prstGeom prst="rect">
+                      <a:avLst/>
+                    </a:prstGeom>
+                  </pic:spPr>
+                </pic:pic>
+              </a:graphicData>
+            </a:graphic>
+          </wp:inline>
+        </w:drawing>
+      </w:r>
+    </w:p>
+    <w:p/>
+    <w:p>
+      <w:r>
+        <w:lastRenderedPageBreak/>
+        <w:t>Q43.</w:t>
+      </w:r>
+    </w:p>
+    <w:p>
+      <w:r>
+        <w:drawing>
+          <wp:inline distT="0" distB="0" distL="0" distR="0" wp14:anchorId="1037379B" wp14:editId="7ADD4B71">
+            <wp:extent cx="5540991" cy="7807238"/>
+            <wp:effectExtent l="0" t="0" r="3175" b="3810"/>
+            <wp:docPr id="339729862" name="Picture 1"/>
+            <wp:cNvGraphicFramePr>
+              <a:graphicFrameLocks xmlns:a="http://schemas.openxmlformats.org/drawingml/2006/main" noChangeAspect="1"/>
+            </wp:cNvGraphicFramePr>
+            <a:graphic xmlns:a="http://schemas.openxmlformats.org/drawingml/2006/main">
+              <a:graphicData uri="http://schemas.openxmlformats.org/drawingml/2006/picture">
+                <pic:pic xmlns:pic="http://schemas.openxmlformats.org/drawingml/2006/picture">
+                  <pic:nvPicPr>
+                    <pic:cNvPr id="339729862" name=""/>
+                    <pic:cNvPicPr/>
+                  </pic:nvPicPr>
+                  <pic:blipFill>
+                    <a:blip r:embed="rId91"/>
+                    <a:stretch>
+                      <a:fillRect/>
+                    </a:stretch>
+                  </pic:blipFill>
+                  <pic:spPr>
+                    <a:xfrm>
+                      <a:off x="0" y="0"/>
+                      <a:ext cx="5560351" cy="7834516"/>
+                    </a:xfrm>
+                    <a:prstGeom prst="rect">
+                      <a:avLst/>
+                    </a:prstGeom>
+                  </pic:spPr>
+                </pic:pic>
+              </a:graphicData>
+            </a:graphic>
+          </wp:inline>
+        </w:drawing>
+      </w:r>
+    </w:p>
+    <w:p>
+      <w:r>
+        <w:lastRenderedPageBreak/>
+        <w:t>Output.</w:t>
+      </w:r>
+    </w:p>
+    <w:p>
+      <w:r>
+        <w:drawing>
+          <wp:inline distT="0" distB="0" distL="0" distR="0" wp14:anchorId="7AF93CD5" wp14:editId="469FA23A">
+            <wp:extent cx="3848637" cy="2295845"/>
+            <wp:effectExtent l="0" t="0" r="0" b="9525"/>
+            <wp:docPr id="1492929564" name="Picture 1"/>
+            <wp:cNvGraphicFramePr>
+              <a:graphicFrameLocks xmlns:a="http://schemas.openxmlformats.org/drawingml/2006/main" noChangeAspect="1"/>
+            </wp:cNvGraphicFramePr>
+            <a:graphic xmlns:a="http://schemas.openxmlformats.org/drawingml/2006/main">
+              <a:graphicData uri="http://schemas.openxmlformats.org/drawingml/2006/picture">
+                <pic:pic xmlns:pic="http://schemas.openxmlformats.org/drawingml/2006/picture">
+                  <pic:nvPicPr>
+                    <pic:cNvPr id="1492929564" name=""/>
+                    <pic:cNvPicPr/>
+                  </pic:nvPicPr>
+                  <pic:blipFill>
+                    <a:blip r:embed="rId92"/>
+                    <a:stretch>
+                      <a:fillRect/>
+                    </a:stretch>
+                  </pic:blipFill>
+                  <pic:spPr>
+                    <a:xfrm>
+                      <a:off x="0" y="0"/>
+                      <a:ext cx="3848637" cy="2295845"/>
+                    </a:xfrm>
+                    <a:prstGeom prst="rect">
+                      <a:avLst/>
+                    </a:prstGeom>
+                  </pic:spPr>
+                </pic:pic>
+              </a:graphicData>
+            </a:graphic>
+          </wp:inline>
+        </w:drawing>
+      </w:r>
+    </w:p>
+    <w:p/>
+    <w:p/>
+    <w:p/>
+    <w:p/>
+    <w:p/>
+    <w:p/>
+    <w:p/>
+    <w:p/>
+    <w:p/>
+    <w:p/>
+    <w:p/>
+    <w:p/>
+    <w:p/>
+    <w:p/>
+    <w:p/>
+    <w:p/>
+    <w:p/>
+    <w:p>
+      <w:r>
+        <w:lastRenderedPageBreak/>
+        <w:t>Q44.</w:t>
+      </w:r>
+    </w:p>
+    <w:p>
+      <w:r>
+        <w:drawing>
+          <wp:inline distT="0" distB="0" distL="0" distR="0" wp14:anchorId="1ECE7617" wp14:editId="719502B4">
+            <wp:extent cx="4991797" cy="3858163"/>
+            <wp:effectExtent l="0" t="0" r="0" b="9525"/>
+            <wp:docPr id="504505306" name="Picture 1"/>
+            <wp:cNvGraphicFramePr>
+              <a:graphicFrameLocks xmlns:a="http://schemas.openxmlformats.org/drawingml/2006/main" noChangeAspect="1"/>
+            </wp:cNvGraphicFramePr>
+            <a:graphic xmlns:a="http://schemas.openxmlformats.org/drawingml/2006/main">
+              <a:graphicData uri="http://schemas.openxmlformats.org/drawingml/2006/picture">
+                <pic:pic xmlns:pic="http://schemas.openxmlformats.org/drawingml/2006/picture">
+                  <pic:nvPicPr>
+                    <pic:cNvPr id="504505306" name=""/>
+                    <pic:cNvPicPr/>
+                  </pic:nvPicPr>
+                  <pic:blipFill>
+                    <a:blip r:embed="rId93"/>
+                    <a:stretch>
+                      <a:fillRect/>
+                    </a:stretch>
+                  </pic:blipFill>
+                  <pic:spPr>
+                    <a:xfrm>
+                      <a:off x="0" y="0"/>
+                      <a:ext cx="4991797" cy="3858163"/>
+                    </a:xfrm>
+                    <a:prstGeom prst="rect">
+                      <a:avLst/>
+                    </a:prstGeom>
+                  </pic:spPr>
+                </pic:pic>
+              </a:graphicData>
+            </a:graphic>
+          </wp:inline>
+        </w:drawing>
+      </w:r>
+    </w:p>
+    <w:p/>
+    <w:p>
+      <w:r>
+        <w:t>Output.</w:t>
+      </w:r>
+    </w:p>
+    <w:p>
+      <w:r>
+        <w:drawing>
+          <wp:inline distT="0" distB="0" distL="0" distR="0" wp14:anchorId="721B24CD" wp14:editId="165FCE1A">
+            <wp:extent cx="3591426" cy="2181529"/>
+            <wp:effectExtent l="0" t="0" r="9525" b="9525"/>
+            <wp:docPr id="1767729527" name="Picture 1"/>
+            <wp:cNvGraphicFramePr>
+              <a:graphicFrameLocks xmlns:a="http://schemas.openxmlformats.org/drawingml/2006/main" noChangeAspect="1"/>
+            </wp:cNvGraphicFramePr>
+            <a:graphic xmlns:a="http://schemas.openxmlformats.org/drawingml/2006/main">
+              <a:graphicData uri="http://schemas.openxmlformats.org/drawingml/2006/picture">
+                <pic:pic xmlns:pic="http://schemas.openxmlformats.org/drawingml/2006/picture">
+                  <pic:nvPicPr>
+                    <pic:cNvPr id="1767729527" name=""/>
+                    <pic:cNvPicPr/>
+                  </pic:nvPicPr>
+                  <pic:blipFill>
+                    <a:blip r:embed="rId94"/>
+                    <a:stretch>
+                      <a:fillRect/>
+                    </a:stretch>
+                  </pic:blipFill>
+                  <pic:spPr>
+                    <a:xfrm>
+                      <a:off x="0" y="0"/>
+                      <a:ext cx="3591426" cy="2181529"/>
+                    </a:xfrm>
+                    <a:prstGeom prst="rect">
+                      <a:avLst/>
+                    </a:prstGeom>
+                  </pic:spPr>
+                </pic:pic>
+              </a:graphicData>
+            </a:graphic>
+          </wp:inline>
+        </w:drawing>
+      </w:r>
+    </w:p>
+    <w:p/>
+    <w:p/>
+    <w:p/>
+    <w:p>
+      <w:r>
+        <w:lastRenderedPageBreak/>
+        <w:t>Q45.</w:t>
+      </w:r>
+    </w:p>
+    <w:p>
+      <w:r>
+        <w:drawing>
+          <wp:inline distT="0" distB="0" distL="0" distR="0" wp14:anchorId="255CA5F9" wp14:editId="6E580005">
+            <wp:extent cx="5106113" cy="3534268"/>
+            <wp:effectExtent l="0" t="0" r="0" b="9525"/>
+            <wp:docPr id="1725421579" name="Picture 1"/>
+            <wp:cNvGraphicFramePr>
+              <a:graphicFrameLocks xmlns:a="http://schemas.openxmlformats.org/drawingml/2006/main" noChangeAspect="1"/>
+            </wp:cNvGraphicFramePr>
+            <a:graphic xmlns:a="http://schemas.openxmlformats.org/drawingml/2006/main">
+              <a:graphicData uri="http://schemas.openxmlformats.org/drawingml/2006/picture">
+                <pic:pic xmlns:pic="http://schemas.openxmlformats.org/drawingml/2006/picture">
+                  <pic:nvPicPr>
+                    <pic:cNvPr id="1725421579" name=""/>
+                    <pic:cNvPicPr/>
+                  </pic:nvPicPr>
+                  <pic:blipFill>
+                    <a:blip r:embed="rId95"/>
+                    <a:stretch>
+                      <a:fillRect/>
+                    </a:stretch>
+                  </pic:blipFill>
+                  <pic:spPr>
+                    <a:xfrm>
+                      <a:off x="0" y="0"/>
+                      <a:ext cx="5106113" cy="3534268"/>
+                    </a:xfrm>
+                    <a:prstGeom prst="rect">
+                      <a:avLst/>
+                    </a:prstGeom>
+                  </pic:spPr>
+                </pic:pic>
+              </a:graphicData>
+            </a:graphic>
+          </wp:inline>
+        </w:drawing>
+      </w:r>
+    </w:p>
+    <w:p>
+      <w:r>
+        <w:t>Output.</w:t>
+      </w:r>
+    </w:p>
+    <w:p>
+      <w:r>
+        <w:drawing>
+          <wp:inline distT="0" distB="0" distL="0" distR="0" wp14:anchorId="40E9890E" wp14:editId="5A3BA258">
+            <wp:extent cx="5706271" cy="1362265"/>
+            <wp:effectExtent l="0" t="0" r="8890" b="9525"/>
+            <wp:docPr id="2025945942" name="Picture 1"/>
+            <wp:cNvGraphicFramePr>
+              <a:graphicFrameLocks xmlns:a="http://schemas.openxmlformats.org/drawingml/2006/main" noChangeAspect="1"/>
+            </wp:cNvGraphicFramePr>
+            <a:graphic xmlns:a="http://schemas.openxmlformats.org/drawingml/2006/main">
+              <a:graphicData uri="http://schemas.openxmlformats.org/drawingml/2006/picture">
+                <pic:pic xmlns:pic="http://schemas.openxmlformats.org/drawingml/2006/picture">
+                  <pic:nvPicPr>
+                    <pic:cNvPr id="2025945942" name=""/>
+                    <pic:cNvPicPr/>
+                  </pic:nvPicPr>
+                  <pic:blipFill>
+                    <a:blip r:embed="rId96"/>
+                    <a:stretch>
+                      <a:fillRect/>
+                    </a:stretch>
+                  </pic:blipFill>
+                  <pic:spPr>
+                    <a:xfrm>
+                      <a:off x="0" y="0"/>
+                      <a:ext cx="5706271" cy="1362265"/>
+                    </a:xfrm>
+                    <a:prstGeom prst="rect">
+                      <a:avLst/>
+                    </a:prstGeom>
+                  </pic:spPr>
+                </pic:pic>
+              </a:graphicData>
+            </a:graphic>
+          </wp:inline>
+        </w:drawing>
+      </w:r>
+    </w:p>
+    <w:p/>
+    <w:p/>
+    <w:p/>
+    <w:p/>
+    <w:p/>
+    <w:p/>
+    <w:p/>
+    <w:p/>
+    <w:p>
+      <w:r>
+        <w:lastRenderedPageBreak/>
+        <w:t>Q46.</w:t>
+      </w:r>
+    </w:p>
+    <w:p>
+      <w:r>
+        <w:drawing>
+          <wp:inline distT="0" distB="0" distL="0" distR="0" wp14:anchorId="4C8BD50A" wp14:editId="2B78B288">
+            <wp:extent cx="5477639" cy="4020111"/>
+            <wp:effectExtent l="0" t="0" r="8890" b="0"/>
+            <wp:docPr id="1637237989" name="Picture 1"/>
+            <wp:cNvGraphicFramePr>
+              <a:graphicFrameLocks xmlns:a="http://schemas.openxmlformats.org/drawingml/2006/main" noChangeAspect="1"/>
+            </wp:cNvGraphicFramePr>
+            <a:graphic xmlns:a="http://schemas.openxmlformats.org/drawingml/2006/main">
+              <a:graphicData uri="http://schemas.openxmlformats.org/drawingml/2006/picture">
+                <pic:pic xmlns:pic="http://schemas.openxmlformats.org/drawingml/2006/picture">
+                  <pic:nvPicPr>
+                    <pic:cNvPr id="1637237989" name=""/>
+                    <pic:cNvPicPr/>
+                  </pic:nvPicPr>
+                  <pic:blipFill>
+                    <a:blip r:embed="rId97"/>
+                    <a:stretch>
+                      <a:fillRect/>
+                    </a:stretch>
+                  </pic:blipFill>
+                  <pic:spPr>
+                    <a:xfrm>
+                      <a:off x="0" y="0"/>
+                      <a:ext cx="5477639" cy="4020111"/>
+                    </a:xfrm>
+                    <a:prstGeom prst="rect">
+                      <a:avLst/>
+                    </a:prstGeom>
+                  </pic:spPr>
+                </pic:pic>
+              </a:graphicData>
+            </a:graphic>
+          </wp:inline>
+        </w:drawing>
+      </w:r>
+    </w:p>
+    <w:p>
+      <w:r>
+        <w:t>Output.</w:t>
+      </w:r>
+    </w:p>
+    <w:p>
+      <w:r>
+        <w:drawing>
+          <wp:inline distT="0" distB="0" distL="0" distR="0" wp14:anchorId="7F626415" wp14:editId="5B572FE8">
+            <wp:extent cx="5943600" cy="1896745"/>
+            <wp:effectExtent l="0" t="0" r="0" b="8255"/>
+            <wp:docPr id="1242752896" name="Picture 1"/>
+            <wp:cNvGraphicFramePr>
+              <a:graphicFrameLocks xmlns:a="http://schemas.openxmlformats.org/drawingml/2006/main" noChangeAspect="1"/>
+            </wp:cNvGraphicFramePr>
+            <a:graphic xmlns:a="http://schemas.openxmlformats.org/drawingml/2006/main">
+              <a:graphicData uri="http://schemas.openxmlformats.org/drawingml/2006/picture">
+                <pic:pic xmlns:pic="http://schemas.openxmlformats.org/drawingml/2006/picture">
+                  <pic:nvPicPr>
+                    <pic:cNvPr id="1242752896" name=""/>
+                    <pic:cNvPicPr/>
+                  </pic:nvPicPr>
+                  <pic:blipFill>
+                    <a:blip r:embed="rId98"/>
+                    <a:stretch>
+                      <a:fillRect/>
+                    </a:stretch>
+                  </pic:blipFill>
+                  <pic:spPr>
+                    <a:xfrm>
+                      <a:off x="0" y="0"/>
+                      <a:ext cx="5943600" cy="1896745"/>
+                    </a:xfrm>
+                    <a:prstGeom prst="rect">
+                      <a:avLst/>
+                    </a:prstGeom>
+                  </pic:spPr>
+                </pic:pic>
+              </a:graphicData>
+            </a:graphic>
+          </wp:inline>
+        </w:drawing>
+      </w:r>
+    </w:p>
+    <w:p/>
+    <w:p/>
+    <w:p/>
+    <w:p/>
+    <w:p>
+      <w:r>
+        <w:lastRenderedPageBreak/>
+        <w:t>Q47.</w:t>
+      </w:r>
+    </w:p>
+    <w:p>
+      <w:r>
+        <w:drawing>
+          <wp:inline distT="0" distB="0" distL="0" distR="0" wp14:anchorId="6AE6B1BD" wp14:editId="2F3D9EBD">
+            <wp:extent cx="5001323" cy="3791479"/>
+            <wp:effectExtent l="0" t="0" r="8890" b="0"/>
+            <wp:docPr id="1704256763" name="Picture 1"/>
+            <wp:cNvGraphicFramePr>
+              <a:graphicFrameLocks xmlns:a="http://schemas.openxmlformats.org/drawingml/2006/main" noChangeAspect="1"/>
+            </wp:cNvGraphicFramePr>
+            <a:graphic xmlns:a="http://schemas.openxmlformats.org/drawingml/2006/main">
+              <a:graphicData uri="http://schemas.openxmlformats.org/drawingml/2006/picture">
+                <pic:pic xmlns:pic="http://schemas.openxmlformats.org/drawingml/2006/picture">
+                  <pic:nvPicPr>
+                    <pic:cNvPr id="1704256763" name=""/>
+                    <pic:cNvPicPr/>
+                  </pic:nvPicPr>
+                  <pic:blipFill>
+                    <a:blip r:embed="rId99"/>
+                    <a:stretch>
+                      <a:fillRect/>
+                    </a:stretch>
+                  </pic:blipFill>
+                  <pic:spPr>
+                    <a:xfrm>
+                      <a:off x="0" y="0"/>
+                      <a:ext cx="5001323" cy="3791479"/>
+                    </a:xfrm>
+                    <a:prstGeom prst="rect">
+                      <a:avLst/>
+                    </a:prstGeom>
+                  </pic:spPr>
+                </pic:pic>
+              </a:graphicData>
+            </a:graphic>
+          </wp:inline>
+        </w:drawing>
+      </w:r>
+    </w:p>
+    <w:p>
+      <w:r>
+        <w:t>Output</w:t>
+      </w:r>
+    </w:p>
+    <w:p>
+      <w:r>
+        <w:drawing>
+          <wp:inline distT="0" distB="0" distL="0" distR="0" wp14:anchorId="404991F5" wp14:editId="61713EBE">
+            <wp:extent cx="4344006" cy="3219899"/>
+            <wp:effectExtent l="0" t="0" r="0" b="0"/>
+            <wp:docPr id="619997465" name="Picture 1"/>
+            <wp:cNvGraphicFramePr>
+              <a:graphicFrameLocks xmlns:a="http://schemas.openxmlformats.org/drawingml/2006/main" noChangeAspect="1"/>
+            </wp:cNvGraphicFramePr>
+            <a:graphic xmlns:a="http://schemas.openxmlformats.org/drawingml/2006/main">
+              <a:graphicData uri="http://schemas.openxmlformats.org/drawingml/2006/picture">
+                <pic:pic xmlns:pic="http://schemas.openxmlformats.org/drawingml/2006/picture">
+                  <pic:nvPicPr>
+                    <pic:cNvPr id="619997465" name=""/>
+                    <pic:cNvPicPr/>
+                  </pic:nvPicPr>
+                  <pic:blipFill>
+                    <a:blip r:embed="rId100"/>
+                    <a:stretch>
+                      <a:fillRect/>
+                    </a:stretch>
+                  </pic:blipFill>
+                  <pic:spPr>
+                    <a:xfrm>
+                      <a:off x="0" y="0"/>
+                      <a:ext cx="4344006" cy="3219899"/>
+                    </a:xfrm>
+                    <a:prstGeom prst="rect">
+                      <a:avLst/>
+                    </a:prstGeom>
+                  </pic:spPr>
+                </pic:pic>
+              </a:graphicData>
+            </a:graphic>
+          </wp:inline>
+        </w:drawing>
+      </w:r>
+    </w:p>
+    <w:p/>
+    <w:p>
+      <w:r>
+        <w:lastRenderedPageBreak/>
+        <w:t>Q48.</w:t>
+      </w:r>
+    </w:p>
+    <w:p>
+      <w:r>
+        <w:drawing>
+          <wp:inline distT="0" distB="0" distL="0" distR="0" wp14:anchorId="2530E0D4" wp14:editId="5F2DF08B">
+            <wp:extent cx="5391902" cy="3200847"/>
+            <wp:effectExtent l="0" t="0" r="0" b="0"/>
+            <wp:docPr id="1779768386" name="Picture 1"/>
+            <wp:cNvGraphicFramePr>
+              <a:graphicFrameLocks xmlns:a="http://schemas.openxmlformats.org/drawingml/2006/main" noChangeAspect="1"/>
+            </wp:cNvGraphicFramePr>
+            <a:graphic xmlns:a="http://schemas.openxmlformats.org/drawingml/2006/main">
+              <a:graphicData uri="http://schemas.openxmlformats.org/drawingml/2006/picture">
+                <pic:pic xmlns:pic="http://schemas.openxmlformats.org/drawingml/2006/picture">
+                  <pic:nvPicPr>
+                    <pic:cNvPr id="1779768386" name=""/>
+                    <pic:cNvPicPr/>
+                  </pic:nvPicPr>
+                  <pic:blipFill>
+                    <a:blip r:embed="rId101"/>
+                    <a:stretch>
+                      <a:fillRect/>
+                    </a:stretch>
+                  </pic:blipFill>
+                  <pic:spPr>
+                    <a:xfrm>
+                      <a:off x="0" y="0"/>
+                      <a:ext cx="5391902" cy="3200847"/>
+                    </a:xfrm>
+                    <a:prstGeom prst="rect">
+                      <a:avLst/>
+                    </a:prstGeom>
+                  </pic:spPr>
+                </pic:pic>
+              </a:graphicData>
+            </a:graphic>
+          </wp:inline>
+        </w:drawing>
+      </w:r>
+    </w:p>
+    <w:p>
+      <w:r>
+        <w:t>Output.</w:t>
+      </w:r>
+    </w:p>
+    <w:p>
+      <w:r>
+        <w:drawing>
+          <wp:inline distT="0" distB="0" distL="0" distR="0" wp14:anchorId="53A91F39" wp14:editId="1A1FBD0E">
+            <wp:extent cx="4115374" cy="2991267"/>
+            <wp:effectExtent l="0" t="0" r="0" b="0"/>
+            <wp:docPr id="1658522565" name="Picture 1"/>
+            <wp:cNvGraphicFramePr>
+              <a:graphicFrameLocks xmlns:a="http://schemas.openxmlformats.org/drawingml/2006/main" noChangeAspect="1"/>
+            </wp:cNvGraphicFramePr>
+            <a:graphic xmlns:a="http://schemas.openxmlformats.org/drawingml/2006/main">
+              <a:graphicData uri="http://schemas.openxmlformats.org/drawingml/2006/picture">
+                <pic:pic xmlns:pic="http://schemas.openxmlformats.org/drawingml/2006/picture">
+                  <pic:nvPicPr>
+                    <pic:cNvPr id="1658522565" name=""/>
+                    <pic:cNvPicPr/>
+                  </pic:nvPicPr>
+                  <pic:blipFill>
+                    <a:blip r:embed="rId102"/>
+                    <a:stretch>
+                      <a:fillRect/>
+                    </a:stretch>
+                  </pic:blipFill>
+                  <pic:spPr>
+                    <a:xfrm>
+                      <a:off x="0" y="0"/>
+                      <a:ext cx="4115374" cy="2991267"/>
+                    </a:xfrm>
+                    <a:prstGeom prst="rect">
+                      <a:avLst/>
+                    </a:prstGeom>
+                  </pic:spPr>
+                </pic:pic>
+              </a:graphicData>
+            </a:graphic>
+          </wp:inline>
+        </w:drawing>
+      </w:r>
+    </w:p>
+    <w:p/>
+    <w:p/>
+    <w:p/>
+    <w:p/>
+    <w:p>
+      <w:r>
+        <w:lastRenderedPageBreak/>
+        <w:t>Q49.</w:t>
+      </w:r>
+    </w:p>
+    <w:p>
+      <w:r>
+        <w:drawing>
+          <wp:inline distT="0" distB="0" distL="0" distR="0" wp14:anchorId="6FF7A33A" wp14:editId="0A3DEDD2">
+            <wp:extent cx="5896798" cy="5058481"/>
+            <wp:effectExtent l="0" t="0" r="8890" b="8890"/>
+            <wp:docPr id="950487502" name="Picture 1"/>
+            <wp:cNvGraphicFramePr>
+              <a:graphicFrameLocks xmlns:a="http://schemas.openxmlformats.org/drawingml/2006/main" noChangeAspect="1"/>
+            </wp:cNvGraphicFramePr>
+            <a:graphic xmlns:a="http://schemas.openxmlformats.org/drawingml/2006/main">
+              <a:graphicData uri="http://schemas.openxmlformats.org/drawingml/2006/picture">
+                <pic:pic xmlns:pic="http://schemas.openxmlformats.org/drawingml/2006/picture">
+                  <pic:nvPicPr>
+                    <pic:cNvPr id="950487502" name=""/>
+                    <pic:cNvPicPr/>
+                  </pic:nvPicPr>
+                  <pic:blipFill>
+                    <a:blip r:embed="rId103"/>
+                    <a:stretch>
+                      <a:fillRect/>
+                    </a:stretch>
+                  </pic:blipFill>
+                  <pic:spPr>
+                    <a:xfrm>
+                      <a:off x="0" y="0"/>
+                      <a:ext cx="5896798" cy="5058481"/>
+                    </a:xfrm>
+                    <a:prstGeom prst="rect">
+                      <a:avLst/>
+                    </a:prstGeom>
+                  </pic:spPr>
+                </pic:pic>
+              </a:graphicData>
+            </a:graphic>
+          </wp:inline>
+        </w:drawing>
+      </w:r>
+    </w:p>
+    <w:p>
+      <w:r>
+        <w:t>Output.</w:t>
+      </w:r>
+    </w:p>
+    <w:p>
+      <w:r>
+        <w:drawing>
+          <wp:inline distT="0" distB="0" distL="0" distR="0" wp14:anchorId="16AC1D82" wp14:editId="0699F7A8">
+            <wp:extent cx="3028950" cy="2195018"/>
+            <wp:effectExtent l="0" t="0" r="0" b="0"/>
+            <wp:docPr id="50358140" name="Picture 1"/>
+            <wp:cNvGraphicFramePr>
+              <a:graphicFrameLocks xmlns:a="http://schemas.openxmlformats.org/drawingml/2006/main" noChangeAspect="1"/>
+            </wp:cNvGraphicFramePr>
+            <a:graphic xmlns:a="http://schemas.openxmlformats.org/drawingml/2006/main">
+              <a:graphicData uri="http://schemas.openxmlformats.org/drawingml/2006/picture">
+                <pic:pic xmlns:pic="http://schemas.openxmlformats.org/drawingml/2006/picture">
+                  <pic:nvPicPr>
+                    <pic:cNvPr id="50358140" name=""/>
+                    <pic:cNvPicPr/>
+                  </pic:nvPicPr>
+                  <pic:blipFill>
+                    <a:blip r:embed="rId104"/>
+                    <a:stretch>
+                      <a:fillRect/>
+                    </a:stretch>
+                  </pic:blipFill>
+                  <pic:spPr>
+                    <a:xfrm>
+                      <a:off x="0" y="0"/>
+                      <a:ext cx="3036727" cy="2200654"/>
+                    </a:xfrm>
+                    <a:prstGeom prst="rect">
+                      <a:avLst/>
+                    </a:prstGeom>
+                  </pic:spPr>
+                </pic:pic>
+              </a:graphicData>
+            </a:graphic>
+          </wp:inline>
+        </w:drawing>
+      </w:r>
+    </w:p>
+    <w:p>
+      <w:r>
+        <w:lastRenderedPageBreak/>
+        <w:t>Q50.</w:t>
+      </w:r>
+    </w:p>
+    <w:p>
+      <w:r>
+        <w:drawing>
+          <wp:inline distT="0" distB="0" distL="0" distR="0" wp14:anchorId="0063B2C1" wp14:editId="45F2DAA9">
+            <wp:extent cx="5943600" cy="5292725"/>
+            <wp:effectExtent l="0" t="0" r="0" b="3175"/>
+            <wp:docPr id="1926361024" name="Picture 1"/>
+            <wp:cNvGraphicFramePr>
+              <a:graphicFrameLocks xmlns:a="http://schemas.openxmlformats.org/drawingml/2006/main" noChangeAspect="1"/>
+            </wp:cNvGraphicFramePr>
+            <a:graphic xmlns:a="http://schemas.openxmlformats.org/drawingml/2006/main">
+              <a:graphicData uri="http://schemas.openxmlformats.org/drawingml/2006/picture">
+                <pic:pic xmlns:pic="http://schemas.openxmlformats.org/drawingml/2006/picture">
+                  <pic:nvPicPr>
+                    <pic:cNvPr id="1926361024" name=""/>
+                    <pic:cNvPicPr/>
+                  </pic:nvPicPr>
+                  <pic:blipFill>
+                    <a:blip r:embed="rId105"/>
+                    <a:stretch>
+                      <a:fillRect/>
+                    </a:stretch>
+                  </pic:blipFill>
+                  <pic:spPr>
+                    <a:xfrm>
+                      <a:off x="0" y="0"/>
+                      <a:ext cx="5943600" cy="5292725"/>
+                    </a:xfrm>
+                    <a:prstGeom prst="rect">
+                      <a:avLst/>
+                    </a:prstGeom>
+                  </pic:spPr>
+                </pic:pic>
+              </a:graphicData>
+            </a:graphic>
+          </wp:inline>
+        </w:drawing>
+      </w:r>
+    </w:p>
+    <w:p>
+      <w:r>
+        <w:t>Output.</w:t>
+      </w:r>
+    </w:p>
+    <w:p>
+      <w:r>
+        <w:drawing>
+          <wp:anchor distT="0" distB="0" distL="114300" distR="114300" simplePos="0" relativeHeight="251661312" behindDoc="0" locked="0" layoutInCell="1" allowOverlap="1" wp14:anchorId="6A5AD6A8" wp14:editId="0D92B8A8">
+            <wp:simplePos x="0" y="0"/>
+            <wp:positionH relativeFrom="column">
+              <wp:posOffset>0</wp:posOffset>
+            </wp:positionH>
+            <wp:positionV relativeFrom="paragraph">
+              <wp:posOffset>-3175</wp:posOffset>
+            </wp:positionV>
+            <wp:extent cx="2876550" cy="1940749"/>
+            <wp:effectExtent l="0" t="0" r="0" b="2540"/>
+            <wp:wrapSquare wrapText="bothSides"/>
+            <wp:docPr id="870063447" name="Picture 1"/>
+            <wp:cNvGraphicFramePr>
+              <a:graphicFrameLocks xmlns:a="http://schemas.openxmlformats.org/drawingml/2006/main" noChangeAspect="1"/>
+            </wp:cNvGraphicFramePr>
+            <a:graphic xmlns:a="http://schemas.openxmlformats.org/drawingml/2006/main">
+              <a:graphicData uri="http://schemas.openxmlformats.org/drawingml/2006/picture">
+                <pic:pic xmlns:pic="http://schemas.openxmlformats.org/drawingml/2006/picture">
+                  <pic:nvPicPr>
+                    <pic:cNvPr id="870063447" name=""/>
+                    <pic:cNvPicPr/>
+                  </pic:nvPicPr>
+                  <pic:blipFill>
+                    <a:blip r:embed="rId106">
+                      <a:extLst>
+                        <a:ext uri="{28A0092B-C50C-407E-A947-70E740481C1C}">
+                          <a14:useLocalDpi xmlns:a14="http://schemas.microsoft.com/office/drawing/2010/main" val="0"/>
+                        </a:ext>
+                      </a:extLst>
+                    </a:blip>
+                    <a:stretch>
+                      <a:fillRect/>
+                    </a:stretch>
+                  </pic:blipFill>
+                  <pic:spPr>
+                    <a:xfrm>
+                      <a:off x="0" y="0"/>
+                      <a:ext cx="2876550" cy="1940749"/>
+                    </a:xfrm>
+                    <a:prstGeom prst="rect">
+                      <a:avLst/>
+                    </a:prstGeom>
+                  </pic:spPr>
+                </pic:pic>
+              </a:graphicData>
+            </a:graphic>
+          </wp:anchor>
+        </w:drawing>
+      </w:r>
+    </w:p>
+    <w:p/>
+    <w:p/>
+    <w:p/>
+    <w:p/>
+    <w:p/>
+    <w:p/>
+    <w:p/>
+    <w:p>
+      <w:r>
+        <w:drawing>
+          <wp:inline distT="0" distB="0" distL="0" distR="0" wp14:anchorId="25FC5A5A" wp14:editId="5D22F86C">
+            <wp:extent cx="5410955" cy="2972215"/>
+            <wp:effectExtent l="0" t="0" r="0" b="0"/>
+            <wp:docPr id="647770870" name="Picture 1"/>
+            <wp:cNvGraphicFramePr>
+              <a:graphicFrameLocks xmlns:a="http://schemas.openxmlformats.org/drawingml/2006/main" noChangeAspect="1"/>
+            </wp:cNvGraphicFramePr>
+            <a:graphic xmlns:a="http://schemas.openxmlformats.org/drawingml/2006/main">
+              <a:graphicData uri="http://schemas.openxmlformats.org/drawingml/2006/picture">
+                <pic:pic xmlns:pic="http://schemas.openxmlformats.org/drawingml/2006/picture">
+                  <pic:nvPicPr>
+                    <pic:cNvPr id="647770870" name=""/>
+                    <pic:cNvPicPr/>
+                  </pic:nvPicPr>
+                  <pic:blipFill>
+                    <a:blip r:embed="rId107"/>
+                    <a:stretch>
+                      <a:fillRect/>
+                    </a:stretch>
+                  </pic:blipFill>
+                  <pic:spPr>
+                    <a:xfrm>
+                      <a:off x="0" y="0"/>
+                      <a:ext cx="5410955" cy="2972215"/>
+                    </a:xfrm>
+                    <a:prstGeom prst="rect">
+                      <a:avLst/>
+                    </a:prstGeom>
+                  </pic:spPr>
+                </pic:pic>
+              </a:graphicData>
+            </a:graphic>
+          </wp:inline>
+        </w:drawing>
+      </w:r>
+    </w:p>
+    <w:p>
+      <w:r>
+        <w:drawing>
+          <wp:inline distT="0" distB="0" distL="0" distR="0" wp14:anchorId="57645908" wp14:editId="3FB86AF6">
+            <wp:extent cx="4982270" cy="2829320"/>
+            <wp:effectExtent l="0" t="0" r="0" b="9525"/>
+            <wp:docPr id="1803494236" name="Picture 1"/>
+            <wp:cNvGraphicFramePr>
+              <a:graphicFrameLocks xmlns:a="http://schemas.openxmlformats.org/drawingml/2006/main" noChangeAspect="1"/>
+            </wp:cNvGraphicFramePr>
+            <a:graphic xmlns:a="http://schemas.openxmlformats.org/drawingml/2006/main">
+              <a:graphicData uri="http://schemas.openxmlformats.org/drawingml/2006/picture">
+                <pic:pic xmlns:pic="http://schemas.openxmlformats.org/drawingml/2006/picture">
+                  <pic:nvPicPr>
+                    <pic:cNvPr id="1803494236" name=""/>
+                    <pic:cNvPicPr/>
+                  </pic:nvPicPr>
+                  <pic:blipFill>
+                    <a:blip r:embed="rId108"/>
+                    <a:stretch>
+                      <a:fillRect/>
+                    </a:stretch>
+                  </pic:blipFill>
+                  <pic:spPr>
+                    <a:xfrm>
+                      <a:off x="0" y="0"/>
+                      <a:ext cx="4982270" cy="2829320"/>
+                    </a:xfrm>
+                    <a:prstGeom prst="rect">
+                      <a:avLst/>
+                    </a:prstGeom>
+                  </pic:spPr>
+                </pic:pic>
+              </a:graphicData>
+            </a:graphic>
+          </wp:inline>
+        </w:drawing>
+      </w:r>
+    </w:p>
     <w:p/>
     <w:p/>
     <w:p/>
@@ -2520,6 +6275,837 @@
 <file path=word/numbering.xml><?xml version="1.0" encoding="utf-8"?>
 <w:numbering xmlns:wpc="http://schemas.microsoft.com/office/word/2010/wordprocessingCanvas" xmlns:cx="http://schemas.microsoft.com/office/drawing/2014/chartex" xmlns:cx1="http://schemas.microsoft.com/office/drawing/2015/9/8/chartex" xmlns:cx2="http://schemas.microsoft.com/office/drawing/2015/10/21/chartex" xmlns:cx3="http://schemas.microsoft.com/office/drawing/2016/5/9/chartex" xmlns:cx4="http://schemas.microsoft.com/office/drawing/2016/5/10/chartex" xmlns:cx5="http://schemas.microsoft.com/office/drawing/2016/5/11/chartex" xmlns:cx6="http://schemas.microsoft.com/office/drawing/2016/5/12/chartex" xmlns:cx7="http://schemas.microsoft.com/office/drawing/2016/5/13/chartex" xmlns:cx8="http://schemas.microsoft.com/office/drawing/2016/5/14/chartex" xmlns:mc="http://schemas.openxmlformats.org/markup-compatibility/2006" xmlns:aink="http://schemas.microsoft.com/office/drawing/2016/ink" xmlns:am3d="http://schemas.microsoft.com/office/drawing/2017/model3d" xmlns:o="urn:schemas-microsoft-com:office:office" xmlns:oel="http://schemas.microsoft.com/office/2019/extlst" xmlns:r="http://schemas.openxmlformats.org/officeDocument/2006/relationships" xmlns:m="http://schemas.openxmlformats.org/officeDocument/2006/math" xmlns:v="urn:schemas-microsoft-com:vml" xmlns:wp14="http://schemas.microsoft.com/office/word/2010/wordprocessingDrawing" xmlns:wp="http://schemas.openxmlformats.org/drawingml/2006/wordprocessingDrawing" xmlns:w10="urn:schemas-microsoft-com:office:word" xmlns:w="http://schemas.openxmlformats.org/wordprocessingml/2006/main" xmlns:w14="http://schemas.microsoft.com/office/word/2010/wordml" xmlns:w15="http://schemas.microsoft.com/office/word/2012/wordml" xmlns:w16cex="http://schemas.microsoft.com/office/word/2018/wordml/cex" xmlns:w16cid="http://schemas.microsoft.com/office/word/2016/wordml/cid" xmlns:w16="http://schemas.microsoft.com/office/word/2018/wordml" xmlns:w16du="http://schemas.microsoft.com/office/word/2023/wordml/word16du" xmlns:w16sdtdh="http://schemas.microsoft.com/office/word/2020/wordml/sdtdatahash" xmlns:w16sdtfl="http://schemas.microsoft.com/office/word/2024/wordml/sdtformatlock" xmlns:w16se="http://schemas.microsoft.com/office/word/2015/wordml/symex" xmlns:wpg="http://schemas.microsoft.com/office/word/2010/wordprocessingGroup" xmlns:wpi="http://schemas.microsoft.com/office/word/2010/wordprocessingInk" xmlns:wne="http://schemas.microsoft.com/office/word/2006/wordml" xmlns:wps="http://schemas.microsoft.com/office/word/2010/wordprocessingShape" mc:Ignorable="w14 w15 w16se w16cid w16 w16cex w16sdtdh w16sdtfl w16du wp14">
   <w:abstractNum w:abstractNumId="0" w15:restartNumberingAfterBreak="0">
+    <w:nsid w:val="124647F9"/>
+    <w:multiLevelType w:val="hybridMultilevel"/>
+    <w:tmpl w:val="0B26F854"/>
+    <w:lvl w:ilvl="0" w:tplc="56661326">
+      <w:start w:val="1"/>
+      <w:numFmt w:val="lowerLetter"/>
+      <w:lvlText w:val="%1."/>
+      <w:lvlJc w:val="left"/>
+      <w:pPr>
+        <w:ind w:left="1080" w:hanging="720"/>
+      </w:pPr>
+    </w:lvl>
+    <w:lvl w:ilvl="1" w:tplc="04090019">
+      <w:start w:val="1"/>
+      <w:numFmt w:val="lowerLetter"/>
+      <w:lvlText w:val="%2."/>
+      <w:lvlJc w:val="left"/>
+      <w:pPr>
+        <w:ind w:left="1440" w:hanging="360"/>
+      </w:pPr>
+    </w:lvl>
+    <w:lvl w:ilvl="2" w:tplc="0409001B">
+      <w:start w:val="1"/>
+      <w:numFmt w:val="lowerRoman"/>
+      <w:lvlText w:val="%3."/>
+      <w:lvlJc w:val="right"/>
+      <w:pPr>
+        <w:ind w:left="2160" w:hanging="180"/>
+      </w:pPr>
+    </w:lvl>
+    <w:lvl w:ilvl="3" w:tplc="0409000F">
+      <w:start w:val="1"/>
+      <w:numFmt w:val="decimal"/>
+      <w:lvlText w:val="%4."/>
+      <w:lvlJc w:val="left"/>
+      <w:pPr>
+        <w:ind w:left="2880" w:hanging="360"/>
+      </w:pPr>
+    </w:lvl>
+    <w:lvl w:ilvl="4" w:tplc="04090019">
+      <w:start w:val="1"/>
+      <w:numFmt w:val="lowerLetter"/>
+      <w:lvlText w:val="%5."/>
+      <w:lvlJc w:val="left"/>
+      <w:pPr>
+        <w:ind w:left="3600" w:hanging="360"/>
+      </w:pPr>
+    </w:lvl>
+    <w:lvl w:ilvl="5" w:tplc="0409001B">
+      <w:start w:val="1"/>
+      <w:numFmt w:val="lowerRoman"/>
+      <w:lvlText w:val="%6."/>
+      <w:lvlJc w:val="right"/>
+      <w:pPr>
+        <w:ind w:left="4320" w:hanging="180"/>
+      </w:pPr>
+    </w:lvl>
+    <w:lvl w:ilvl="6" w:tplc="0409000F">
+      <w:start w:val="1"/>
+      <w:numFmt w:val="decimal"/>
+      <w:lvlText w:val="%7."/>
+      <w:lvlJc w:val="left"/>
+      <w:pPr>
+        <w:ind w:left="5040" w:hanging="360"/>
+      </w:pPr>
+    </w:lvl>
+    <w:lvl w:ilvl="7" w:tplc="04090019">
+      <w:start w:val="1"/>
+      <w:numFmt w:val="lowerLetter"/>
+      <w:lvlText w:val="%8."/>
+      <w:lvlJc w:val="left"/>
+      <w:pPr>
+        <w:ind w:left="5760" w:hanging="360"/>
+      </w:pPr>
+    </w:lvl>
+    <w:lvl w:ilvl="8" w:tplc="0409001B">
+      <w:start w:val="1"/>
+      <w:numFmt w:val="lowerRoman"/>
+      <w:lvlText w:val="%9."/>
+      <w:lvlJc w:val="right"/>
+      <w:pPr>
+        <w:ind w:left="6480" w:hanging="180"/>
+      </w:pPr>
+    </w:lvl>
+  </w:abstractNum>
+  <w:abstractNum w:abstractNumId="1" w15:restartNumberingAfterBreak="0">
+    <w:nsid w:val="370B5176"/>
+    <w:multiLevelType w:val="multilevel"/>
+    <w:tmpl w:val="B482915A"/>
+    <w:lvl w:ilvl="0">
+      <w:start w:val="1"/>
+      <w:numFmt w:val="bullet"/>
+      <w:lvlText w:val=""/>
+      <w:lvlJc w:val="left"/>
+      <w:pPr>
+        <w:tabs>
+          <w:tab w:val="num" w:pos="720"/>
+        </w:tabs>
+        <w:ind w:left="720" w:hanging="360"/>
+      </w:pPr>
+      <w:rPr>
+        <w:rFonts w:ascii="Symbol" w:hAnsi="Symbol" w:hint="default"/>
+        <w:sz w:val="20"/>
+      </w:rPr>
+    </w:lvl>
+    <w:lvl w:ilvl="1">
+      <w:start w:val="1"/>
+      <w:numFmt w:val="bullet"/>
+      <w:lvlText w:val="o"/>
+      <w:lvlJc w:val="left"/>
+      <w:pPr>
+        <w:tabs>
+          <w:tab w:val="num" w:pos="1440"/>
+        </w:tabs>
+        <w:ind w:left="1440" w:hanging="360"/>
+      </w:pPr>
+      <w:rPr>
+        <w:rFonts w:ascii="Courier New" w:hAnsi="Courier New" w:cs="Times New Roman" w:hint="default"/>
+        <w:sz w:val="20"/>
+      </w:rPr>
+    </w:lvl>
+    <w:lvl w:ilvl="2">
+      <w:start w:val="1"/>
+      <w:numFmt w:val="bullet"/>
+      <w:lvlText w:val=""/>
+      <w:lvlJc w:val="left"/>
+      <w:pPr>
+        <w:tabs>
+          <w:tab w:val="num" w:pos="2160"/>
+        </w:tabs>
+        <w:ind w:left="2160" w:hanging="360"/>
+      </w:pPr>
+      <w:rPr>
+        <w:rFonts w:ascii="Wingdings" w:hAnsi="Wingdings" w:hint="default"/>
+        <w:sz w:val="20"/>
+      </w:rPr>
+    </w:lvl>
+    <w:lvl w:ilvl="3">
+      <w:start w:val="1"/>
+      <w:numFmt w:val="bullet"/>
+      <w:lvlText w:val=""/>
+      <w:lvlJc w:val="left"/>
+      <w:pPr>
+        <w:tabs>
+          <w:tab w:val="num" w:pos="2880"/>
+        </w:tabs>
+        <w:ind w:left="2880" w:hanging="360"/>
+      </w:pPr>
+      <w:rPr>
+        <w:rFonts w:ascii="Wingdings" w:hAnsi="Wingdings" w:hint="default"/>
+        <w:sz w:val="20"/>
+      </w:rPr>
+    </w:lvl>
+    <w:lvl w:ilvl="4">
+      <w:start w:val="1"/>
+      <w:numFmt w:val="bullet"/>
+      <w:lvlText w:val=""/>
+      <w:lvlJc w:val="left"/>
+      <w:pPr>
+        <w:tabs>
+          <w:tab w:val="num" w:pos="3600"/>
+        </w:tabs>
+        <w:ind w:left="3600" w:hanging="360"/>
+      </w:pPr>
+      <w:rPr>
+        <w:rFonts w:ascii="Wingdings" w:hAnsi="Wingdings" w:hint="default"/>
+        <w:sz w:val="20"/>
+      </w:rPr>
+    </w:lvl>
+    <w:lvl w:ilvl="5">
+      <w:start w:val="1"/>
+      <w:numFmt w:val="bullet"/>
+      <w:lvlText w:val=""/>
+      <w:lvlJc w:val="left"/>
+      <w:pPr>
+        <w:tabs>
+          <w:tab w:val="num" w:pos="4320"/>
+        </w:tabs>
+        <w:ind w:left="4320" w:hanging="360"/>
+      </w:pPr>
+      <w:rPr>
+        <w:rFonts w:ascii="Wingdings" w:hAnsi="Wingdings" w:hint="default"/>
+        <w:sz w:val="20"/>
+      </w:rPr>
+    </w:lvl>
+    <w:lvl w:ilvl="6">
+      <w:start w:val="1"/>
+      <w:numFmt w:val="bullet"/>
+      <w:lvlText w:val=""/>
+      <w:lvlJc w:val="left"/>
+      <w:pPr>
+        <w:tabs>
+          <w:tab w:val="num" w:pos="5040"/>
+        </w:tabs>
+        <w:ind w:left="5040" w:hanging="360"/>
+      </w:pPr>
+      <w:rPr>
+        <w:rFonts w:ascii="Wingdings" w:hAnsi="Wingdings" w:hint="default"/>
+        <w:sz w:val="20"/>
+      </w:rPr>
+    </w:lvl>
+    <w:lvl w:ilvl="7">
+      <w:start w:val="1"/>
+      <w:numFmt w:val="bullet"/>
+      <w:lvlText w:val=""/>
+      <w:lvlJc w:val="left"/>
+      <w:pPr>
+        <w:tabs>
+          <w:tab w:val="num" w:pos="5760"/>
+        </w:tabs>
+        <w:ind w:left="5760" w:hanging="360"/>
+      </w:pPr>
+      <w:rPr>
+        <w:rFonts w:ascii="Wingdings" w:hAnsi="Wingdings" w:hint="default"/>
+        <w:sz w:val="20"/>
+      </w:rPr>
+    </w:lvl>
+    <w:lvl w:ilvl="8">
+      <w:start w:val="1"/>
+      <w:numFmt w:val="bullet"/>
+      <w:lvlText w:val=""/>
+      <w:lvlJc w:val="left"/>
+      <w:pPr>
+        <w:tabs>
+          <w:tab w:val="num" w:pos="6480"/>
+        </w:tabs>
+        <w:ind w:left="6480" w:hanging="360"/>
+      </w:pPr>
+      <w:rPr>
+        <w:rFonts w:ascii="Wingdings" w:hAnsi="Wingdings" w:hint="default"/>
+        <w:sz w:val="20"/>
+      </w:rPr>
+    </w:lvl>
+  </w:abstractNum>
+  <w:abstractNum w:abstractNumId="2" w15:restartNumberingAfterBreak="0">
+    <w:nsid w:val="3A174FE0"/>
+    <w:multiLevelType w:val="multilevel"/>
+    <w:tmpl w:val="0A7444C6"/>
+    <w:lvl w:ilvl="0">
+      <w:start w:val="1"/>
+      <w:numFmt w:val="bullet"/>
+      <w:lvlText w:val=""/>
+      <w:lvlJc w:val="left"/>
+      <w:pPr>
+        <w:tabs>
+          <w:tab w:val="num" w:pos="720"/>
+        </w:tabs>
+        <w:ind w:left="720" w:hanging="360"/>
+      </w:pPr>
+      <w:rPr>
+        <w:rFonts w:ascii="Symbol" w:hAnsi="Symbol" w:hint="default"/>
+        <w:sz w:val="20"/>
+      </w:rPr>
+    </w:lvl>
+    <w:lvl w:ilvl="1">
+      <w:start w:val="1"/>
+      <w:numFmt w:val="bullet"/>
+      <w:lvlText w:val="o"/>
+      <w:lvlJc w:val="left"/>
+      <w:pPr>
+        <w:tabs>
+          <w:tab w:val="num" w:pos="1440"/>
+        </w:tabs>
+        <w:ind w:left="1440" w:hanging="360"/>
+      </w:pPr>
+      <w:rPr>
+        <w:rFonts w:ascii="Courier New" w:hAnsi="Courier New" w:cs="Times New Roman" w:hint="default"/>
+        <w:sz w:val="20"/>
+      </w:rPr>
+    </w:lvl>
+    <w:lvl w:ilvl="2">
+      <w:start w:val="1"/>
+      <w:numFmt w:val="bullet"/>
+      <w:lvlText w:val=""/>
+      <w:lvlJc w:val="left"/>
+      <w:pPr>
+        <w:tabs>
+          <w:tab w:val="num" w:pos="2160"/>
+        </w:tabs>
+        <w:ind w:left="2160" w:hanging="360"/>
+      </w:pPr>
+      <w:rPr>
+        <w:rFonts w:ascii="Wingdings" w:hAnsi="Wingdings" w:hint="default"/>
+        <w:sz w:val="20"/>
+      </w:rPr>
+    </w:lvl>
+    <w:lvl w:ilvl="3">
+      <w:start w:val="1"/>
+      <w:numFmt w:val="bullet"/>
+      <w:lvlText w:val=""/>
+      <w:lvlJc w:val="left"/>
+      <w:pPr>
+        <w:tabs>
+          <w:tab w:val="num" w:pos="2880"/>
+        </w:tabs>
+        <w:ind w:left="2880" w:hanging="360"/>
+      </w:pPr>
+      <w:rPr>
+        <w:rFonts w:ascii="Wingdings" w:hAnsi="Wingdings" w:hint="default"/>
+        <w:sz w:val="20"/>
+      </w:rPr>
+    </w:lvl>
+    <w:lvl w:ilvl="4">
+      <w:start w:val="1"/>
+      <w:numFmt w:val="bullet"/>
+      <w:lvlText w:val=""/>
+      <w:lvlJc w:val="left"/>
+      <w:pPr>
+        <w:tabs>
+          <w:tab w:val="num" w:pos="3600"/>
+        </w:tabs>
+        <w:ind w:left="3600" w:hanging="360"/>
+      </w:pPr>
+      <w:rPr>
+        <w:rFonts w:ascii="Wingdings" w:hAnsi="Wingdings" w:hint="default"/>
+        <w:sz w:val="20"/>
+      </w:rPr>
+    </w:lvl>
+    <w:lvl w:ilvl="5">
+      <w:start w:val="1"/>
+      <w:numFmt w:val="bullet"/>
+      <w:lvlText w:val=""/>
+      <w:lvlJc w:val="left"/>
+      <w:pPr>
+        <w:tabs>
+          <w:tab w:val="num" w:pos="4320"/>
+        </w:tabs>
+        <w:ind w:left="4320" w:hanging="360"/>
+      </w:pPr>
+      <w:rPr>
+        <w:rFonts w:ascii="Wingdings" w:hAnsi="Wingdings" w:hint="default"/>
+        <w:sz w:val="20"/>
+      </w:rPr>
+    </w:lvl>
+    <w:lvl w:ilvl="6">
+      <w:start w:val="1"/>
+      <w:numFmt w:val="bullet"/>
+      <w:lvlText w:val=""/>
+      <w:lvlJc w:val="left"/>
+      <w:pPr>
+        <w:tabs>
+          <w:tab w:val="num" w:pos="5040"/>
+        </w:tabs>
+        <w:ind w:left="5040" w:hanging="360"/>
+      </w:pPr>
+      <w:rPr>
+        <w:rFonts w:ascii="Wingdings" w:hAnsi="Wingdings" w:hint="default"/>
+        <w:sz w:val="20"/>
+      </w:rPr>
+    </w:lvl>
+    <w:lvl w:ilvl="7">
+      <w:start w:val="1"/>
+      <w:numFmt w:val="bullet"/>
+      <w:lvlText w:val=""/>
+      <w:lvlJc w:val="left"/>
+      <w:pPr>
+        <w:tabs>
+          <w:tab w:val="num" w:pos="5760"/>
+        </w:tabs>
+        <w:ind w:left="5760" w:hanging="360"/>
+      </w:pPr>
+      <w:rPr>
+        <w:rFonts w:ascii="Wingdings" w:hAnsi="Wingdings" w:hint="default"/>
+        <w:sz w:val="20"/>
+      </w:rPr>
+    </w:lvl>
+    <w:lvl w:ilvl="8">
+      <w:start w:val="1"/>
+      <w:numFmt w:val="bullet"/>
+      <w:lvlText w:val=""/>
+      <w:lvlJc w:val="left"/>
+      <w:pPr>
+        <w:tabs>
+          <w:tab w:val="num" w:pos="6480"/>
+        </w:tabs>
+        <w:ind w:left="6480" w:hanging="360"/>
+      </w:pPr>
+      <w:rPr>
+        <w:rFonts w:ascii="Wingdings" w:hAnsi="Wingdings" w:hint="default"/>
+        <w:sz w:val="20"/>
+      </w:rPr>
+    </w:lvl>
+  </w:abstractNum>
+  <w:abstractNum w:abstractNumId="3" w15:restartNumberingAfterBreak="0">
+    <w:nsid w:val="540E56B9"/>
+    <w:multiLevelType w:val="multilevel"/>
+    <w:tmpl w:val="95208EFE"/>
+    <w:lvl w:ilvl="0">
+      <w:start w:val="1"/>
+      <w:numFmt w:val="bullet"/>
+      <w:lvlText w:val=""/>
+      <w:lvlJc w:val="left"/>
+      <w:pPr>
+        <w:tabs>
+          <w:tab w:val="num" w:pos="720"/>
+        </w:tabs>
+        <w:ind w:left="720" w:hanging="360"/>
+      </w:pPr>
+      <w:rPr>
+        <w:rFonts w:ascii="Symbol" w:hAnsi="Symbol" w:hint="default"/>
+        <w:sz w:val="20"/>
+      </w:rPr>
+    </w:lvl>
+    <w:lvl w:ilvl="1">
+      <w:start w:val="1"/>
+      <w:numFmt w:val="bullet"/>
+      <w:lvlText w:val="o"/>
+      <w:lvlJc w:val="left"/>
+      <w:pPr>
+        <w:tabs>
+          <w:tab w:val="num" w:pos="1440"/>
+        </w:tabs>
+        <w:ind w:left="1440" w:hanging="360"/>
+      </w:pPr>
+      <w:rPr>
+        <w:rFonts w:ascii="Courier New" w:hAnsi="Courier New" w:cs="Times New Roman" w:hint="default"/>
+        <w:sz w:val="20"/>
+      </w:rPr>
+    </w:lvl>
+    <w:lvl w:ilvl="2">
+      <w:start w:val="1"/>
+      <w:numFmt w:val="bullet"/>
+      <w:lvlText w:val=""/>
+      <w:lvlJc w:val="left"/>
+      <w:pPr>
+        <w:tabs>
+          <w:tab w:val="num" w:pos="2160"/>
+        </w:tabs>
+        <w:ind w:left="2160" w:hanging="360"/>
+      </w:pPr>
+      <w:rPr>
+        <w:rFonts w:ascii="Wingdings" w:hAnsi="Wingdings" w:hint="default"/>
+        <w:sz w:val="20"/>
+      </w:rPr>
+    </w:lvl>
+    <w:lvl w:ilvl="3">
+      <w:start w:val="1"/>
+      <w:numFmt w:val="bullet"/>
+      <w:lvlText w:val=""/>
+      <w:lvlJc w:val="left"/>
+      <w:pPr>
+        <w:tabs>
+          <w:tab w:val="num" w:pos="2880"/>
+        </w:tabs>
+        <w:ind w:left="2880" w:hanging="360"/>
+      </w:pPr>
+      <w:rPr>
+        <w:rFonts w:ascii="Wingdings" w:hAnsi="Wingdings" w:hint="default"/>
+        <w:sz w:val="20"/>
+      </w:rPr>
+    </w:lvl>
+    <w:lvl w:ilvl="4">
+      <w:start w:val="1"/>
+      <w:numFmt w:val="bullet"/>
+      <w:lvlText w:val=""/>
+      <w:lvlJc w:val="left"/>
+      <w:pPr>
+        <w:tabs>
+          <w:tab w:val="num" w:pos="3600"/>
+        </w:tabs>
+        <w:ind w:left="3600" w:hanging="360"/>
+      </w:pPr>
+      <w:rPr>
+        <w:rFonts w:ascii="Wingdings" w:hAnsi="Wingdings" w:hint="default"/>
+        <w:sz w:val="20"/>
+      </w:rPr>
+    </w:lvl>
+    <w:lvl w:ilvl="5">
+      <w:start w:val="1"/>
+      <w:numFmt w:val="bullet"/>
+      <w:lvlText w:val=""/>
+      <w:lvlJc w:val="left"/>
+      <w:pPr>
+        <w:tabs>
+          <w:tab w:val="num" w:pos="4320"/>
+        </w:tabs>
+        <w:ind w:left="4320" w:hanging="360"/>
+      </w:pPr>
+      <w:rPr>
+        <w:rFonts w:ascii="Wingdings" w:hAnsi="Wingdings" w:hint="default"/>
+        <w:sz w:val="20"/>
+      </w:rPr>
+    </w:lvl>
+    <w:lvl w:ilvl="6">
+      <w:start w:val="1"/>
+      <w:numFmt w:val="bullet"/>
+      <w:lvlText w:val=""/>
+      <w:lvlJc w:val="left"/>
+      <w:pPr>
+        <w:tabs>
+          <w:tab w:val="num" w:pos="5040"/>
+        </w:tabs>
+        <w:ind w:left="5040" w:hanging="360"/>
+      </w:pPr>
+      <w:rPr>
+        <w:rFonts w:ascii="Wingdings" w:hAnsi="Wingdings" w:hint="default"/>
+        <w:sz w:val="20"/>
+      </w:rPr>
+    </w:lvl>
+    <w:lvl w:ilvl="7">
+      <w:start w:val="1"/>
+      <w:numFmt w:val="bullet"/>
+      <w:lvlText w:val=""/>
+      <w:lvlJc w:val="left"/>
+      <w:pPr>
+        <w:tabs>
+          <w:tab w:val="num" w:pos="5760"/>
+        </w:tabs>
+        <w:ind w:left="5760" w:hanging="360"/>
+      </w:pPr>
+      <w:rPr>
+        <w:rFonts w:ascii="Wingdings" w:hAnsi="Wingdings" w:hint="default"/>
+        <w:sz w:val="20"/>
+      </w:rPr>
+    </w:lvl>
+    <w:lvl w:ilvl="8">
+      <w:start w:val="1"/>
+      <w:numFmt w:val="bullet"/>
+      <w:lvlText w:val=""/>
+      <w:lvlJc w:val="left"/>
+      <w:pPr>
+        <w:tabs>
+          <w:tab w:val="num" w:pos="6480"/>
+        </w:tabs>
+        <w:ind w:left="6480" w:hanging="360"/>
+      </w:pPr>
+      <w:rPr>
+        <w:rFonts w:ascii="Wingdings" w:hAnsi="Wingdings" w:hint="default"/>
+        <w:sz w:val="20"/>
+      </w:rPr>
+    </w:lvl>
+  </w:abstractNum>
+  <w:abstractNum w:abstractNumId="4" w15:restartNumberingAfterBreak="0">
+    <w:nsid w:val="559B5592"/>
+    <w:multiLevelType w:val="multilevel"/>
+    <w:tmpl w:val="F6B63DD6"/>
+    <w:lvl w:ilvl="0">
+      <w:start w:val="1"/>
+      <w:numFmt w:val="bullet"/>
+      <w:lvlText w:val=""/>
+      <w:lvlJc w:val="left"/>
+      <w:pPr>
+        <w:tabs>
+          <w:tab w:val="num" w:pos="720"/>
+        </w:tabs>
+        <w:ind w:left="720" w:hanging="360"/>
+      </w:pPr>
+      <w:rPr>
+        <w:rFonts w:ascii="Symbol" w:hAnsi="Symbol" w:hint="default"/>
+        <w:sz w:val="20"/>
+      </w:rPr>
+    </w:lvl>
+    <w:lvl w:ilvl="1">
+      <w:start w:val="1"/>
+      <w:numFmt w:val="bullet"/>
+      <w:lvlText w:val="o"/>
+      <w:lvlJc w:val="left"/>
+      <w:pPr>
+        <w:tabs>
+          <w:tab w:val="num" w:pos="1440"/>
+        </w:tabs>
+        <w:ind w:left="1440" w:hanging="360"/>
+      </w:pPr>
+      <w:rPr>
+        <w:rFonts w:ascii="Courier New" w:hAnsi="Courier New" w:cs="Times New Roman" w:hint="default"/>
+        <w:sz w:val="20"/>
+      </w:rPr>
+    </w:lvl>
+    <w:lvl w:ilvl="2">
+      <w:start w:val="1"/>
+      <w:numFmt w:val="bullet"/>
+      <w:lvlText w:val=""/>
+      <w:lvlJc w:val="left"/>
+      <w:pPr>
+        <w:tabs>
+          <w:tab w:val="num" w:pos="2160"/>
+        </w:tabs>
+        <w:ind w:left="2160" w:hanging="360"/>
+      </w:pPr>
+      <w:rPr>
+        <w:rFonts w:ascii="Wingdings" w:hAnsi="Wingdings" w:hint="default"/>
+        <w:sz w:val="20"/>
+      </w:rPr>
+    </w:lvl>
+    <w:lvl w:ilvl="3">
+      <w:start w:val="1"/>
+      <w:numFmt w:val="bullet"/>
+      <w:lvlText w:val=""/>
+      <w:lvlJc w:val="left"/>
+      <w:pPr>
+        <w:tabs>
+          <w:tab w:val="num" w:pos="2880"/>
+        </w:tabs>
+        <w:ind w:left="2880" w:hanging="360"/>
+      </w:pPr>
+      <w:rPr>
+        <w:rFonts w:ascii="Wingdings" w:hAnsi="Wingdings" w:hint="default"/>
+        <w:sz w:val="20"/>
+      </w:rPr>
+    </w:lvl>
+    <w:lvl w:ilvl="4">
+      <w:start w:val="1"/>
+      <w:numFmt w:val="bullet"/>
+      <w:lvlText w:val=""/>
+      <w:lvlJc w:val="left"/>
+      <w:pPr>
+        <w:tabs>
+          <w:tab w:val="num" w:pos="3600"/>
+        </w:tabs>
+        <w:ind w:left="3600" w:hanging="360"/>
+      </w:pPr>
+      <w:rPr>
+        <w:rFonts w:ascii="Wingdings" w:hAnsi="Wingdings" w:hint="default"/>
+        <w:sz w:val="20"/>
+      </w:rPr>
+    </w:lvl>
+    <w:lvl w:ilvl="5">
+      <w:start w:val="1"/>
+      <w:numFmt w:val="bullet"/>
+      <w:lvlText w:val=""/>
+      <w:lvlJc w:val="left"/>
+      <w:pPr>
+        <w:tabs>
+          <w:tab w:val="num" w:pos="4320"/>
+        </w:tabs>
+        <w:ind w:left="4320" w:hanging="360"/>
+      </w:pPr>
+      <w:rPr>
+        <w:rFonts w:ascii="Wingdings" w:hAnsi="Wingdings" w:hint="default"/>
+        <w:sz w:val="20"/>
+      </w:rPr>
+    </w:lvl>
+    <w:lvl w:ilvl="6">
+      <w:start w:val="1"/>
+      <w:numFmt w:val="bullet"/>
+      <w:lvlText w:val=""/>
+      <w:lvlJc w:val="left"/>
+      <w:pPr>
+        <w:tabs>
+          <w:tab w:val="num" w:pos="5040"/>
+        </w:tabs>
+        <w:ind w:left="5040" w:hanging="360"/>
+      </w:pPr>
+      <w:rPr>
+        <w:rFonts w:ascii="Wingdings" w:hAnsi="Wingdings" w:hint="default"/>
+        <w:sz w:val="20"/>
+      </w:rPr>
+    </w:lvl>
+    <w:lvl w:ilvl="7">
+      <w:start w:val="1"/>
+      <w:numFmt w:val="bullet"/>
+      <w:lvlText w:val=""/>
+      <w:lvlJc w:val="left"/>
+      <w:pPr>
+        <w:tabs>
+          <w:tab w:val="num" w:pos="5760"/>
+        </w:tabs>
+        <w:ind w:left="5760" w:hanging="360"/>
+      </w:pPr>
+      <w:rPr>
+        <w:rFonts w:ascii="Wingdings" w:hAnsi="Wingdings" w:hint="default"/>
+        <w:sz w:val="20"/>
+      </w:rPr>
+    </w:lvl>
+    <w:lvl w:ilvl="8">
+      <w:start w:val="1"/>
+      <w:numFmt w:val="bullet"/>
+      <w:lvlText w:val=""/>
+      <w:lvlJc w:val="left"/>
+      <w:pPr>
+        <w:tabs>
+          <w:tab w:val="num" w:pos="6480"/>
+        </w:tabs>
+        <w:ind w:left="6480" w:hanging="360"/>
+      </w:pPr>
+      <w:rPr>
+        <w:rFonts w:ascii="Wingdings" w:hAnsi="Wingdings" w:hint="default"/>
+        <w:sz w:val="20"/>
+      </w:rPr>
+    </w:lvl>
+  </w:abstractNum>
+  <w:abstractNum w:abstractNumId="5" w15:restartNumberingAfterBreak="0">
+    <w:nsid w:val="5B2A2830"/>
+    <w:multiLevelType w:val="multilevel"/>
+    <w:tmpl w:val="E8B4D4B6"/>
+    <w:lvl w:ilvl="0">
+      <w:start w:val="1"/>
+      <w:numFmt w:val="bullet"/>
+      <w:lvlText w:val=""/>
+      <w:lvlJc w:val="left"/>
+      <w:pPr>
+        <w:tabs>
+          <w:tab w:val="num" w:pos="720"/>
+        </w:tabs>
+        <w:ind w:left="720" w:hanging="360"/>
+      </w:pPr>
+      <w:rPr>
+        <w:rFonts w:ascii="Symbol" w:hAnsi="Symbol" w:hint="default"/>
+        <w:sz w:val="20"/>
+      </w:rPr>
+    </w:lvl>
+    <w:lvl w:ilvl="1">
+      <w:start w:val="1"/>
+      <w:numFmt w:val="bullet"/>
+      <w:lvlText w:val="o"/>
+      <w:lvlJc w:val="left"/>
+      <w:pPr>
+        <w:tabs>
+          <w:tab w:val="num" w:pos="1440"/>
+        </w:tabs>
+        <w:ind w:left="1440" w:hanging="360"/>
+      </w:pPr>
+      <w:rPr>
+        <w:rFonts w:ascii="Courier New" w:hAnsi="Courier New" w:cs="Times New Roman" w:hint="default"/>
+        <w:sz w:val="20"/>
+      </w:rPr>
+    </w:lvl>
+    <w:lvl w:ilvl="2">
+      <w:start w:val="1"/>
+      <w:numFmt w:val="bullet"/>
+      <w:lvlText w:val=""/>
+      <w:lvlJc w:val="left"/>
+      <w:pPr>
+        <w:tabs>
+          <w:tab w:val="num" w:pos="2160"/>
+        </w:tabs>
+        <w:ind w:left="2160" w:hanging="360"/>
+      </w:pPr>
+      <w:rPr>
+        <w:rFonts w:ascii="Wingdings" w:hAnsi="Wingdings" w:hint="default"/>
+        <w:sz w:val="20"/>
+      </w:rPr>
+    </w:lvl>
+    <w:lvl w:ilvl="3">
+      <w:start w:val="1"/>
+      <w:numFmt w:val="bullet"/>
+      <w:lvlText w:val=""/>
+      <w:lvlJc w:val="left"/>
+      <w:pPr>
+        <w:tabs>
+          <w:tab w:val="num" w:pos="2880"/>
+        </w:tabs>
+        <w:ind w:left="2880" w:hanging="360"/>
+      </w:pPr>
+      <w:rPr>
+        <w:rFonts w:ascii="Wingdings" w:hAnsi="Wingdings" w:hint="default"/>
+        <w:sz w:val="20"/>
+      </w:rPr>
+    </w:lvl>
+    <w:lvl w:ilvl="4">
+      <w:start w:val="1"/>
+      <w:numFmt w:val="bullet"/>
+      <w:lvlText w:val=""/>
+      <w:lvlJc w:val="left"/>
+      <w:pPr>
+        <w:tabs>
+          <w:tab w:val="num" w:pos="3600"/>
+        </w:tabs>
+        <w:ind w:left="3600" w:hanging="360"/>
+      </w:pPr>
+      <w:rPr>
+        <w:rFonts w:ascii="Wingdings" w:hAnsi="Wingdings" w:hint="default"/>
+        <w:sz w:val="20"/>
+      </w:rPr>
+    </w:lvl>
+    <w:lvl w:ilvl="5">
+      <w:start w:val="1"/>
+      <w:numFmt w:val="bullet"/>
+      <w:lvlText w:val=""/>
+      <w:lvlJc w:val="left"/>
+      <w:pPr>
+        <w:tabs>
+          <w:tab w:val="num" w:pos="4320"/>
+        </w:tabs>
+        <w:ind w:left="4320" w:hanging="360"/>
+      </w:pPr>
+      <w:rPr>
+        <w:rFonts w:ascii="Wingdings" w:hAnsi="Wingdings" w:hint="default"/>
+        <w:sz w:val="20"/>
+      </w:rPr>
+    </w:lvl>
+    <w:lvl w:ilvl="6">
+      <w:start w:val="1"/>
+      <w:numFmt w:val="bullet"/>
+      <w:lvlText w:val=""/>
+      <w:lvlJc w:val="left"/>
+      <w:pPr>
+        <w:tabs>
+          <w:tab w:val="num" w:pos="5040"/>
+        </w:tabs>
+        <w:ind w:left="5040" w:hanging="360"/>
+      </w:pPr>
+      <w:rPr>
+        <w:rFonts w:ascii="Wingdings" w:hAnsi="Wingdings" w:hint="default"/>
+        <w:sz w:val="20"/>
+      </w:rPr>
+    </w:lvl>
+    <w:lvl w:ilvl="7">
+      <w:start w:val="1"/>
+      <w:numFmt w:val="bullet"/>
+      <w:lvlText w:val=""/>
+      <w:lvlJc w:val="left"/>
+      <w:pPr>
+        <w:tabs>
+          <w:tab w:val="num" w:pos="5760"/>
+        </w:tabs>
+        <w:ind w:left="5760" w:hanging="360"/>
+      </w:pPr>
+      <w:rPr>
+        <w:rFonts w:ascii="Wingdings" w:hAnsi="Wingdings" w:hint="default"/>
+        <w:sz w:val="20"/>
+      </w:rPr>
+    </w:lvl>
+    <w:lvl w:ilvl="8">
+      <w:start w:val="1"/>
+      <w:numFmt w:val="bullet"/>
+      <w:lvlText w:val=""/>
+      <w:lvlJc w:val="left"/>
+      <w:pPr>
+        <w:tabs>
+          <w:tab w:val="num" w:pos="6480"/>
+        </w:tabs>
+        <w:ind w:left="6480" w:hanging="360"/>
+      </w:pPr>
+      <w:rPr>
+        <w:rFonts w:ascii="Wingdings" w:hAnsi="Wingdings" w:hint="default"/>
+        <w:sz w:val="20"/>
+      </w:rPr>
+    </w:lvl>
+  </w:abstractNum>
+  <w:abstractNum w:abstractNumId="6" w15:restartNumberingAfterBreak="0">
     <w:nsid w:val="64F60F15"/>
     <w:multiLevelType w:val="hybridMultilevel"/>
     <w:tmpl w:val="7D3AA924"/>
@@ -2606,7 +7192,52 @@
     </w:lvl>
   </w:abstractNum>
   <w:num w:numId="1" w16cid:durableId="1962108046">
+    <w:abstractNumId w:val="6"/>
+  </w:num>
+  <w:num w:numId="2" w16cid:durableId="1388919183">
     <w:abstractNumId w:val="0"/>
+    <w:lvlOverride w:ilvl="0">
+      <w:startOverride w:val="1"/>
+    </w:lvlOverride>
+    <w:lvlOverride w:ilvl="1">
+      <w:startOverride w:val="1"/>
+    </w:lvlOverride>
+    <w:lvlOverride w:ilvl="2">
+      <w:startOverride w:val="1"/>
+    </w:lvlOverride>
+    <w:lvlOverride w:ilvl="3">
+      <w:startOverride w:val="1"/>
+    </w:lvlOverride>
+    <w:lvlOverride w:ilvl="4">
+      <w:startOverride w:val="1"/>
+    </w:lvlOverride>
+    <w:lvlOverride w:ilvl="5">
+      <w:startOverride w:val="1"/>
+    </w:lvlOverride>
+    <w:lvlOverride w:ilvl="6">
+      <w:startOverride w:val="1"/>
+    </w:lvlOverride>
+    <w:lvlOverride w:ilvl="7">
+      <w:startOverride w:val="1"/>
+    </w:lvlOverride>
+    <w:lvlOverride w:ilvl="8">
+      <w:startOverride w:val="1"/>
+    </w:lvlOverride>
+  </w:num>
+  <w:num w:numId="3" w16cid:durableId="1619140078">
+    <w:abstractNumId w:val="3"/>
+  </w:num>
+  <w:num w:numId="4" w16cid:durableId="1257832922">
+    <w:abstractNumId w:val="5"/>
+  </w:num>
+  <w:num w:numId="5" w16cid:durableId="418330782">
+    <w:abstractNumId w:val="2"/>
+  </w:num>
+  <w:num w:numId="6" w16cid:durableId="2072851716">
+    <w:abstractNumId w:val="1"/>
+  </w:num>
+  <w:num w:numId="7" w16cid:durableId="17127451">
+    <w:abstractNumId w:val="4"/>
   </w:num>
 </w:numbering>
 </file>
@@ -3214,6 +7845,7 @@
   <w:style w:type="character" w:default="1" w:styleId="DefaultParagraphFont">
     <w:name w:val="Default Paragraph Font"/>
     <w:uiPriority w:val="1"/>
+    <w:semiHidden/>
     <w:unhideWhenUsed/>
   </w:style>
   <w:style w:type="table" w:default="1" w:styleId="TableNormal">

</xml_diff>